<commit_message>
docs: switch entry to Kategori Inovasi Teknologi; cover accents
Category is now Inovasi Teknologi throughout the report (1b.i and the
page header), on the cover and in the English NotebookLM source. The
1b.i statement notes the system is written in TypeScript/React with
a PostgreSQL database, which is what clause 5.9 of the KIJS 2026
guideline requires for the technology category.

Cover keeps the minimalist layout and adds three quiet accents: a
two-tone mint triangle in the bottom-right corner, one thin diagonal
line and a small dot grid in the bottom-left. It is now rendered in
a taller window and cropped, because the previous render left the
bottom ~90 px of the page blank.

Page count unchanged: main text 1-13, Rujukan and Akronim on 14.

Co-Authored-By: Claude Opus 5.5 <noreply@anthropic.com>
Claude-Session: https://claude.ai/code/session_01MAcNfHd5W4h5KoFbAUasoU
</commit_message>
<xml_diff>
--- a/Laporan_Projek_Inovasi_PharmaSync_8.docx
+++ b/Laporan_Projek_Inovasi_PharmaSync_8.docx
@@ -1131,7 +1131,7 @@
           <w:sz w:val="24"/>
           <w:szCs w:val="24"/>
         </w:rPr>
-        <w:t xml:space="preserve"> Inovasi Proses. PharmaSync ialah aplikasi web yang menghimpunkan aliran kerja farmasi klinik dalam satu sistem, dari permohonan ubat oleh pegawai perubatan, kelulusan pakar dan kawalan kuota, hingga pendispensan dan rekod. Inovasi ini mengubah cara permohonan ubat dikemukakan, diluluskan, disemak dan direkodkan di klinik.</w:t>
+        <w:t xml:space="preserve"> Inovasi Teknologi. PharmaSync ialah sistem aplikasi web yang menghimpunkan aliran kerja farmasi klinik dalam satu sistem, dari permohonan ubat oleh pegawai perubatan, kelulusan pakar dan kawalan kuota, hingga pendispensan dan rekod. Seluruh sistem dibangunkan sendiri oleh Kumpulan Inovasi menggunakan bahasa pengaturcaraan (TypeScript dengan React) dan pangkalan data PostgreSQL, selaras dengan syarat kategori teknologi dalam perkara 5.9 Garis Panduan KIJS 2026.</w:t>
       </w:r>
     </w:p>
     <w:p>
@@ -5420,7 +5420,7 @@
         <w:sz w:val="16"/>
         <w:szCs w:val="16"/>
       </w:rPr>
-      <w:t xml:space="preserve">Laporan Projek Inovasi PharmaSync  |  KIJS 2026  |  Kategori Inovasi Proses</w:t>
+      <w:t xml:space="preserve">Laporan Projek Inovasi PharmaSync  |  KIJS 2026  |  Kategori Inovasi Teknologi</w:t>
     </w:r>
   </w:p>
 </w:hdr>
@@ -5442,7 +5442,7 @@
         <w:sz w:val="16"/>
         <w:szCs w:val="16"/>
       </w:rPr>
-      <w:t xml:space="preserve">Laporan Projek Inovasi PharmaSync  |  KIJS 2026  |  Kategori Inovasi Proses</w:t>
+      <w:t xml:space="preserve">Laporan Projek Inovasi PharmaSync  |  KIJS 2026  |  Kategori Inovasi Teknologi</w:t>
     </w:r>
   </w:p>
 </w:hdr>

</xml_diff>

<commit_message>
docs: add group name Kempas Innovators
Adds the innovation group's name to the cover (above the unit, as in
the reference cover), to the team introduction and Jadual 1 caption
in report v8, and to the team section of the NotebookLM source.

Page count unchanged: main text 1-13, Rujukan and Akronim on 14.

Co-Authored-By: Claude Opus 5.5 <noreply@anthropic.com>
Claude-Session: https://claude.ai/code/session_01MAcNfHd5W4h5KoFbAUasoU
</commit_message>
<xml_diff>
--- a/Laporan_Projek_Inovasi_PharmaSync_8.docx
+++ b/Laporan_Projek_Inovasi_PharmaSync_8.docx
@@ -157,7 +157,7 @@
           <w:sz w:val="24"/>
           <w:szCs w:val="24"/>
         </w:rPr>
-        <w:t xml:space="preserve">Piagam pelanggan klinik menetapkan bahawa ubat dibekalkan kepada pesakit dengan tepat, cepat dan selamat. Kumpulan Inovasi mendapati kaedah rekod manual dan separuh manual sebelum ini tidak lagi dapat memenuhi piagam tersebut. Ahli Kumpulan Inovasi adalah seperti dalam Jadual 1.</w:t>
+        <w:t xml:space="preserve">Piagam pelanggan klinik menetapkan bahawa ubat dibekalkan kepada pesakit dengan tepat, cepat dan selamat. Kumpulan Inovasi mendapati kaedah rekod manual dan separuh manual sebelum ini tidak lagi dapat memenuhi piagam tersebut. Kumpulan Inovasi ini dinamakan Kempas Innovators, dan ahlinya adalah seperti dalam Jadual 1.</w:t>
       </w:r>
     </w:p>
     <w:p>
@@ -173,7 +173,7 @@
           <w:sz w:val="24"/>
           <w:szCs w:val="24"/>
         </w:rPr>
-        <w:t xml:space="preserve">Jadual 1: Ahli Kumpulan Inovasi</w:t>
+        <w:t xml:space="preserve">Jadual 1: Ahli Kumpulan Inovasi Kempas Innovators</w:t>
       </w:r>
     </w:p>
     <w:tbl>

</xml_diff>

<commit_message>
Compact two-column flowcharts in KIJS report (17 to 15 pages)
Rajah 1-4 redrawn as two-column flowcharts joined by connector A, so
each takes about half a page at full text width. Rajah 1-2 now follow
Jadual 3 so the four charts sit together on two pages. Body is 11
pages (KIJS minimum 10).

Co-Authored-By: Claude Opus 5.5 <noreply@anthropic.com>
Claude-Session: https://claude.ai/code/session_01MAcNfHd5W4h5KoFbAUasoU
</commit_message>
<xml_diff>
--- a/Laporan_Projek_Inovasi_PharmaSync_8.docx
+++ b/Laporan_Projek_Inovasi_PharmaSync_8.docx
@@ -2383,13 +2383,865 @@
     </w:p>
     <w:p>
       <w:pPr>
+        <w:pStyle w:val="Heading2"/>
+      </w:pPr>
+      <w:r>
+        <w:t xml:space="preserve">Keadaan Selepas Pelaksanaan Inovasi</w:t>
+      </w:r>
+    </w:p>
+    <w:p>
+      <w:pPr>
+        <w:spacing w:after="160" w:line="360"/>
+        <w:jc w:val="both"/>
+      </w:pPr>
+      <w:r>
+        <w:rPr>
+          <w:rFonts w:ascii="Arial" w:cs="Arial" w:eastAsia="Arial" w:hAnsi="Arial"/>
+          <w:sz w:val="24"/>
+          <w:szCs w:val="24"/>
+        </w:rPr>
+        <w:t xml:space="preserve">Selepas PharmaSync dilaksanakan, permohonan, kelulusan dan pendispensan direkodkan dalam satu sistem. Perbandingan kaedah sebelum dan selepas inovasi adalah seperti dalam Jadual 3.</w:t>
+      </w:r>
+    </w:p>
+    <w:p>
+      <w:pPr>
+        <w:keepNext/>
+        <w:spacing w:after="100" w:before="120"/>
+      </w:pPr>
+      <w:r>
+        <w:rPr>
+          <w:rFonts w:ascii="Arial" w:cs="Arial" w:eastAsia="Arial" w:hAnsi="Arial"/>
+          <w:b/>
+          <w:bCs/>
+          <w:sz w:val="24"/>
+          <w:szCs w:val="24"/>
+        </w:rPr>
+        <w:t xml:space="preserve">Jadual 3: Perbandingan kaedah sebelum dan selepas inovasi</w:t>
+      </w:r>
+    </w:p>
+    <w:tbl>
+      <w:tblPr>
+        <w:tblW w:type="dxa" w:w="9026"/>
+        <w:tblBorders>
+          <w:top w:val="single" w:color="auto" w:sz="4"/>
+          <w:left w:val="single" w:color="auto" w:sz="4"/>
+          <w:bottom w:val="single" w:color="auto" w:sz="4"/>
+          <w:right w:val="single" w:color="auto" w:sz="4"/>
+          <w:insideH w:val="single" w:color="auto" w:sz="4"/>
+          <w:insideV w:val="single" w:color="auto" w:sz="4"/>
+        </w:tblBorders>
+      </w:tblPr>
+      <w:tblGrid>
+        <w:gridCol w:w="2300"/>
+        <w:gridCol w:w="3363"/>
+        <w:gridCol w:w="3363"/>
+      </w:tblGrid>
+      <w:tr>
+        <w:trPr>
+          <w:cantSplit/>
+          <w:tblHeader/>
+        </w:trPr>
+        <w:tc>
+          <w:tcPr>
+            <w:tcW w:type="dxa" w:w="2300"/>
+            <w:tcBorders>
+              <w:top w:val="single" w:color="B7C4BF" w:sz="4"/>
+              <w:left w:val="single" w:color="B7C4BF" w:sz="4"/>
+              <w:bottom w:val="single" w:color="B7C4BF" w:sz="4"/>
+              <w:right w:val="single" w:color="B7C4BF" w:sz="4"/>
+            </w:tcBorders>
+            <w:shd w:fill="E3EFEA" w:color="auto" w:val="clear"/>
+            <w:tcMar>
+              <w:top w:type="dxa" w:w="60"/>
+              <w:left w:type="dxa" w:w="100"/>
+              <w:bottom w:type="dxa" w:w="60"/>
+              <w:right w:type="dxa" w:w="100"/>
+            </w:tcMar>
+          </w:tcPr>
+          <w:p>
+            <w:pPr>
+              <w:spacing w:after="0" w:line="276"/>
+            </w:pPr>
+            <w:r>
+              <w:rPr>
+                <w:rFonts w:ascii="Arial" w:cs="Arial" w:eastAsia="Arial" w:hAnsi="Arial"/>
+                <w:b/>
+                <w:bCs/>
+                <w:sz w:val="24"/>
+                <w:szCs w:val="24"/>
+              </w:rPr>
+              <w:t xml:space="preserve">Aspek</w:t>
+            </w:r>
+          </w:p>
+        </w:tc>
+        <w:tc>
+          <w:tcPr>
+            <w:tcW w:type="dxa" w:w="3363"/>
+            <w:tcBorders>
+              <w:top w:val="single" w:color="B7C4BF" w:sz="4"/>
+              <w:left w:val="single" w:color="B7C4BF" w:sz="4"/>
+              <w:bottom w:val="single" w:color="B7C4BF" w:sz="4"/>
+              <w:right w:val="single" w:color="B7C4BF" w:sz="4"/>
+            </w:tcBorders>
+            <w:shd w:fill="E3EFEA" w:color="auto" w:val="clear"/>
+            <w:tcMar>
+              <w:top w:type="dxa" w:w="60"/>
+              <w:left w:type="dxa" w:w="100"/>
+              <w:bottom w:type="dxa" w:w="60"/>
+              <w:right w:type="dxa" w:w="100"/>
+            </w:tcMar>
+          </w:tcPr>
+          <w:p>
+            <w:pPr>
+              <w:spacing w:after="0" w:line="276"/>
+            </w:pPr>
+            <w:r>
+              <w:rPr>
+                <w:rFonts w:ascii="Arial" w:cs="Arial" w:eastAsia="Arial" w:hAnsi="Arial"/>
+                <w:b/>
+                <w:bCs/>
+                <w:sz w:val="24"/>
+                <w:szCs w:val="24"/>
+              </w:rPr>
+              <w:t xml:space="preserve">Sebelum</w:t>
+            </w:r>
+          </w:p>
+        </w:tc>
+        <w:tc>
+          <w:tcPr>
+            <w:tcW w:type="dxa" w:w="3363"/>
+            <w:tcBorders>
+              <w:top w:val="single" w:color="B7C4BF" w:sz="4"/>
+              <w:left w:val="single" w:color="B7C4BF" w:sz="4"/>
+              <w:bottom w:val="single" w:color="B7C4BF" w:sz="4"/>
+              <w:right w:val="single" w:color="B7C4BF" w:sz="4"/>
+            </w:tcBorders>
+            <w:shd w:fill="E3EFEA" w:color="auto" w:val="clear"/>
+            <w:tcMar>
+              <w:top w:type="dxa" w:w="60"/>
+              <w:left w:type="dxa" w:w="100"/>
+              <w:bottom w:type="dxa" w:w="60"/>
+              <w:right w:type="dxa" w:w="100"/>
+            </w:tcMar>
+          </w:tcPr>
+          <w:p>
+            <w:pPr>
+              <w:spacing w:after="0" w:line="276"/>
+            </w:pPr>
+            <w:r>
+              <w:rPr>
+                <w:rFonts w:ascii="Arial" w:cs="Arial" w:eastAsia="Arial" w:hAnsi="Arial"/>
+                <w:b/>
+                <w:bCs/>
+                <w:sz w:val="24"/>
+                <w:szCs w:val="24"/>
+              </w:rPr>
+              <w:t xml:space="preserve">Selepas</w:t>
+            </w:r>
+          </w:p>
+        </w:tc>
+      </w:tr>
+      <w:tr>
+        <w:trPr>
+          <w:cantSplit/>
+          <w:tblHeader w:val="off"/>
+        </w:trPr>
+        <w:tc>
+          <w:tcPr>
+            <w:tcW w:type="dxa" w:w="2300"/>
+            <w:tcBorders>
+              <w:top w:val="single" w:color="B7C4BF" w:sz="4"/>
+              <w:left w:val="single" w:color="B7C4BF" w:sz="4"/>
+              <w:bottom w:val="single" w:color="B7C4BF" w:sz="4"/>
+              <w:right w:val="single" w:color="B7C4BF" w:sz="4"/>
+            </w:tcBorders>
+            <w:tcMar>
+              <w:top w:type="dxa" w:w="60"/>
+              <w:left w:type="dxa" w:w="100"/>
+              <w:bottom w:type="dxa" w:w="60"/>
+              <w:right w:type="dxa" w:w="100"/>
+            </w:tcMar>
+          </w:tcPr>
+          <w:p>
+            <w:pPr>
+              <w:spacing w:after="0" w:line="276"/>
+            </w:pPr>
+            <w:r>
+              <w:rPr>
+                <w:rFonts w:ascii="Arial" w:cs="Arial" w:eastAsia="Arial" w:hAnsi="Arial"/>
+                <w:sz w:val="24"/>
+                <w:szCs w:val="24"/>
+              </w:rPr>
+              <w:t xml:space="preserve">Kelulusan UKK oleh FMS</w:t>
+            </w:r>
+          </w:p>
+        </w:tc>
+        <w:tc>
+          <w:tcPr>
+            <w:tcW w:type="dxa" w:w="3363"/>
+            <w:tcBorders>
+              <w:top w:val="single" w:color="B7C4BF" w:sz="4"/>
+              <w:left w:val="single" w:color="B7C4BF" w:sz="4"/>
+              <w:bottom w:val="single" w:color="B7C4BF" w:sz="4"/>
+              <w:right w:val="single" w:color="B7C4BF" w:sz="4"/>
+            </w:tcBorders>
+            <w:tcMar>
+              <w:top w:type="dxa" w:w="60"/>
+              <w:left w:type="dxa" w:w="100"/>
+              <w:bottom w:type="dxa" w:w="60"/>
+              <w:right w:type="dxa" w:w="100"/>
+            </w:tcMar>
+          </w:tcPr>
+          <w:p>
+            <w:pPr>
+              <w:spacing w:after="0" w:line="276"/>
+            </w:pPr>
+            <w:r>
+              <w:rPr>
+                <w:rFonts w:ascii="Arial" w:cs="Arial" w:eastAsia="Arial" w:hAnsi="Arial"/>
+                <w:sz w:val="24"/>
+                <w:szCs w:val="24"/>
+              </w:rPr>
+              <w:t xml:space="preserve">Melalui telefon, dengan bukti tangkap layar WhatsApp</w:t>
+            </w:r>
+          </w:p>
+        </w:tc>
+        <w:tc>
+          <w:tcPr>
+            <w:tcW w:type="dxa" w:w="3363"/>
+            <w:tcBorders>
+              <w:top w:val="single" w:color="B7C4BF" w:sz="4"/>
+              <w:left w:val="single" w:color="B7C4BF" w:sz="4"/>
+              <w:bottom w:val="single" w:color="B7C4BF" w:sz="4"/>
+              <w:right w:val="single" w:color="B7C4BF" w:sz="4"/>
+            </w:tcBorders>
+            <w:tcMar>
+              <w:top w:type="dxa" w:w="60"/>
+              <w:left w:type="dxa" w:w="100"/>
+              <w:bottom w:type="dxa" w:w="60"/>
+              <w:right w:type="dxa" w:w="100"/>
+            </w:tcMar>
+          </w:tcPr>
+          <w:p>
+            <w:pPr>
+              <w:spacing w:after="0" w:line="276"/>
+            </w:pPr>
+            <w:r>
+              <w:rPr>
+                <w:rFonts w:ascii="Arial" w:cs="Arial" w:eastAsia="Arial" w:hAnsi="Arial"/>
+                <w:sz w:val="24"/>
+                <w:szCs w:val="24"/>
+              </w:rPr>
+              <w:t xml:space="preserve">Direkodkan dalam sistem bersama nama FMS dan cap masa</w:t>
+            </w:r>
+          </w:p>
+        </w:tc>
+      </w:tr>
+      <w:tr>
+        <w:trPr>
+          <w:cantSplit/>
+          <w:tblHeader w:val="off"/>
+        </w:trPr>
+        <w:tc>
+          <w:tcPr>
+            <w:tcW w:type="dxa" w:w="2300"/>
+            <w:tcBorders>
+              <w:top w:val="single" w:color="B7C4BF" w:sz="4"/>
+              <w:left w:val="single" w:color="B7C4BF" w:sz="4"/>
+              <w:bottom w:val="single" w:color="B7C4BF" w:sz="4"/>
+              <w:right w:val="single" w:color="B7C4BF" w:sz="4"/>
+            </w:tcBorders>
+            <w:tcMar>
+              <w:top w:type="dxa" w:w="60"/>
+              <w:left w:type="dxa" w:w="100"/>
+              <w:bottom w:type="dxa" w:w="60"/>
+              <w:right w:type="dxa" w:w="100"/>
+            </w:tcMar>
+          </w:tcPr>
+          <w:p>
+            <w:pPr>
+              <w:spacing w:after="0" w:line="276"/>
+            </w:pPr>
+            <w:r>
+              <w:rPr>
+                <w:rFonts w:ascii="Arial" w:cs="Arial" w:eastAsia="Arial" w:hAnsi="Arial"/>
+                <w:sz w:val="24"/>
+                <w:szCs w:val="24"/>
+              </w:rPr>
+              <w:t xml:space="preserve">Baki kuota UKK</w:t>
+            </w:r>
+          </w:p>
+        </w:tc>
+        <w:tc>
+          <w:tcPr>
+            <w:tcW w:type="dxa" w:w="3363"/>
+            <w:tcBorders>
+              <w:top w:val="single" w:color="B7C4BF" w:sz="4"/>
+              <w:left w:val="single" w:color="B7C4BF" w:sz="4"/>
+              <w:bottom w:val="single" w:color="B7C4BF" w:sz="4"/>
+              <w:right w:val="single" w:color="B7C4BF" w:sz="4"/>
+            </w:tcBorders>
+            <w:tcMar>
+              <w:top w:type="dxa" w:w="60"/>
+              <w:left w:type="dxa" w:w="100"/>
+              <w:bottom w:type="dxa" w:w="60"/>
+              <w:right w:type="dxa" w:w="100"/>
+            </w:tcMar>
+          </w:tcPr>
+          <w:p>
+            <w:pPr>
+              <w:spacing w:after="0" w:line="276"/>
+            </w:pPr>
+            <w:r>
+              <w:rPr>
+                <w:rFonts w:ascii="Arial" w:cs="Arial" w:eastAsia="Arial" w:hAnsi="Arial"/>
+                <w:sz w:val="24"/>
+                <w:szCs w:val="24"/>
+              </w:rPr>
+              <w:t xml:space="preserve">Dikira dengan tangan dalam Excel</w:t>
+            </w:r>
+          </w:p>
+        </w:tc>
+        <w:tc>
+          <w:tcPr>
+            <w:tcW w:type="dxa" w:w="3363"/>
+            <w:tcBorders>
+              <w:top w:val="single" w:color="B7C4BF" w:sz="4"/>
+              <w:left w:val="single" w:color="B7C4BF" w:sz="4"/>
+              <w:bottom w:val="single" w:color="B7C4BF" w:sz="4"/>
+              <w:right w:val="single" w:color="B7C4BF" w:sz="4"/>
+            </w:tcBorders>
+            <w:tcMar>
+              <w:top w:type="dxa" w:w="60"/>
+              <w:left w:type="dxa" w:w="100"/>
+              <w:bottom w:type="dxa" w:w="60"/>
+              <w:right w:type="dxa" w:w="100"/>
+            </w:tcMar>
+          </w:tcPr>
+          <w:p>
+            <w:pPr>
+              <w:spacing w:after="0" w:line="276"/>
+            </w:pPr>
+            <w:r>
+              <w:rPr>
+                <w:rFonts w:ascii="Arial" w:cs="Arial" w:eastAsia="Arial" w:hAnsi="Arial"/>
+                <w:sz w:val="24"/>
+                <w:szCs w:val="24"/>
+              </w:rPr>
+              <w:t xml:space="preserve">Dikira oleh sistem dan dipaparkan kepada pegawai perubatan dan FMS</w:t>
+            </w:r>
+          </w:p>
+        </w:tc>
+      </w:tr>
+      <w:tr>
+        <w:trPr>
+          <w:cantSplit/>
+          <w:tblHeader w:val="off"/>
+        </w:trPr>
+        <w:tc>
+          <w:tcPr>
+            <w:tcW w:type="dxa" w:w="2300"/>
+            <w:tcBorders>
+              <w:top w:val="single" w:color="B7C4BF" w:sz="4"/>
+              <w:left w:val="single" w:color="B7C4BF" w:sz="4"/>
+              <w:bottom w:val="single" w:color="B7C4BF" w:sz="4"/>
+              <w:right w:val="single" w:color="B7C4BF" w:sz="4"/>
+            </w:tcBorders>
+            <w:tcMar>
+              <w:top w:type="dxa" w:w="60"/>
+              <w:left w:type="dxa" w:w="100"/>
+              <w:bottom w:type="dxa" w:w="60"/>
+              <w:right w:type="dxa" w:w="100"/>
+            </w:tcMar>
+          </w:tcPr>
+          <w:p>
+            <w:pPr>
+              <w:spacing w:after="0" w:line="276"/>
+            </w:pPr>
+            <w:r>
+              <w:rPr>
+                <w:rFonts w:ascii="Arial" w:cs="Arial" w:eastAsia="Arial" w:hAnsi="Arial"/>
+                <w:sz w:val="24"/>
+                <w:szCs w:val="24"/>
+              </w:rPr>
+              <w:t xml:space="preserve">Pengesahan di kaunter</w:t>
+            </w:r>
+          </w:p>
+        </w:tc>
+        <w:tc>
+          <w:tcPr>
+            <w:tcW w:type="dxa" w:w="3363"/>
+            <w:tcBorders>
+              <w:top w:val="single" w:color="B7C4BF" w:sz="4"/>
+              <w:left w:val="single" w:color="B7C4BF" w:sz="4"/>
+              <w:bottom w:val="single" w:color="B7C4BF" w:sz="4"/>
+              <w:right w:val="single" w:color="B7C4BF" w:sz="4"/>
+            </w:tcBorders>
+            <w:tcMar>
+              <w:top w:type="dxa" w:w="60"/>
+              <w:left w:type="dxa" w:w="100"/>
+              <w:bottom w:type="dxa" w:w="60"/>
+              <w:right w:type="dxa" w:w="100"/>
+            </w:tcMar>
+          </w:tcPr>
+          <w:p>
+            <w:pPr>
+              <w:spacing w:after="0" w:line="276"/>
+            </w:pPr>
+            <w:r>
+              <w:rPr>
+                <w:rFonts w:ascii="Arial" w:cs="Arial" w:eastAsia="Arial" w:hAnsi="Arial"/>
+                <w:sz w:val="24"/>
+                <w:szCs w:val="24"/>
+              </w:rPr>
+              <w:t xml:space="preserve">Mencari tangkap layar atau menelefon pegawai perubatan</w:t>
+            </w:r>
+          </w:p>
+        </w:tc>
+        <w:tc>
+          <w:tcPr>
+            <w:tcW w:type="dxa" w:w="3363"/>
+            <w:tcBorders>
+              <w:top w:val="single" w:color="B7C4BF" w:sz="4"/>
+              <w:left w:val="single" w:color="B7C4BF" w:sz="4"/>
+              <w:bottom w:val="single" w:color="B7C4BF" w:sz="4"/>
+              <w:right w:val="single" w:color="B7C4BF" w:sz="4"/>
+            </w:tcBorders>
+            <w:tcMar>
+              <w:top w:type="dxa" w:w="60"/>
+              <w:left w:type="dxa" w:w="100"/>
+              <w:bottom w:type="dxa" w:w="60"/>
+              <w:right w:type="dxa" w:w="100"/>
+            </w:tcMar>
+          </w:tcPr>
+          <w:p>
+            <w:pPr>
+              <w:spacing w:after="0" w:line="276"/>
+            </w:pPr>
+            <w:r>
+              <w:rPr>
+                <w:rFonts w:ascii="Arial" w:cs="Arial" w:eastAsia="Arial" w:hAnsi="Arial"/>
+                <w:sz w:val="24"/>
+                <w:szCs w:val="24"/>
+              </w:rPr>
+              <w:t xml:space="preserve">Kelulusan dilihat terus dalam sistem</w:t>
+            </w:r>
+          </w:p>
+        </w:tc>
+      </w:tr>
+      <w:tr>
+        <w:trPr>
+          <w:cantSplit/>
+          <w:tblHeader w:val="off"/>
+        </w:trPr>
+        <w:tc>
+          <w:tcPr>
+            <w:tcW w:type="dxa" w:w="2300"/>
+            <w:tcBorders>
+              <w:top w:val="single" w:color="B7C4BF" w:sz="4"/>
+              <w:left w:val="single" w:color="B7C4BF" w:sz="4"/>
+              <w:bottom w:val="single" w:color="B7C4BF" w:sz="4"/>
+              <w:right w:val="single" w:color="B7C4BF" w:sz="4"/>
+            </w:tcBorders>
+            <w:tcMar>
+              <w:top w:type="dxa" w:w="60"/>
+              <w:left w:type="dxa" w:w="100"/>
+              <w:bottom w:type="dxa" w:w="60"/>
+              <w:right w:type="dxa" w:w="100"/>
+            </w:tcMar>
+          </w:tcPr>
+          <w:p>
+            <w:pPr>
+              <w:spacing w:after="0" w:line="276"/>
+            </w:pPr>
+            <w:r>
+              <w:rPr>
+                <w:rFonts w:ascii="Arial" w:cs="Arial" w:eastAsia="Arial" w:hAnsi="Arial"/>
+                <w:sz w:val="24"/>
+                <w:szCs w:val="24"/>
+              </w:rPr>
+              <w:t xml:space="preserve">Borang antibiotik</w:t>
+            </w:r>
+          </w:p>
+        </w:tc>
+        <w:tc>
+          <w:tcPr>
+            <w:tcW w:type="dxa" w:w="3363"/>
+            <w:tcBorders>
+              <w:top w:val="single" w:color="B7C4BF" w:sz="4"/>
+              <w:left w:val="single" w:color="B7C4BF" w:sz="4"/>
+              <w:bottom w:val="single" w:color="B7C4BF" w:sz="4"/>
+              <w:right w:val="single" w:color="B7C4BF" w:sz="4"/>
+            </w:tcBorders>
+            <w:tcMar>
+              <w:top w:type="dxa" w:w="60"/>
+              <w:left w:type="dxa" w:w="100"/>
+              <w:bottom w:type="dxa" w:w="60"/>
+              <w:right w:type="dxa" w:w="100"/>
+            </w:tcMar>
+          </w:tcPr>
+          <w:p>
+            <w:pPr>
+              <w:spacing w:after="0" w:line="276"/>
+            </w:pPr>
+            <w:r>
+              <w:rPr>
+                <w:rFonts w:ascii="Arial" w:cs="Arial" w:eastAsia="Arial" w:hAnsi="Arial"/>
+                <w:sz w:val="24"/>
+                <w:szCs w:val="24"/>
+              </w:rPr>
+              <w:t xml:space="preserve">Borang AMS fizikal; purata 10 tidak lengkap sebulan</w:t>
+            </w:r>
+          </w:p>
+        </w:tc>
+        <w:tc>
+          <w:tcPr>
+            <w:tcW w:type="dxa" w:w="3363"/>
+            <w:tcBorders>
+              <w:top w:val="single" w:color="B7C4BF" w:sz="4"/>
+              <w:left w:val="single" w:color="B7C4BF" w:sz="4"/>
+              <w:bottom w:val="single" w:color="B7C4BF" w:sz="4"/>
+              <w:right w:val="single" w:color="B7C4BF" w:sz="4"/>
+            </w:tcBorders>
+            <w:tcMar>
+              <w:top w:type="dxa" w:w="60"/>
+              <w:left w:type="dxa" w:w="100"/>
+              <w:bottom w:type="dxa" w:w="60"/>
+              <w:right w:type="dxa" w:w="100"/>
+            </w:tcMar>
+          </w:tcPr>
+          <w:p>
+            <w:pPr>
+              <w:spacing w:after="0" w:line="276"/>
+            </w:pPr>
+            <w:r>
+              <w:rPr>
+                <w:rFonts w:ascii="Arial" w:cs="Arial" w:eastAsia="Arial" w:hAnsi="Arial"/>
+                <w:sz w:val="24"/>
+                <w:szCs w:val="24"/>
+              </w:rPr>
+              <w:t xml:space="preserve">Borang digital dengan medan wajib; sifar borang tidak lengkap</w:t>
+            </w:r>
+          </w:p>
+        </w:tc>
+      </w:tr>
+      <w:tr>
+        <w:trPr>
+          <w:cantSplit/>
+          <w:tblHeader w:val="off"/>
+        </w:trPr>
+        <w:tc>
+          <w:tcPr>
+            <w:tcW w:type="dxa" w:w="2300"/>
+            <w:tcBorders>
+              <w:top w:val="single" w:color="B7C4BF" w:sz="4"/>
+              <w:left w:val="single" w:color="B7C4BF" w:sz="4"/>
+              <w:bottom w:val="single" w:color="B7C4BF" w:sz="4"/>
+              <w:right w:val="single" w:color="B7C4BF" w:sz="4"/>
+            </w:tcBorders>
+            <w:tcMar>
+              <w:top w:type="dxa" w:w="60"/>
+              <w:left w:type="dxa" w:w="100"/>
+              <w:bottom w:type="dxa" w:w="60"/>
+              <w:right w:type="dxa" w:w="100"/>
+            </w:tcMar>
+          </w:tcPr>
+          <w:p>
+            <w:pPr>
+              <w:spacing w:after="0" w:line="276"/>
+            </w:pPr>
+            <w:r>
+              <w:rPr>
+                <w:rFonts w:ascii="Arial" w:cs="Arial" w:eastAsia="Arial" w:hAnsi="Arial"/>
+                <w:sz w:val="24"/>
+                <w:szCs w:val="24"/>
+              </w:rPr>
+              <w:t xml:space="preserve">Semakan NAG 2024</w:t>
+            </w:r>
+          </w:p>
+        </w:tc>
+        <w:tc>
+          <w:tcPr>
+            <w:tcW w:type="dxa" w:w="3363"/>
+            <w:tcBorders>
+              <w:top w:val="single" w:color="B7C4BF" w:sz="4"/>
+              <w:left w:val="single" w:color="B7C4BF" w:sz="4"/>
+              <w:bottom w:val="single" w:color="B7C4BF" w:sz="4"/>
+              <w:right w:val="single" w:color="B7C4BF" w:sz="4"/>
+            </w:tcBorders>
+            <w:tcMar>
+              <w:top w:type="dxa" w:w="60"/>
+              <w:left w:type="dxa" w:w="100"/>
+              <w:bottom w:type="dxa" w:w="60"/>
+              <w:right w:type="dxa" w:w="100"/>
+            </w:tcMar>
+          </w:tcPr>
+          <w:p>
+            <w:pPr>
+              <w:spacing w:after="0" w:line="276"/>
+            </w:pPr>
+            <w:r>
+              <w:rPr>
+                <w:rFonts w:ascii="Arial" w:cs="Arial" w:eastAsia="Arial" w:hAnsi="Arial"/>
+                <w:sz w:val="24"/>
+                <w:szCs w:val="24"/>
+              </w:rPr>
+              <w:t xml:space="preserve">Tiada rekod berpusat</w:t>
+            </w:r>
+          </w:p>
+        </w:tc>
+        <w:tc>
+          <w:tcPr>
+            <w:tcW w:type="dxa" w:w="3363"/>
+            <w:tcBorders>
+              <w:top w:val="single" w:color="B7C4BF" w:sz="4"/>
+              <w:left w:val="single" w:color="B7C4BF" w:sz="4"/>
+              <w:bottom w:val="single" w:color="B7C4BF" w:sz="4"/>
+              <w:right w:val="single" w:color="B7C4BF" w:sz="4"/>
+            </w:tcBorders>
+            <w:tcMar>
+              <w:top w:type="dxa" w:w="60"/>
+              <w:left w:type="dxa" w:w="100"/>
+              <w:bottom w:type="dxa" w:w="60"/>
+              <w:right w:type="dxa" w:w="100"/>
+            </w:tcMar>
+          </w:tcPr>
+          <w:p>
+            <w:pPr>
+              <w:spacing w:after="0" w:line="276"/>
+            </w:pPr>
+            <w:r>
+              <w:rPr>
+                <w:rFonts w:ascii="Arial" w:cs="Arial" w:eastAsia="Arial" w:hAnsi="Arial"/>
+                <w:sz w:val="24"/>
+                <w:szCs w:val="24"/>
+              </w:rPr>
+              <w:t xml:space="preserve">Dibuat semasa preskripsi ditulis</w:t>
+            </w:r>
+          </w:p>
+        </w:tc>
+      </w:tr>
+      <w:tr>
+        <w:trPr>
+          <w:cantSplit/>
+          <w:tblHeader w:val="off"/>
+        </w:trPr>
+        <w:tc>
+          <w:tcPr>
+            <w:tcW w:type="dxa" w:w="2300"/>
+            <w:tcBorders>
+              <w:top w:val="single" w:color="B7C4BF" w:sz="4"/>
+              <w:left w:val="single" w:color="B7C4BF" w:sz="4"/>
+              <w:bottom w:val="single" w:color="B7C4BF" w:sz="4"/>
+              <w:right w:val="single" w:color="B7C4BF" w:sz="4"/>
+            </w:tcBorders>
+            <w:tcMar>
+              <w:top w:type="dxa" w:w="60"/>
+              <w:left w:type="dxa" w:w="100"/>
+              <w:bottom w:type="dxa" w:w="60"/>
+              <w:right w:type="dxa" w:w="100"/>
+            </w:tcMar>
+          </w:tcPr>
+          <w:p>
+            <w:pPr>
+              <w:spacing w:after="0" w:line="276"/>
+            </w:pPr>
+            <w:r>
+              <w:rPr>
+                <w:rFonts w:ascii="Arial" w:cs="Arial" w:eastAsia="Arial" w:hAnsi="Arial"/>
+                <w:sz w:val="24"/>
+                <w:szCs w:val="24"/>
+              </w:rPr>
+              <w:t xml:space="preserve">Aliran kerja UKK</w:t>
+            </w:r>
+          </w:p>
+        </w:tc>
+        <w:tc>
+          <w:tcPr>
+            <w:tcW w:type="dxa" w:w="3363"/>
+            <w:tcBorders>
+              <w:top w:val="single" w:color="B7C4BF" w:sz="4"/>
+              <w:left w:val="single" w:color="B7C4BF" w:sz="4"/>
+              <w:bottom w:val="single" w:color="B7C4BF" w:sz="4"/>
+              <w:right w:val="single" w:color="B7C4BF" w:sz="4"/>
+            </w:tcBorders>
+            <w:tcMar>
+              <w:top w:type="dxa" w:w="60"/>
+              <w:left w:type="dxa" w:w="100"/>
+              <w:bottom w:type="dxa" w:w="60"/>
+              <w:right w:type="dxa" w:w="100"/>
+            </w:tcMar>
+          </w:tcPr>
+          <w:p>
+            <w:pPr>
+              <w:spacing w:after="0" w:line="276"/>
+            </w:pPr>
+            <w:r>
+              <w:rPr>
+                <w:rFonts w:ascii="Arial" w:cs="Arial" w:eastAsia="Arial" w:hAnsi="Arial"/>
+                <w:sz w:val="24"/>
+                <w:szCs w:val="24"/>
+              </w:rPr>
+              <w:t xml:space="preserve">12 langkah, 1 kitaran kerja semula</w:t>
+            </w:r>
+          </w:p>
+        </w:tc>
+        <w:tc>
+          <w:tcPr>
+            <w:tcW w:type="dxa" w:w="3363"/>
+            <w:tcBorders>
+              <w:top w:val="single" w:color="B7C4BF" w:sz="4"/>
+              <w:left w:val="single" w:color="B7C4BF" w:sz="4"/>
+              <w:bottom w:val="single" w:color="B7C4BF" w:sz="4"/>
+              <w:right w:val="single" w:color="B7C4BF" w:sz="4"/>
+            </w:tcBorders>
+            <w:tcMar>
+              <w:top w:type="dxa" w:w="60"/>
+              <w:left w:type="dxa" w:w="100"/>
+              <w:bottom w:type="dxa" w:w="60"/>
+              <w:right w:type="dxa" w:w="100"/>
+            </w:tcMar>
+          </w:tcPr>
+          <w:p>
+            <w:pPr>
+              <w:spacing w:after="0" w:line="276"/>
+            </w:pPr>
+            <w:r>
+              <w:rPr>
+                <w:rFonts w:ascii="Arial" w:cs="Arial" w:eastAsia="Arial" w:hAnsi="Arial"/>
+                <w:sz w:val="24"/>
+                <w:szCs w:val="24"/>
+              </w:rPr>
+              <w:t xml:space="preserve">10 langkah, tiada kitaran kerja semula</w:t>
+            </w:r>
+          </w:p>
+        </w:tc>
+      </w:tr>
+      <w:tr>
+        <w:trPr>
+          <w:cantSplit/>
+          <w:tblHeader w:val="off"/>
+        </w:trPr>
+        <w:tc>
+          <w:tcPr>
+            <w:tcW w:type="dxa" w:w="2300"/>
+            <w:tcBorders>
+              <w:top w:val="single" w:color="B7C4BF" w:sz="4"/>
+              <w:left w:val="single" w:color="B7C4BF" w:sz="4"/>
+              <w:bottom w:val="single" w:color="B7C4BF" w:sz="4"/>
+              <w:right w:val="single" w:color="B7C4BF" w:sz="4"/>
+            </w:tcBorders>
+            <w:tcMar>
+              <w:top w:type="dxa" w:w="60"/>
+              <w:left w:type="dxa" w:w="100"/>
+              <w:bottom w:type="dxa" w:w="60"/>
+              <w:right w:type="dxa" w:w="100"/>
+            </w:tcMar>
+          </w:tcPr>
+          <w:p>
+            <w:pPr>
+              <w:spacing w:after="0" w:line="276"/>
+            </w:pPr>
+            <w:r>
+              <w:rPr>
+                <w:rFonts w:ascii="Arial" w:cs="Arial" w:eastAsia="Arial" w:hAnsi="Arial"/>
+                <w:sz w:val="24"/>
+                <w:szCs w:val="24"/>
+              </w:rPr>
+              <w:t xml:space="preserve">Aliran kerja antibiotik</w:t>
+            </w:r>
+          </w:p>
+        </w:tc>
+        <w:tc>
+          <w:tcPr>
+            <w:tcW w:type="dxa" w:w="3363"/>
+            <w:tcBorders>
+              <w:top w:val="single" w:color="B7C4BF" w:sz="4"/>
+              <w:left w:val="single" w:color="B7C4BF" w:sz="4"/>
+              <w:bottom w:val="single" w:color="B7C4BF" w:sz="4"/>
+              <w:right w:val="single" w:color="B7C4BF" w:sz="4"/>
+            </w:tcBorders>
+            <w:tcMar>
+              <w:top w:type="dxa" w:w="60"/>
+              <w:left w:type="dxa" w:w="100"/>
+              <w:bottom w:type="dxa" w:w="60"/>
+              <w:right w:type="dxa" w:w="100"/>
+            </w:tcMar>
+          </w:tcPr>
+          <w:p>
+            <w:pPr>
+              <w:spacing w:after="0" w:line="276"/>
+            </w:pPr>
+            <w:r>
+              <w:rPr>
+                <w:rFonts w:ascii="Arial" w:cs="Arial" w:eastAsia="Arial" w:hAnsi="Arial"/>
+                <w:sz w:val="24"/>
+                <w:szCs w:val="24"/>
+              </w:rPr>
+              <w:t xml:space="preserve">10 langkah, 2 kitaran kerja semula</w:t>
+            </w:r>
+          </w:p>
+        </w:tc>
+        <w:tc>
+          <w:tcPr>
+            <w:tcW w:type="dxa" w:w="3363"/>
+            <w:tcBorders>
+              <w:top w:val="single" w:color="B7C4BF" w:sz="4"/>
+              <w:left w:val="single" w:color="B7C4BF" w:sz="4"/>
+              <w:bottom w:val="single" w:color="B7C4BF" w:sz="4"/>
+              <w:right w:val="single" w:color="B7C4BF" w:sz="4"/>
+            </w:tcBorders>
+            <w:tcMar>
+              <w:top w:type="dxa" w:w="60"/>
+              <w:left w:type="dxa" w:w="100"/>
+              <w:bottom w:type="dxa" w:w="60"/>
+              <w:right w:type="dxa" w:w="100"/>
+            </w:tcMar>
+          </w:tcPr>
+          <w:p>
+            <w:pPr>
+              <w:spacing w:after="0" w:line="276"/>
+            </w:pPr>
+            <w:r>
+              <w:rPr>
+                <w:rFonts w:ascii="Arial" w:cs="Arial" w:eastAsia="Arial" w:hAnsi="Arial"/>
+                <w:sz w:val="24"/>
+                <w:szCs w:val="24"/>
+              </w:rPr>
+              <w:t xml:space="preserve">9 langkah, tiada kitaran kerja semula</w:t>
+            </w:r>
+          </w:p>
+        </w:tc>
+      </w:tr>
+    </w:tbl>
+    <w:p>
+      <w:pPr>
+        <w:spacing w:after="120"/>
+      </w:pPr>
+    </w:p>
+    <w:p>
+      <w:pPr>
+        <w:spacing w:after="160" w:line="360"/>
+        <w:jc w:val="both"/>
+      </w:pPr>
+      <w:r>
+        <w:rPr>
+          <w:rFonts w:ascii="Arial" w:cs="Arial" w:eastAsia="Arial" w:hAnsi="Arial"/>
+          <w:sz w:val="24"/>
+          <w:szCs w:val="24"/>
+        </w:rPr>
+        <w:t xml:space="preserve">Perbincangan antara pegawai perubatan dengan FMS masih dibuat melalui telefon atau secara bersemuka, dan FMS masih menandatangani preskripsi fizikal. Yang berubah ialah kelulusan kini direkodkan dan baki kuota dipaparkan sebelum keputusan dibuat. Rajah 3 dan Rajah 4 menunjukkan aliran kerja yang sama selepas inovasi, tanpa kitaran kerja semula. Tangkap layar sistem dilampirkan di Lampiran A.</w:t>
+      </w:r>
+    </w:p>
+    <w:p>
+      <w:pPr>
         <w:spacing w:after="160" w:before="60"/>
         <w:jc w:val="center"/>
       </w:pPr>
       <w:r>
         <w:drawing>
           <wp:inline distT="0" distB="0" distL="0" distR="0">
-            <wp:extent cx="4610100" cy="6096000"/>
+            <wp:extent cx="5734050" cy="4429125"/>
             <wp:effectExtent t="0" r="0" b="0" l="0"/>
             <wp:docPr id="1" name="" descr="" title=""/>
             <wp:cNvGraphicFramePr>
@@ -2414,7 +3266,7 @@
                   <pic:spPr bwMode="auto">
                     <a:xfrm>
                       <a:off x="0" y="0"/>
-                      <a:ext cx="4610100" cy="6096000"/>
+                      <a:ext cx="5734050" cy="4429125"/>
                     </a:xfrm>
                     <a:prstGeom prst="rect">
                       <a:avLst/>
@@ -2435,7 +3287,7 @@
       <w:r>
         <w:drawing>
           <wp:inline distT="0" distB="0" distL="0" distR="0">
-            <wp:extent cx="5734050" cy="5962650"/>
+            <wp:extent cx="5734050" cy="3933825"/>
             <wp:effectExtent t="0" r="0" b="0" l="0"/>
             <wp:docPr id="2" name="" descr="" title=""/>
             <wp:cNvGraphicFramePr>
@@ -2460,7 +3312,7 @@
                   <pic:spPr bwMode="auto">
                     <a:xfrm>
                       <a:off x="0" y="0"/>
-                      <a:ext cx="5734050" cy="5962650"/>
+                      <a:ext cx="5734050" cy="3933825"/>
                     </a:xfrm>
                     <a:prstGeom prst="rect">
                       <a:avLst/>
@@ -2475,865 +3327,13 @@
     </w:p>
     <w:p>
       <w:pPr>
-        <w:pStyle w:val="Heading2"/>
-      </w:pPr>
-      <w:r>
-        <w:t xml:space="preserve">Keadaan Selepas Pelaksanaan Inovasi</w:t>
-      </w:r>
-    </w:p>
-    <w:p>
-      <w:pPr>
-        <w:spacing w:after="160" w:line="360"/>
-        <w:jc w:val="both"/>
-      </w:pPr>
-      <w:r>
-        <w:rPr>
-          <w:rFonts w:ascii="Arial" w:cs="Arial" w:eastAsia="Arial" w:hAnsi="Arial"/>
-          <w:sz w:val="24"/>
-          <w:szCs w:val="24"/>
-        </w:rPr>
-        <w:t xml:space="preserve">Selepas PharmaSync dilaksanakan, permohonan, kelulusan dan pendispensan direkodkan dalam satu sistem. Perbandingan kaedah sebelum dan selepas inovasi adalah seperti dalam Jadual 3.</w:t>
-      </w:r>
-    </w:p>
-    <w:p>
-      <w:pPr>
-        <w:keepNext/>
-        <w:spacing w:after="100" w:before="120"/>
-      </w:pPr>
-      <w:r>
-        <w:rPr>
-          <w:rFonts w:ascii="Arial" w:cs="Arial" w:eastAsia="Arial" w:hAnsi="Arial"/>
-          <w:b/>
-          <w:bCs/>
-          <w:sz w:val="24"/>
-          <w:szCs w:val="24"/>
-        </w:rPr>
-        <w:t xml:space="preserve">Jadual 3: Perbandingan kaedah sebelum dan selepas inovasi</w:t>
-      </w:r>
-    </w:p>
-    <w:tbl>
-      <w:tblPr>
-        <w:tblW w:type="dxa" w:w="9026"/>
-        <w:tblBorders>
-          <w:top w:val="single" w:color="auto" w:sz="4"/>
-          <w:left w:val="single" w:color="auto" w:sz="4"/>
-          <w:bottom w:val="single" w:color="auto" w:sz="4"/>
-          <w:right w:val="single" w:color="auto" w:sz="4"/>
-          <w:insideH w:val="single" w:color="auto" w:sz="4"/>
-          <w:insideV w:val="single" w:color="auto" w:sz="4"/>
-        </w:tblBorders>
-      </w:tblPr>
-      <w:tblGrid>
-        <w:gridCol w:w="2300"/>
-        <w:gridCol w:w="3363"/>
-        <w:gridCol w:w="3363"/>
-      </w:tblGrid>
-      <w:tr>
-        <w:trPr>
-          <w:cantSplit/>
-          <w:tblHeader/>
-        </w:trPr>
-        <w:tc>
-          <w:tcPr>
-            <w:tcW w:type="dxa" w:w="2300"/>
-            <w:tcBorders>
-              <w:top w:val="single" w:color="B7C4BF" w:sz="4"/>
-              <w:left w:val="single" w:color="B7C4BF" w:sz="4"/>
-              <w:bottom w:val="single" w:color="B7C4BF" w:sz="4"/>
-              <w:right w:val="single" w:color="B7C4BF" w:sz="4"/>
-            </w:tcBorders>
-            <w:shd w:fill="E3EFEA" w:color="auto" w:val="clear"/>
-            <w:tcMar>
-              <w:top w:type="dxa" w:w="60"/>
-              <w:left w:type="dxa" w:w="100"/>
-              <w:bottom w:type="dxa" w:w="60"/>
-              <w:right w:type="dxa" w:w="100"/>
-            </w:tcMar>
-          </w:tcPr>
-          <w:p>
-            <w:pPr>
-              <w:spacing w:after="0" w:line="276"/>
-            </w:pPr>
-            <w:r>
-              <w:rPr>
-                <w:rFonts w:ascii="Arial" w:cs="Arial" w:eastAsia="Arial" w:hAnsi="Arial"/>
-                <w:b/>
-                <w:bCs/>
-                <w:sz w:val="24"/>
-                <w:szCs w:val="24"/>
-              </w:rPr>
-              <w:t xml:space="preserve">Aspek</w:t>
-            </w:r>
-          </w:p>
-        </w:tc>
-        <w:tc>
-          <w:tcPr>
-            <w:tcW w:type="dxa" w:w="3363"/>
-            <w:tcBorders>
-              <w:top w:val="single" w:color="B7C4BF" w:sz="4"/>
-              <w:left w:val="single" w:color="B7C4BF" w:sz="4"/>
-              <w:bottom w:val="single" w:color="B7C4BF" w:sz="4"/>
-              <w:right w:val="single" w:color="B7C4BF" w:sz="4"/>
-            </w:tcBorders>
-            <w:shd w:fill="E3EFEA" w:color="auto" w:val="clear"/>
-            <w:tcMar>
-              <w:top w:type="dxa" w:w="60"/>
-              <w:left w:type="dxa" w:w="100"/>
-              <w:bottom w:type="dxa" w:w="60"/>
-              <w:right w:type="dxa" w:w="100"/>
-            </w:tcMar>
-          </w:tcPr>
-          <w:p>
-            <w:pPr>
-              <w:spacing w:after="0" w:line="276"/>
-            </w:pPr>
-            <w:r>
-              <w:rPr>
-                <w:rFonts w:ascii="Arial" w:cs="Arial" w:eastAsia="Arial" w:hAnsi="Arial"/>
-                <w:b/>
-                <w:bCs/>
-                <w:sz w:val="24"/>
-                <w:szCs w:val="24"/>
-              </w:rPr>
-              <w:t xml:space="preserve">Sebelum</w:t>
-            </w:r>
-          </w:p>
-        </w:tc>
-        <w:tc>
-          <w:tcPr>
-            <w:tcW w:type="dxa" w:w="3363"/>
-            <w:tcBorders>
-              <w:top w:val="single" w:color="B7C4BF" w:sz="4"/>
-              <w:left w:val="single" w:color="B7C4BF" w:sz="4"/>
-              <w:bottom w:val="single" w:color="B7C4BF" w:sz="4"/>
-              <w:right w:val="single" w:color="B7C4BF" w:sz="4"/>
-            </w:tcBorders>
-            <w:shd w:fill="E3EFEA" w:color="auto" w:val="clear"/>
-            <w:tcMar>
-              <w:top w:type="dxa" w:w="60"/>
-              <w:left w:type="dxa" w:w="100"/>
-              <w:bottom w:type="dxa" w:w="60"/>
-              <w:right w:type="dxa" w:w="100"/>
-            </w:tcMar>
-          </w:tcPr>
-          <w:p>
-            <w:pPr>
-              <w:spacing w:after="0" w:line="276"/>
-            </w:pPr>
-            <w:r>
-              <w:rPr>
-                <w:rFonts w:ascii="Arial" w:cs="Arial" w:eastAsia="Arial" w:hAnsi="Arial"/>
-                <w:b/>
-                <w:bCs/>
-                <w:sz w:val="24"/>
-                <w:szCs w:val="24"/>
-              </w:rPr>
-              <w:t xml:space="preserve">Selepas</w:t>
-            </w:r>
-          </w:p>
-        </w:tc>
-      </w:tr>
-      <w:tr>
-        <w:trPr>
-          <w:cantSplit/>
-          <w:tblHeader w:val="off"/>
-        </w:trPr>
-        <w:tc>
-          <w:tcPr>
-            <w:tcW w:type="dxa" w:w="2300"/>
-            <w:tcBorders>
-              <w:top w:val="single" w:color="B7C4BF" w:sz="4"/>
-              <w:left w:val="single" w:color="B7C4BF" w:sz="4"/>
-              <w:bottom w:val="single" w:color="B7C4BF" w:sz="4"/>
-              <w:right w:val="single" w:color="B7C4BF" w:sz="4"/>
-            </w:tcBorders>
-            <w:tcMar>
-              <w:top w:type="dxa" w:w="60"/>
-              <w:left w:type="dxa" w:w="100"/>
-              <w:bottom w:type="dxa" w:w="60"/>
-              <w:right w:type="dxa" w:w="100"/>
-            </w:tcMar>
-          </w:tcPr>
-          <w:p>
-            <w:pPr>
-              <w:spacing w:after="0" w:line="276"/>
-            </w:pPr>
-            <w:r>
-              <w:rPr>
-                <w:rFonts w:ascii="Arial" w:cs="Arial" w:eastAsia="Arial" w:hAnsi="Arial"/>
-                <w:sz w:val="24"/>
-                <w:szCs w:val="24"/>
-              </w:rPr>
-              <w:t xml:space="preserve">Kelulusan UKK oleh FMS</w:t>
-            </w:r>
-          </w:p>
-        </w:tc>
-        <w:tc>
-          <w:tcPr>
-            <w:tcW w:type="dxa" w:w="3363"/>
-            <w:tcBorders>
-              <w:top w:val="single" w:color="B7C4BF" w:sz="4"/>
-              <w:left w:val="single" w:color="B7C4BF" w:sz="4"/>
-              <w:bottom w:val="single" w:color="B7C4BF" w:sz="4"/>
-              <w:right w:val="single" w:color="B7C4BF" w:sz="4"/>
-            </w:tcBorders>
-            <w:tcMar>
-              <w:top w:type="dxa" w:w="60"/>
-              <w:left w:type="dxa" w:w="100"/>
-              <w:bottom w:type="dxa" w:w="60"/>
-              <w:right w:type="dxa" w:w="100"/>
-            </w:tcMar>
-          </w:tcPr>
-          <w:p>
-            <w:pPr>
-              <w:spacing w:after="0" w:line="276"/>
-            </w:pPr>
-            <w:r>
-              <w:rPr>
-                <w:rFonts w:ascii="Arial" w:cs="Arial" w:eastAsia="Arial" w:hAnsi="Arial"/>
-                <w:sz w:val="24"/>
-                <w:szCs w:val="24"/>
-              </w:rPr>
-              <w:t xml:space="preserve">Melalui telefon, dengan bukti tangkap layar WhatsApp</w:t>
-            </w:r>
-          </w:p>
-        </w:tc>
-        <w:tc>
-          <w:tcPr>
-            <w:tcW w:type="dxa" w:w="3363"/>
-            <w:tcBorders>
-              <w:top w:val="single" w:color="B7C4BF" w:sz="4"/>
-              <w:left w:val="single" w:color="B7C4BF" w:sz="4"/>
-              <w:bottom w:val="single" w:color="B7C4BF" w:sz="4"/>
-              <w:right w:val="single" w:color="B7C4BF" w:sz="4"/>
-            </w:tcBorders>
-            <w:tcMar>
-              <w:top w:type="dxa" w:w="60"/>
-              <w:left w:type="dxa" w:w="100"/>
-              <w:bottom w:type="dxa" w:w="60"/>
-              <w:right w:type="dxa" w:w="100"/>
-            </w:tcMar>
-          </w:tcPr>
-          <w:p>
-            <w:pPr>
-              <w:spacing w:after="0" w:line="276"/>
-            </w:pPr>
-            <w:r>
-              <w:rPr>
-                <w:rFonts w:ascii="Arial" w:cs="Arial" w:eastAsia="Arial" w:hAnsi="Arial"/>
-                <w:sz w:val="24"/>
-                <w:szCs w:val="24"/>
-              </w:rPr>
-              <w:t xml:space="preserve">Direkodkan dalam sistem bersama nama FMS dan cap masa</w:t>
-            </w:r>
-          </w:p>
-        </w:tc>
-      </w:tr>
-      <w:tr>
-        <w:trPr>
-          <w:cantSplit/>
-          <w:tblHeader w:val="off"/>
-        </w:trPr>
-        <w:tc>
-          <w:tcPr>
-            <w:tcW w:type="dxa" w:w="2300"/>
-            <w:tcBorders>
-              <w:top w:val="single" w:color="B7C4BF" w:sz="4"/>
-              <w:left w:val="single" w:color="B7C4BF" w:sz="4"/>
-              <w:bottom w:val="single" w:color="B7C4BF" w:sz="4"/>
-              <w:right w:val="single" w:color="B7C4BF" w:sz="4"/>
-            </w:tcBorders>
-            <w:tcMar>
-              <w:top w:type="dxa" w:w="60"/>
-              <w:left w:type="dxa" w:w="100"/>
-              <w:bottom w:type="dxa" w:w="60"/>
-              <w:right w:type="dxa" w:w="100"/>
-            </w:tcMar>
-          </w:tcPr>
-          <w:p>
-            <w:pPr>
-              <w:spacing w:after="0" w:line="276"/>
-            </w:pPr>
-            <w:r>
-              <w:rPr>
-                <w:rFonts w:ascii="Arial" w:cs="Arial" w:eastAsia="Arial" w:hAnsi="Arial"/>
-                <w:sz w:val="24"/>
-                <w:szCs w:val="24"/>
-              </w:rPr>
-              <w:t xml:space="preserve">Baki kuota UKK</w:t>
-            </w:r>
-          </w:p>
-        </w:tc>
-        <w:tc>
-          <w:tcPr>
-            <w:tcW w:type="dxa" w:w="3363"/>
-            <w:tcBorders>
-              <w:top w:val="single" w:color="B7C4BF" w:sz="4"/>
-              <w:left w:val="single" w:color="B7C4BF" w:sz="4"/>
-              <w:bottom w:val="single" w:color="B7C4BF" w:sz="4"/>
-              <w:right w:val="single" w:color="B7C4BF" w:sz="4"/>
-            </w:tcBorders>
-            <w:tcMar>
-              <w:top w:type="dxa" w:w="60"/>
-              <w:left w:type="dxa" w:w="100"/>
-              <w:bottom w:type="dxa" w:w="60"/>
-              <w:right w:type="dxa" w:w="100"/>
-            </w:tcMar>
-          </w:tcPr>
-          <w:p>
-            <w:pPr>
-              <w:spacing w:after="0" w:line="276"/>
-            </w:pPr>
-            <w:r>
-              <w:rPr>
-                <w:rFonts w:ascii="Arial" w:cs="Arial" w:eastAsia="Arial" w:hAnsi="Arial"/>
-                <w:sz w:val="24"/>
-                <w:szCs w:val="24"/>
-              </w:rPr>
-              <w:t xml:space="preserve">Dikira dengan tangan dalam Excel</w:t>
-            </w:r>
-          </w:p>
-        </w:tc>
-        <w:tc>
-          <w:tcPr>
-            <w:tcW w:type="dxa" w:w="3363"/>
-            <w:tcBorders>
-              <w:top w:val="single" w:color="B7C4BF" w:sz="4"/>
-              <w:left w:val="single" w:color="B7C4BF" w:sz="4"/>
-              <w:bottom w:val="single" w:color="B7C4BF" w:sz="4"/>
-              <w:right w:val="single" w:color="B7C4BF" w:sz="4"/>
-            </w:tcBorders>
-            <w:tcMar>
-              <w:top w:type="dxa" w:w="60"/>
-              <w:left w:type="dxa" w:w="100"/>
-              <w:bottom w:type="dxa" w:w="60"/>
-              <w:right w:type="dxa" w:w="100"/>
-            </w:tcMar>
-          </w:tcPr>
-          <w:p>
-            <w:pPr>
-              <w:spacing w:after="0" w:line="276"/>
-            </w:pPr>
-            <w:r>
-              <w:rPr>
-                <w:rFonts w:ascii="Arial" w:cs="Arial" w:eastAsia="Arial" w:hAnsi="Arial"/>
-                <w:sz w:val="24"/>
-                <w:szCs w:val="24"/>
-              </w:rPr>
-              <w:t xml:space="preserve">Dikira oleh sistem dan dipaparkan kepada pegawai perubatan dan FMS</w:t>
-            </w:r>
-          </w:p>
-        </w:tc>
-      </w:tr>
-      <w:tr>
-        <w:trPr>
-          <w:cantSplit/>
-          <w:tblHeader w:val="off"/>
-        </w:trPr>
-        <w:tc>
-          <w:tcPr>
-            <w:tcW w:type="dxa" w:w="2300"/>
-            <w:tcBorders>
-              <w:top w:val="single" w:color="B7C4BF" w:sz="4"/>
-              <w:left w:val="single" w:color="B7C4BF" w:sz="4"/>
-              <w:bottom w:val="single" w:color="B7C4BF" w:sz="4"/>
-              <w:right w:val="single" w:color="B7C4BF" w:sz="4"/>
-            </w:tcBorders>
-            <w:tcMar>
-              <w:top w:type="dxa" w:w="60"/>
-              <w:left w:type="dxa" w:w="100"/>
-              <w:bottom w:type="dxa" w:w="60"/>
-              <w:right w:type="dxa" w:w="100"/>
-            </w:tcMar>
-          </w:tcPr>
-          <w:p>
-            <w:pPr>
-              <w:spacing w:after="0" w:line="276"/>
-            </w:pPr>
-            <w:r>
-              <w:rPr>
-                <w:rFonts w:ascii="Arial" w:cs="Arial" w:eastAsia="Arial" w:hAnsi="Arial"/>
-                <w:sz w:val="24"/>
-                <w:szCs w:val="24"/>
-              </w:rPr>
-              <w:t xml:space="preserve">Pengesahan di kaunter</w:t>
-            </w:r>
-          </w:p>
-        </w:tc>
-        <w:tc>
-          <w:tcPr>
-            <w:tcW w:type="dxa" w:w="3363"/>
-            <w:tcBorders>
-              <w:top w:val="single" w:color="B7C4BF" w:sz="4"/>
-              <w:left w:val="single" w:color="B7C4BF" w:sz="4"/>
-              <w:bottom w:val="single" w:color="B7C4BF" w:sz="4"/>
-              <w:right w:val="single" w:color="B7C4BF" w:sz="4"/>
-            </w:tcBorders>
-            <w:tcMar>
-              <w:top w:type="dxa" w:w="60"/>
-              <w:left w:type="dxa" w:w="100"/>
-              <w:bottom w:type="dxa" w:w="60"/>
-              <w:right w:type="dxa" w:w="100"/>
-            </w:tcMar>
-          </w:tcPr>
-          <w:p>
-            <w:pPr>
-              <w:spacing w:after="0" w:line="276"/>
-            </w:pPr>
-            <w:r>
-              <w:rPr>
-                <w:rFonts w:ascii="Arial" w:cs="Arial" w:eastAsia="Arial" w:hAnsi="Arial"/>
-                <w:sz w:val="24"/>
-                <w:szCs w:val="24"/>
-              </w:rPr>
-              <w:t xml:space="preserve">Mencari tangkap layar atau menelefon pegawai perubatan</w:t>
-            </w:r>
-          </w:p>
-        </w:tc>
-        <w:tc>
-          <w:tcPr>
-            <w:tcW w:type="dxa" w:w="3363"/>
-            <w:tcBorders>
-              <w:top w:val="single" w:color="B7C4BF" w:sz="4"/>
-              <w:left w:val="single" w:color="B7C4BF" w:sz="4"/>
-              <w:bottom w:val="single" w:color="B7C4BF" w:sz="4"/>
-              <w:right w:val="single" w:color="B7C4BF" w:sz="4"/>
-            </w:tcBorders>
-            <w:tcMar>
-              <w:top w:type="dxa" w:w="60"/>
-              <w:left w:type="dxa" w:w="100"/>
-              <w:bottom w:type="dxa" w:w="60"/>
-              <w:right w:type="dxa" w:w="100"/>
-            </w:tcMar>
-          </w:tcPr>
-          <w:p>
-            <w:pPr>
-              <w:spacing w:after="0" w:line="276"/>
-            </w:pPr>
-            <w:r>
-              <w:rPr>
-                <w:rFonts w:ascii="Arial" w:cs="Arial" w:eastAsia="Arial" w:hAnsi="Arial"/>
-                <w:sz w:val="24"/>
-                <w:szCs w:val="24"/>
-              </w:rPr>
-              <w:t xml:space="preserve">Kelulusan dilihat terus dalam sistem</w:t>
-            </w:r>
-          </w:p>
-        </w:tc>
-      </w:tr>
-      <w:tr>
-        <w:trPr>
-          <w:cantSplit/>
-          <w:tblHeader w:val="off"/>
-        </w:trPr>
-        <w:tc>
-          <w:tcPr>
-            <w:tcW w:type="dxa" w:w="2300"/>
-            <w:tcBorders>
-              <w:top w:val="single" w:color="B7C4BF" w:sz="4"/>
-              <w:left w:val="single" w:color="B7C4BF" w:sz="4"/>
-              <w:bottom w:val="single" w:color="B7C4BF" w:sz="4"/>
-              <w:right w:val="single" w:color="B7C4BF" w:sz="4"/>
-            </w:tcBorders>
-            <w:tcMar>
-              <w:top w:type="dxa" w:w="60"/>
-              <w:left w:type="dxa" w:w="100"/>
-              <w:bottom w:type="dxa" w:w="60"/>
-              <w:right w:type="dxa" w:w="100"/>
-            </w:tcMar>
-          </w:tcPr>
-          <w:p>
-            <w:pPr>
-              <w:spacing w:after="0" w:line="276"/>
-            </w:pPr>
-            <w:r>
-              <w:rPr>
-                <w:rFonts w:ascii="Arial" w:cs="Arial" w:eastAsia="Arial" w:hAnsi="Arial"/>
-                <w:sz w:val="24"/>
-                <w:szCs w:val="24"/>
-              </w:rPr>
-              <w:t xml:space="preserve">Borang antibiotik</w:t>
-            </w:r>
-          </w:p>
-        </w:tc>
-        <w:tc>
-          <w:tcPr>
-            <w:tcW w:type="dxa" w:w="3363"/>
-            <w:tcBorders>
-              <w:top w:val="single" w:color="B7C4BF" w:sz="4"/>
-              <w:left w:val="single" w:color="B7C4BF" w:sz="4"/>
-              <w:bottom w:val="single" w:color="B7C4BF" w:sz="4"/>
-              <w:right w:val="single" w:color="B7C4BF" w:sz="4"/>
-            </w:tcBorders>
-            <w:tcMar>
-              <w:top w:type="dxa" w:w="60"/>
-              <w:left w:type="dxa" w:w="100"/>
-              <w:bottom w:type="dxa" w:w="60"/>
-              <w:right w:type="dxa" w:w="100"/>
-            </w:tcMar>
-          </w:tcPr>
-          <w:p>
-            <w:pPr>
-              <w:spacing w:after="0" w:line="276"/>
-            </w:pPr>
-            <w:r>
-              <w:rPr>
-                <w:rFonts w:ascii="Arial" w:cs="Arial" w:eastAsia="Arial" w:hAnsi="Arial"/>
-                <w:sz w:val="24"/>
-                <w:szCs w:val="24"/>
-              </w:rPr>
-              <w:t xml:space="preserve">Borang AMS fizikal; purata 10 tidak lengkap sebulan</w:t>
-            </w:r>
-          </w:p>
-        </w:tc>
-        <w:tc>
-          <w:tcPr>
-            <w:tcW w:type="dxa" w:w="3363"/>
-            <w:tcBorders>
-              <w:top w:val="single" w:color="B7C4BF" w:sz="4"/>
-              <w:left w:val="single" w:color="B7C4BF" w:sz="4"/>
-              <w:bottom w:val="single" w:color="B7C4BF" w:sz="4"/>
-              <w:right w:val="single" w:color="B7C4BF" w:sz="4"/>
-            </w:tcBorders>
-            <w:tcMar>
-              <w:top w:type="dxa" w:w="60"/>
-              <w:left w:type="dxa" w:w="100"/>
-              <w:bottom w:type="dxa" w:w="60"/>
-              <w:right w:type="dxa" w:w="100"/>
-            </w:tcMar>
-          </w:tcPr>
-          <w:p>
-            <w:pPr>
-              <w:spacing w:after="0" w:line="276"/>
-            </w:pPr>
-            <w:r>
-              <w:rPr>
-                <w:rFonts w:ascii="Arial" w:cs="Arial" w:eastAsia="Arial" w:hAnsi="Arial"/>
-                <w:sz w:val="24"/>
-                <w:szCs w:val="24"/>
-              </w:rPr>
-              <w:t xml:space="preserve">Borang digital dengan medan wajib; sifar borang tidak lengkap</w:t>
-            </w:r>
-          </w:p>
-        </w:tc>
-      </w:tr>
-      <w:tr>
-        <w:trPr>
-          <w:cantSplit/>
-          <w:tblHeader w:val="off"/>
-        </w:trPr>
-        <w:tc>
-          <w:tcPr>
-            <w:tcW w:type="dxa" w:w="2300"/>
-            <w:tcBorders>
-              <w:top w:val="single" w:color="B7C4BF" w:sz="4"/>
-              <w:left w:val="single" w:color="B7C4BF" w:sz="4"/>
-              <w:bottom w:val="single" w:color="B7C4BF" w:sz="4"/>
-              <w:right w:val="single" w:color="B7C4BF" w:sz="4"/>
-            </w:tcBorders>
-            <w:tcMar>
-              <w:top w:type="dxa" w:w="60"/>
-              <w:left w:type="dxa" w:w="100"/>
-              <w:bottom w:type="dxa" w:w="60"/>
-              <w:right w:type="dxa" w:w="100"/>
-            </w:tcMar>
-          </w:tcPr>
-          <w:p>
-            <w:pPr>
-              <w:spacing w:after="0" w:line="276"/>
-            </w:pPr>
-            <w:r>
-              <w:rPr>
-                <w:rFonts w:ascii="Arial" w:cs="Arial" w:eastAsia="Arial" w:hAnsi="Arial"/>
-                <w:sz w:val="24"/>
-                <w:szCs w:val="24"/>
-              </w:rPr>
-              <w:t xml:space="preserve">Semakan NAG 2024</w:t>
-            </w:r>
-          </w:p>
-        </w:tc>
-        <w:tc>
-          <w:tcPr>
-            <w:tcW w:type="dxa" w:w="3363"/>
-            <w:tcBorders>
-              <w:top w:val="single" w:color="B7C4BF" w:sz="4"/>
-              <w:left w:val="single" w:color="B7C4BF" w:sz="4"/>
-              <w:bottom w:val="single" w:color="B7C4BF" w:sz="4"/>
-              <w:right w:val="single" w:color="B7C4BF" w:sz="4"/>
-            </w:tcBorders>
-            <w:tcMar>
-              <w:top w:type="dxa" w:w="60"/>
-              <w:left w:type="dxa" w:w="100"/>
-              <w:bottom w:type="dxa" w:w="60"/>
-              <w:right w:type="dxa" w:w="100"/>
-            </w:tcMar>
-          </w:tcPr>
-          <w:p>
-            <w:pPr>
-              <w:spacing w:after="0" w:line="276"/>
-            </w:pPr>
-            <w:r>
-              <w:rPr>
-                <w:rFonts w:ascii="Arial" w:cs="Arial" w:eastAsia="Arial" w:hAnsi="Arial"/>
-                <w:sz w:val="24"/>
-                <w:szCs w:val="24"/>
-              </w:rPr>
-              <w:t xml:space="preserve">Tiada rekod berpusat</w:t>
-            </w:r>
-          </w:p>
-        </w:tc>
-        <w:tc>
-          <w:tcPr>
-            <w:tcW w:type="dxa" w:w="3363"/>
-            <w:tcBorders>
-              <w:top w:val="single" w:color="B7C4BF" w:sz="4"/>
-              <w:left w:val="single" w:color="B7C4BF" w:sz="4"/>
-              <w:bottom w:val="single" w:color="B7C4BF" w:sz="4"/>
-              <w:right w:val="single" w:color="B7C4BF" w:sz="4"/>
-            </w:tcBorders>
-            <w:tcMar>
-              <w:top w:type="dxa" w:w="60"/>
-              <w:left w:type="dxa" w:w="100"/>
-              <w:bottom w:type="dxa" w:w="60"/>
-              <w:right w:type="dxa" w:w="100"/>
-            </w:tcMar>
-          </w:tcPr>
-          <w:p>
-            <w:pPr>
-              <w:spacing w:after="0" w:line="276"/>
-            </w:pPr>
-            <w:r>
-              <w:rPr>
-                <w:rFonts w:ascii="Arial" w:cs="Arial" w:eastAsia="Arial" w:hAnsi="Arial"/>
-                <w:sz w:val="24"/>
-                <w:szCs w:val="24"/>
-              </w:rPr>
-              <w:t xml:space="preserve">Dibuat semasa preskripsi ditulis</w:t>
-            </w:r>
-          </w:p>
-        </w:tc>
-      </w:tr>
-      <w:tr>
-        <w:trPr>
-          <w:cantSplit/>
-          <w:tblHeader w:val="off"/>
-        </w:trPr>
-        <w:tc>
-          <w:tcPr>
-            <w:tcW w:type="dxa" w:w="2300"/>
-            <w:tcBorders>
-              <w:top w:val="single" w:color="B7C4BF" w:sz="4"/>
-              <w:left w:val="single" w:color="B7C4BF" w:sz="4"/>
-              <w:bottom w:val="single" w:color="B7C4BF" w:sz="4"/>
-              <w:right w:val="single" w:color="B7C4BF" w:sz="4"/>
-            </w:tcBorders>
-            <w:tcMar>
-              <w:top w:type="dxa" w:w="60"/>
-              <w:left w:type="dxa" w:w="100"/>
-              <w:bottom w:type="dxa" w:w="60"/>
-              <w:right w:type="dxa" w:w="100"/>
-            </w:tcMar>
-          </w:tcPr>
-          <w:p>
-            <w:pPr>
-              <w:spacing w:after="0" w:line="276"/>
-            </w:pPr>
-            <w:r>
-              <w:rPr>
-                <w:rFonts w:ascii="Arial" w:cs="Arial" w:eastAsia="Arial" w:hAnsi="Arial"/>
-                <w:sz w:val="24"/>
-                <w:szCs w:val="24"/>
-              </w:rPr>
-              <w:t xml:space="preserve">Aliran kerja UKK</w:t>
-            </w:r>
-          </w:p>
-        </w:tc>
-        <w:tc>
-          <w:tcPr>
-            <w:tcW w:type="dxa" w:w="3363"/>
-            <w:tcBorders>
-              <w:top w:val="single" w:color="B7C4BF" w:sz="4"/>
-              <w:left w:val="single" w:color="B7C4BF" w:sz="4"/>
-              <w:bottom w:val="single" w:color="B7C4BF" w:sz="4"/>
-              <w:right w:val="single" w:color="B7C4BF" w:sz="4"/>
-            </w:tcBorders>
-            <w:tcMar>
-              <w:top w:type="dxa" w:w="60"/>
-              <w:left w:type="dxa" w:w="100"/>
-              <w:bottom w:type="dxa" w:w="60"/>
-              <w:right w:type="dxa" w:w="100"/>
-            </w:tcMar>
-          </w:tcPr>
-          <w:p>
-            <w:pPr>
-              <w:spacing w:after="0" w:line="276"/>
-            </w:pPr>
-            <w:r>
-              <w:rPr>
-                <w:rFonts w:ascii="Arial" w:cs="Arial" w:eastAsia="Arial" w:hAnsi="Arial"/>
-                <w:sz w:val="24"/>
-                <w:szCs w:val="24"/>
-              </w:rPr>
-              <w:t xml:space="preserve">12 langkah, 1 kitaran kerja semula</w:t>
-            </w:r>
-          </w:p>
-        </w:tc>
-        <w:tc>
-          <w:tcPr>
-            <w:tcW w:type="dxa" w:w="3363"/>
-            <w:tcBorders>
-              <w:top w:val="single" w:color="B7C4BF" w:sz="4"/>
-              <w:left w:val="single" w:color="B7C4BF" w:sz="4"/>
-              <w:bottom w:val="single" w:color="B7C4BF" w:sz="4"/>
-              <w:right w:val="single" w:color="B7C4BF" w:sz="4"/>
-            </w:tcBorders>
-            <w:tcMar>
-              <w:top w:type="dxa" w:w="60"/>
-              <w:left w:type="dxa" w:w="100"/>
-              <w:bottom w:type="dxa" w:w="60"/>
-              <w:right w:type="dxa" w:w="100"/>
-            </w:tcMar>
-          </w:tcPr>
-          <w:p>
-            <w:pPr>
-              <w:spacing w:after="0" w:line="276"/>
-            </w:pPr>
-            <w:r>
-              <w:rPr>
-                <w:rFonts w:ascii="Arial" w:cs="Arial" w:eastAsia="Arial" w:hAnsi="Arial"/>
-                <w:sz w:val="24"/>
-                <w:szCs w:val="24"/>
-              </w:rPr>
-              <w:t xml:space="preserve">10 langkah, tiada kitaran kerja semula</w:t>
-            </w:r>
-          </w:p>
-        </w:tc>
-      </w:tr>
-      <w:tr>
-        <w:trPr>
-          <w:cantSplit/>
-          <w:tblHeader w:val="off"/>
-        </w:trPr>
-        <w:tc>
-          <w:tcPr>
-            <w:tcW w:type="dxa" w:w="2300"/>
-            <w:tcBorders>
-              <w:top w:val="single" w:color="B7C4BF" w:sz="4"/>
-              <w:left w:val="single" w:color="B7C4BF" w:sz="4"/>
-              <w:bottom w:val="single" w:color="B7C4BF" w:sz="4"/>
-              <w:right w:val="single" w:color="B7C4BF" w:sz="4"/>
-            </w:tcBorders>
-            <w:tcMar>
-              <w:top w:type="dxa" w:w="60"/>
-              <w:left w:type="dxa" w:w="100"/>
-              <w:bottom w:type="dxa" w:w="60"/>
-              <w:right w:type="dxa" w:w="100"/>
-            </w:tcMar>
-          </w:tcPr>
-          <w:p>
-            <w:pPr>
-              <w:spacing w:after="0" w:line="276"/>
-            </w:pPr>
-            <w:r>
-              <w:rPr>
-                <w:rFonts w:ascii="Arial" w:cs="Arial" w:eastAsia="Arial" w:hAnsi="Arial"/>
-                <w:sz w:val="24"/>
-                <w:szCs w:val="24"/>
-              </w:rPr>
-              <w:t xml:space="preserve">Aliran kerja antibiotik</w:t>
-            </w:r>
-          </w:p>
-        </w:tc>
-        <w:tc>
-          <w:tcPr>
-            <w:tcW w:type="dxa" w:w="3363"/>
-            <w:tcBorders>
-              <w:top w:val="single" w:color="B7C4BF" w:sz="4"/>
-              <w:left w:val="single" w:color="B7C4BF" w:sz="4"/>
-              <w:bottom w:val="single" w:color="B7C4BF" w:sz="4"/>
-              <w:right w:val="single" w:color="B7C4BF" w:sz="4"/>
-            </w:tcBorders>
-            <w:tcMar>
-              <w:top w:type="dxa" w:w="60"/>
-              <w:left w:type="dxa" w:w="100"/>
-              <w:bottom w:type="dxa" w:w="60"/>
-              <w:right w:type="dxa" w:w="100"/>
-            </w:tcMar>
-          </w:tcPr>
-          <w:p>
-            <w:pPr>
-              <w:spacing w:after="0" w:line="276"/>
-            </w:pPr>
-            <w:r>
-              <w:rPr>
-                <w:rFonts w:ascii="Arial" w:cs="Arial" w:eastAsia="Arial" w:hAnsi="Arial"/>
-                <w:sz w:val="24"/>
-                <w:szCs w:val="24"/>
-              </w:rPr>
-              <w:t xml:space="preserve">10 langkah, 2 kitaran kerja semula</w:t>
-            </w:r>
-          </w:p>
-        </w:tc>
-        <w:tc>
-          <w:tcPr>
-            <w:tcW w:type="dxa" w:w="3363"/>
-            <w:tcBorders>
-              <w:top w:val="single" w:color="B7C4BF" w:sz="4"/>
-              <w:left w:val="single" w:color="B7C4BF" w:sz="4"/>
-              <w:bottom w:val="single" w:color="B7C4BF" w:sz="4"/>
-              <w:right w:val="single" w:color="B7C4BF" w:sz="4"/>
-            </w:tcBorders>
-            <w:tcMar>
-              <w:top w:type="dxa" w:w="60"/>
-              <w:left w:type="dxa" w:w="100"/>
-              <w:bottom w:type="dxa" w:w="60"/>
-              <w:right w:type="dxa" w:w="100"/>
-            </w:tcMar>
-          </w:tcPr>
-          <w:p>
-            <w:pPr>
-              <w:spacing w:after="0" w:line="276"/>
-            </w:pPr>
-            <w:r>
-              <w:rPr>
-                <w:rFonts w:ascii="Arial" w:cs="Arial" w:eastAsia="Arial" w:hAnsi="Arial"/>
-                <w:sz w:val="24"/>
-                <w:szCs w:val="24"/>
-              </w:rPr>
-              <w:t xml:space="preserve">9 langkah, tiada kitaran kerja semula</w:t>
-            </w:r>
-          </w:p>
-        </w:tc>
-      </w:tr>
-    </w:tbl>
-    <w:p>
-      <w:pPr>
-        <w:spacing w:after="120"/>
-      </w:pPr>
-    </w:p>
-    <w:p>
-      <w:pPr>
-        <w:spacing w:after="160" w:line="360"/>
-        <w:jc w:val="both"/>
-      </w:pPr>
-      <w:r>
-        <w:rPr>
-          <w:rFonts w:ascii="Arial" w:cs="Arial" w:eastAsia="Arial" w:hAnsi="Arial"/>
-          <w:sz w:val="24"/>
-          <w:szCs w:val="24"/>
-        </w:rPr>
-        <w:t xml:space="preserve">Perbincangan antara pegawai perubatan dengan FMS masih dibuat melalui telefon atau secara bersemuka, dan FMS masih menandatangani preskripsi fizikal. Yang berubah ialah kelulusan kini direkodkan dan baki kuota dipaparkan sebelum keputusan dibuat. Rajah 3 dan Rajah 4 menunjukkan aliran kerja yang sama selepas inovasi, tanpa kitaran kerja semula. Tangkap layar sistem dilampirkan di Lampiran A.</w:t>
-      </w:r>
-    </w:p>
-    <w:p>
-      <w:pPr>
         <w:spacing w:after="160" w:before="60"/>
         <w:jc w:val="center"/>
       </w:pPr>
       <w:r>
         <w:drawing>
           <wp:inline distT="0" distB="0" distL="0" distR="0">
-            <wp:extent cx="4629150" cy="6096000"/>
+            <wp:extent cx="5734050" cy="4248150"/>
             <wp:effectExtent t="0" r="0" b="0" l="0"/>
             <wp:docPr id="3" name="" descr="" title=""/>
             <wp:cNvGraphicFramePr>
@@ -3358,7 +3358,7 @@
                   <pic:spPr bwMode="auto">
                     <a:xfrm>
                       <a:off x="0" y="0"/>
-                      <a:ext cx="4629150" cy="6096000"/>
+                      <a:ext cx="5734050" cy="4248150"/>
                     </a:xfrm>
                     <a:prstGeom prst="rect">
                       <a:avLst/>
@@ -3379,7 +3379,7 @@
       <w:r>
         <w:drawing>
           <wp:inline distT="0" distB="0" distL="0" distR="0">
-            <wp:extent cx="5734050" cy="6086475"/>
+            <wp:extent cx="5734050" cy="3800475"/>
             <wp:effectExtent t="0" r="0" b="0" l="0"/>
             <wp:docPr id="4" name="" descr="" title=""/>
             <wp:cNvGraphicFramePr>
@@ -3404,7 +3404,7 @@
                   <pic:spPr bwMode="auto">
                     <a:xfrm>
                       <a:off x="0" y="0"/>
-                      <a:ext cx="5734050" cy="6086475"/>
+                      <a:ext cx="5734050" cy="3800475"/>
                     </a:xfrm>
                     <a:prstGeom prst="rect">
                       <a:avLst/>

</xml_diff>

<commit_message>
Add paper and toner savings to KIJS report
Jadual 4: toner RM800 every 3 months and one A4 ream RM12.90 every 2
months, RM3,277.40 a year; RM2,064.40 net after the RM1,213 yearly
operating cost. Same figures added under 3.3 Penjimatan kos.

Co-Authored-By: Claude Opus 5.5 <noreply@anthropic.com>
Claude-Session: https://claude.ai/code/session_01MAcNfHd5W4h5KoFbAUasoU
</commit_message>
<xml_diff>
--- a/Laporan_Projek_Inovasi_PharmaSync_8.docx
+++ b/Laporan_Projek_Inovasi_PharmaSync_8.docx
@@ -3444,24 +3444,583 @@
           <w:sz w:val="24"/>
           <w:szCs w:val="24"/>
         </w:rPr>
-        <w:t xml:space="preserve">Aplikasi dibangunkan sendiri oleh Kumpulan Inovasi, jadi tiada kos pembangunan. Kos berulang hanya RM13 setahun bagi domain dan RM100 sebulan bagi pelayan, iaitu kira-kira RM3.32 sehari. Borang AMS dan senarai kuota tidak lagi perlu dicetak, dan tiada perkakasan baharu diperlukan kerana sistem dibuka melalui pelayar pada komputer sedia ada.</w:t>
-      </w:r>
+        <w:t xml:space="preserve">Aplikasi dibangunkan sendiri oleh Kumpulan Inovasi, jadi tiada kos pembangunan. Kos berulang hanya RM13 setahun bagi domain dan RM100 sebulan bagi pelayan, iaitu kira-kira RM3.32 sehari. Tiada perkakasan baharu diperlukan kerana sistem dibuka melalui pelayar pada komputer sedia ada. Borang AMS dan senarai kuota juga tidak lagi perlu dicetak. Penjimatan kertas dan toner adalah seperti dalam Jadual 4.</w:t>
+      </w:r>
+    </w:p>
+    <w:p>
+      <w:pPr>
+        <w:keepNext/>
+        <w:spacing w:after="100" w:before="120"/>
+      </w:pPr>
+      <w:r>
+        <w:rPr>
+          <w:rFonts w:ascii="Arial" w:cs="Arial" w:eastAsia="Arial" w:hAnsi="Arial"/>
+          <w:b/>
+          <w:bCs/>
+          <w:sz w:val="24"/>
+          <w:szCs w:val="24"/>
+        </w:rPr>
+        <w:t xml:space="preserve">Jadual 4: Penjimatan kertas dan toner setahun</w:t>
+      </w:r>
+    </w:p>
+    <w:tbl>
+      <w:tblPr>
+        <w:tblW w:type="dxa" w:w="9026"/>
+        <w:tblBorders>
+          <w:top w:val="single" w:color="auto" w:sz="4"/>
+          <w:left w:val="single" w:color="auto" w:sz="4"/>
+          <w:bottom w:val="single" w:color="auto" w:sz="4"/>
+          <w:right w:val="single" w:color="auto" w:sz="4"/>
+          <w:insideH w:val="single" w:color="auto" w:sz="4"/>
+          <w:insideV w:val="single" w:color="auto" w:sz="4"/>
+        </w:tblBorders>
+      </w:tblPr>
+      <w:tblGrid>
+        <w:gridCol w:w="2000"/>
+        <w:gridCol w:w="3426"/>
+        <w:gridCol w:w="1700"/>
+        <w:gridCol w:w="1900"/>
+      </w:tblGrid>
+      <w:tr>
+        <w:trPr>
+          <w:cantSplit/>
+          <w:tblHeader/>
+        </w:trPr>
+        <w:tc>
+          <w:tcPr>
+            <w:tcW w:type="dxa" w:w="2000"/>
+            <w:tcBorders>
+              <w:top w:val="single" w:color="B7C4BF" w:sz="4"/>
+              <w:left w:val="single" w:color="B7C4BF" w:sz="4"/>
+              <w:bottom w:val="single" w:color="B7C4BF" w:sz="4"/>
+              <w:right w:val="single" w:color="B7C4BF" w:sz="4"/>
+            </w:tcBorders>
+            <w:shd w:fill="E3EFEA" w:color="auto" w:val="clear"/>
+            <w:tcMar>
+              <w:top w:type="dxa" w:w="60"/>
+              <w:left w:type="dxa" w:w="100"/>
+              <w:bottom w:type="dxa" w:w="60"/>
+              <w:right w:type="dxa" w:w="100"/>
+            </w:tcMar>
+          </w:tcPr>
+          <w:p>
+            <w:pPr>
+              <w:spacing w:after="0" w:line="276"/>
+            </w:pPr>
+            <w:r>
+              <w:rPr>
+                <w:rFonts w:ascii="Arial" w:cs="Arial" w:eastAsia="Arial" w:hAnsi="Arial"/>
+                <w:b/>
+                <w:bCs/>
+                <w:sz w:val="24"/>
+                <w:szCs w:val="24"/>
+              </w:rPr>
+              <w:t xml:space="preserve">Bahan</w:t>
+            </w:r>
+          </w:p>
+        </w:tc>
+        <w:tc>
+          <w:tcPr>
+            <w:tcW w:type="dxa" w:w="3426"/>
+            <w:tcBorders>
+              <w:top w:val="single" w:color="B7C4BF" w:sz="4"/>
+              <w:left w:val="single" w:color="B7C4BF" w:sz="4"/>
+              <w:bottom w:val="single" w:color="B7C4BF" w:sz="4"/>
+              <w:right w:val="single" w:color="B7C4BF" w:sz="4"/>
+            </w:tcBorders>
+            <w:shd w:fill="E3EFEA" w:color="auto" w:val="clear"/>
+            <w:tcMar>
+              <w:top w:type="dxa" w:w="60"/>
+              <w:left w:type="dxa" w:w="100"/>
+              <w:bottom w:type="dxa" w:w="60"/>
+              <w:right w:type="dxa" w:w="100"/>
+            </w:tcMar>
+          </w:tcPr>
+          <w:p>
+            <w:pPr>
+              <w:spacing w:after="0" w:line="276"/>
+            </w:pPr>
+            <w:r>
+              <w:rPr>
+                <w:rFonts w:ascii="Arial" w:cs="Arial" w:eastAsia="Arial" w:hAnsi="Arial"/>
+                <w:b/>
+                <w:bCs/>
+                <w:sz w:val="24"/>
+                <w:szCs w:val="24"/>
+              </w:rPr>
+              <w:t xml:space="preserve">Penggunaan sebelum inovasi</w:t>
+            </w:r>
+          </w:p>
+        </w:tc>
+        <w:tc>
+          <w:tcPr>
+            <w:tcW w:type="dxa" w:w="1700"/>
+            <w:tcBorders>
+              <w:top w:val="single" w:color="B7C4BF" w:sz="4"/>
+              <w:left w:val="single" w:color="B7C4BF" w:sz="4"/>
+              <w:bottom w:val="single" w:color="B7C4BF" w:sz="4"/>
+              <w:right w:val="single" w:color="B7C4BF" w:sz="4"/>
+            </w:tcBorders>
+            <w:shd w:fill="E3EFEA" w:color="auto" w:val="clear"/>
+            <w:tcMar>
+              <w:top w:type="dxa" w:w="60"/>
+              <w:left w:type="dxa" w:w="100"/>
+              <w:bottom w:type="dxa" w:w="60"/>
+              <w:right w:type="dxa" w:w="100"/>
+            </w:tcMar>
+          </w:tcPr>
+          <w:p>
+            <w:pPr>
+              <w:spacing w:after="0" w:line="276"/>
+            </w:pPr>
+            <w:r>
+              <w:rPr>
+                <w:rFonts w:ascii="Arial" w:cs="Arial" w:eastAsia="Arial" w:hAnsi="Arial"/>
+                <w:b/>
+                <w:bCs/>
+                <w:sz w:val="24"/>
+                <w:szCs w:val="24"/>
+              </w:rPr>
+              <w:t xml:space="preserve">Harga seunit</w:t>
+            </w:r>
+          </w:p>
+        </w:tc>
+        <w:tc>
+          <w:tcPr>
+            <w:tcW w:type="dxa" w:w="1900"/>
+            <w:tcBorders>
+              <w:top w:val="single" w:color="B7C4BF" w:sz="4"/>
+              <w:left w:val="single" w:color="B7C4BF" w:sz="4"/>
+              <w:bottom w:val="single" w:color="B7C4BF" w:sz="4"/>
+              <w:right w:val="single" w:color="B7C4BF" w:sz="4"/>
+            </w:tcBorders>
+            <w:shd w:fill="E3EFEA" w:color="auto" w:val="clear"/>
+            <w:tcMar>
+              <w:top w:type="dxa" w:w="60"/>
+              <w:left w:type="dxa" w:w="100"/>
+              <w:bottom w:type="dxa" w:w="60"/>
+              <w:right w:type="dxa" w:w="100"/>
+            </w:tcMar>
+          </w:tcPr>
+          <w:p>
+            <w:pPr>
+              <w:spacing w:after="0" w:line="276"/>
+            </w:pPr>
+            <w:r>
+              <w:rPr>
+                <w:rFonts w:ascii="Arial" w:cs="Arial" w:eastAsia="Arial" w:hAnsi="Arial"/>
+                <w:b/>
+                <w:bCs/>
+                <w:sz w:val="24"/>
+                <w:szCs w:val="24"/>
+              </w:rPr>
+              <w:t xml:space="preserve">Kos setahun</w:t>
+            </w:r>
+          </w:p>
+        </w:tc>
+      </w:tr>
+      <w:tr>
+        <w:trPr>
+          <w:cantSplit/>
+          <w:tblHeader w:val="off"/>
+        </w:trPr>
+        <w:tc>
+          <w:tcPr>
+            <w:tcW w:type="dxa" w:w="2000"/>
+            <w:tcBorders>
+              <w:top w:val="single" w:color="B7C4BF" w:sz="4"/>
+              <w:left w:val="single" w:color="B7C4BF" w:sz="4"/>
+              <w:bottom w:val="single" w:color="B7C4BF" w:sz="4"/>
+              <w:right w:val="single" w:color="B7C4BF" w:sz="4"/>
+            </w:tcBorders>
+            <w:tcMar>
+              <w:top w:type="dxa" w:w="60"/>
+              <w:left w:type="dxa" w:w="100"/>
+              <w:bottom w:type="dxa" w:w="60"/>
+              <w:right w:type="dxa" w:w="100"/>
+            </w:tcMar>
+          </w:tcPr>
+          <w:p>
+            <w:pPr>
+              <w:spacing w:after="0" w:line="276"/>
+            </w:pPr>
+            <w:r>
+              <w:rPr>
+                <w:rFonts w:ascii="Arial" w:cs="Arial" w:eastAsia="Arial" w:hAnsi="Arial"/>
+                <w:sz w:val="24"/>
+                <w:szCs w:val="24"/>
+              </w:rPr>
+              <w:t xml:space="preserve">Toner pencetak</w:t>
+            </w:r>
+          </w:p>
+        </w:tc>
+        <w:tc>
+          <w:tcPr>
+            <w:tcW w:type="dxa" w:w="3426"/>
+            <w:tcBorders>
+              <w:top w:val="single" w:color="B7C4BF" w:sz="4"/>
+              <w:left w:val="single" w:color="B7C4BF" w:sz="4"/>
+              <w:bottom w:val="single" w:color="B7C4BF" w:sz="4"/>
+              <w:right w:val="single" w:color="B7C4BF" w:sz="4"/>
+            </w:tcBorders>
+            <w:tcMar>
+              <w:top w:type="dxa" w:w="60"/>
+              <w:left w:type="dxa" w:w="100"/>
+              <w:bottom w:type="dxa" w:w="60"/>
+              <w:right w:type="dxa" w:w="100"/>
+            </w:tcMar>
+          </w:tcPr>
+          <w:p>
+            <w:pPr>
+              <w:spacing w:after="0" w:line="276"/>
+            </w:pPr>
+            <w:r>
+              <w:rPr>
+                <w:rFonts w:ascii="Arial" w:cs="Arial" w:eastAsia="Arial" w:hAnsi="Arial"/>
+                <w:sz w:val="24"/>
+                <w:szCs w:val="24"/>
+              </w:rPr>
+              <w:t xml:space="preserve">1 unit setiap 3 bulan (4 unit setahun)</w:t>
+            </w:r>
+          </w:p>
+        </w:tc>
+        <w:tc>
+          <w:tcPr>
+            <w:tcW w:type="dxa" w:w="1700"/>
+            <w:tcBorders>
+              <w:top w:val="single" w:color="B7C4BF" w:sz="4"/>
+              <w:left w:val="single" w:color="B7C4BF" w:sz="4"/>
+              <w:bottom w:val="single" w:color="B7C4BF" w:sz="4"/>
+              <w:right w:val="single" w:color="B7C4BF" w:sz="4"/>
+            </w:tcBorders>
+            <w:tcMar>
+              <w:top w:type="dxa" w:w="60"/>
+              <w:left w:type="dxa" w:w="100"/>
+              <w:bottom w:type="dxa" w:w="60"/>
+              <w:right w:type="dxa" w:w="100"/>
+            </w:tcMar>
+          </w:tcPr>
+          <w:p>
+            <w:pPr>
+              <w:spacing w:after="0" w:line="276"/>
+            </w:pPr>
+            <w:r>
+              <w:rPr>
+                <w:rFonts w:ascii="Arial" w:cs="Arial" w:eastAsia="Arial" w:hAnsi="Arial"/>
+                <w:sz w:val="24"/>
+                <w:szCs w:val="24"/>
+              </w:rPr>
+              <w:t xml:space="preserve">RM800.00</w:t>
+            </w:r>
+          </w:p>
+        </w:tc>
+        <w:tc>
+          <w:tcPr>
+            <w:tcW w:type="dxa" w:w="1900"/>
+            <w:tcBorders>
+              <w:top w:val="single" w:color="B7C4BF" w:sz="4"/>
+              <w:left w:val="single" w:color="B7C4BF" w:sz="4"/>
+              <w:bottom w:val="single" w:color="B7C4BF" w:sz="4"/>
+              <w:right w:val="single" w:color="B7C4BF" w:sz="4"/>
+            </w:tcBorders>
+            <w:tcMar>
+              <w:top w:type="dxa" w:w="60"/>
+              <w:left w:type="dxa" w:w="100"/>
+              <w:bottom w:type="dxa" w:w="60"/>
+              <w:right w:type="dxa" w:w="100"/>
+            </w:tcMar>
+          </w:tcPr>
+          <w:p>
+            <w:pPr>
+              <w:spacing w:after="0" w:line="276"/>
+            </w:pPr>
+            <w:r>
+              <w:rPr>
+                <w:rFonts w:ascii="Arial" w:cs="Arial" w:eastAsia="Arial" w:hAnsi="Arial"/>
+                <w:sz w:val="24"/>
+                <w:szCs w:val="24"/>
+              </w:rPr>
+              <w:t xml:space="preserve">RM3,200.00</w:t>
+            </w:r>
+          </w:p>
+        </w:tc>
+      </w:tr>
+      <w:tr>
+        <w:trPr>
+          <w:cantSplit/>
+          <w:tblHeader w:val="off"/>
+        </w:trPr>
+        <w:tc>
+          <w:tcPr>
+            <w:tcW w:type="dxa" w:w="2000"/>
+            <w:tcBorders>
+              <w:top w:val="single" w:color="B7C4BF" w:sz="4"/>
+              <w:left w:val="single" w:color="B7C4BF" w:sz="4"/>
+              <w:bottom w:val="single" w:color="B7C4BF" w:sz="4"/>
+              <w:right w:val="single" w:color="B7C4BF" w:sz="4"/>
+            </w:tcBorders>
+            <w:tcMar>
+              <w:top w:type="dxa" w:w="60"/>
+              <w:left w:type="dxa" w:w="100"/>
+              <w:bottom w:type="dxa" w:w="60"/>
+              <w:right w:type="dxa" w:w="100"/>
+            </w:tcMar>
+          </w:tcPr>
+          <w:p>
+            <w:pPr>
+              <w:spacing w:after="0" w:line="276"/>
+            </w:pPr>
+            <w:r>
+              <w:rPr>
+                <w:rFonts w:ascii="Arial" w:cs="Arial" w:eastAsia="Arial" w:hAnsi="Arial"/>
+                <w:sz w:val="24"/>
+                <w:szCs w:val="24"/>
+              </w:rPr>
+              <w:t xml:space="preserve">Kertas A4</w:t>
+            </w:r>
+          </w:p>
+        </w:tc>
+        <w:tc>
+          <w:tcPr>
+            <w:tcW w:type="dxa" w:w="3426"/>
+            <w:tcBorders>
+              <w:top w:val="single" w:color="B7C4BF" w:sz="4"/>
+              <w:left w:val="single" w:color="B7C4BF" w:sz="4"/>
+              <w:bottom w:val="single" w:color="B7C4BF" w:sz="4"/>
+              <w:right w:val="single" w:color="B7C4BF" w:sz="4"/>
+            </w:tcBorders>
+            <w:tcMar>
+              <w:top w:type="dxa" w:w="60"/>
+              <w:left w:type="dxa" w:w="100"/>
+              <w:bottom w:type="dxa" w:w="60"/>
+              <w:right w:type="dxa" w:w="100"/>
+            </w:tcMar>
+          </w:tcPr>
+          <w:p>
+            <w:pPr>
+              <w:spacing w:after="0" w:line="276"/>
+            </w:pPr>
+            <w:r>
+              <w:rPr>
+                <w:rFonts w:ascii="Arial" w:cs="Arial" w:eastAsia="Arial" w:hAnsi="Arial"/>
+                <w:sz w:val="24"/>
+                <w:szCs w:val="24"/>
+              </w:rPr>
+              <w:t xml:space="preserve">1 rim setiap 2 bulan (6 rim setahun)</w:t>
+            </w:r>
+          </w:p>
+        </w:tc>
+        <w:tc>
+          <w:tcPr>
+            <w:tcW w:type="dxa" w:w="1700"/>
+            <w:tcBorders>
+              <w:top w:val="single" w:color="B7C4BF" w:sz="4"/>
+              <w:left w:val="single" w:color="B7C4BF" w:sz="4"/>
+              <w:bottom w:val="single" w:color="B7C4BF" w:sz="4"/>
+              <w:right w:val="single" w:color="B7C4BF" w:sz="4"/>
+            </w:tcBorders>
+            <w:tcMar>
+              <w:top w:type="dxa" w:w="60"/>
+              <w:left w:type="dxa" w:w="100"/>
+              <w:bottom w:type="dxa" w:w="60"/>
+              <w:right w:type="dxa" w:w="100"/>
+            </w:tcMar>
+          </w:tcPr>
+          <w:p>
+            <w:pPr>
+              <w:spacing w:after="0" w:line="276"/>
+            </w:pPr>
+            <w:r>
+              <w:rPr>
+                <w:rFonts w:ascii="Arial" w:cs="Arial" w:eastAsia="Arial" w:hAnsi="Arial"/>
+                <w:sz w:val="24"/>
+                <w:szCs w:val="24"/>
+              </w:rPr>
+              <w:t xml:space="preserve">RM12.90</w:t>
+            </w:r>
+          </w:p>
+        </w:tc>
+        <w:tc>
+          <w:tcPr>
+            <w:tcW w:type="dxa" w:w="1900"/>
+            <w:tcBorders>
+              <w:top w:val="single" w:color="B7C4BF" w:sz="4"/>
+              <w:left w:val="single" w:color="B7C4BF" w:sz="4"/>
+              <w:bottom w:val="single" w:color="B7C4BF" w:sz="4"/>
+              <w:right w:val="single" w:color="B7C4BF" w:sz="4"/>
+            </w:tcBorders>
+            <w:tcMar>
+              <w:top w:type="dxa" w:w="60"/>
+              <w:left w:type="dxa" w:w="100"/>
+              <w:bottom w:type="dxa" w:w="60"/>
+              <w:right w:type="dxa" w:w="100"/>
+            </w:tcMar>
+          </w:tcPr>
+          <w:p>
+            <w:pPr>
+              <w:spacing w:after="0" w:line="276"/>
+            </w:pPr>
+            <w:r>
+              <w:rPr>
+                <w:rFonts w:ascii="Arial" w:cs="Arial" w:eastAsia="Arial" w:hAnsi="Arial"/>
+                <w:sz w:val="24"/>
+                <w:szCs w:val="24"/>
+              </w:rPr>
+              <w:t xml:space="preserve">RM77.40</w:t>
+            </w:r>
+          </w:p>
+        </w:tc>
+      </w:tr>
+      <w:tr>
+        <w:trPr>
+          <w:cantSplit/>
+          <w:tblHeader w:val="off"/>
+        </w:trPr>
+        <w:tc>
+          <w:tcPr>
+            <w:tcW w:type="dxa" w:w="2000"/>
+            <w:tcBorders>
+              <w:top w:val="single" w:color="B7C4BF" w:sz="4"/>
+              <w:left w:val="single" w:color="B7C4BF" w:sz="4"/>
+              <w:bottom w:val="single" w:color="B7C4BF" w:sz="4"/>
+              <w:right w:val="single" w:color="B7C4BF" w:sz="4"/>
+            </w:tcBorders>
+            <w:tcMar>
+              <w:top w:type="dxa" w:w="60"/>
+              <w:left w:type="dxa" w:w="100"/>
+              <w:bottom w:type="dxa" w:w="60"/>
+              <w:right w:type="dxa" w:w="100"/>
+            </w:tcMar>
+          </w:tcPr>
+          <w:p>
+            <w:pPr>
+              <w:spacing w:after="0" w:line="276"/>
+            </w:pPr>
+            <w:r>
+              <w:rPr>
+                <w:rFonts w:ascii="Arial" w:cs="Arial" w:eastAsia="Arial" w:hAnsi="Arial"/>
+                <w:b/>
+                <w:bCs/>
+                <w:sz w:val="24"/>
+                <w:szCs w:val="24"/>
+              </w:rPr>
+              <w:t xml:space="preserve">Jumlah penjimatan</w:t>
+            </w:r>
+          </w:p>
+        </w:tc>
+        <w:tc>
+          <w:tcPr>
+            <w:tcW w:type="dxa" w:w="3426"/>
+            <w:tcBorders>
+              <w:top w:val="single" w:color="B7C4BF" w:sz="4"/>
+              <w:left w:val="single" w:color="B7C4BF" w:sz="4"/>
+              <w:bottom w:val="single" w:color="B7C4BF" w:sz="4"/>
+              <w:right w:val="single" w:color="B7C4BF" w:sz="4"/>
+            </w:tcBorders>
+            <w:tcMar>
+              <w:top w:type="dxa" w:w="60"/>
+              <w:left w:type="dxa" w:w="100"/>
+              <w:bottom w:type="dxa" w:w="60"/>
+              <w:right w:type="dxa" w:w="100"/>
+            </w:tcMar>
+          </w:tcPr>
+          <w:p>
+            <w:pPr>
+              <w:spacing w:after="0" w:line="276"/>
+            </w:pPr>
+          </w:p>
+        </w:tc>
+        <w:tc>
+          <w:tcPr>
+            <w:tcW w:type="dxa" w:w="1700"/>
+            <w:tcBorders>
+              <w:top w:val="single" w:color="B7C4BF" w:sz="4"/>
+              <w:left w:val="single" w:color="B7C4BF" w:sz="4"/>
+              <w:bottom w:val="single" w:color="B7C4BF" w:sz="4"/>
+              <w:right w:val="single" w:color="B7C4BF" w:sz="4"/>
+            </w:tcBorders>
+            <w:tcMar>
+              <w:top w:type="dxa" w:w="60"/>
+              <w:left w:type="dxa" w:w="100"/>
+              <w:bottom w:type="dxa" w:w="60"/>
+              <w:right w:type="dxa" w:w="100"/>
+            </w:tcMar>
+          </w:tcPr>
+          <w:p>
+            <w:pPr>
+              <w:spacing w:after="0" w:line="276"/>
+            </w:pPr>
+          </w:p>
+        </w:tc>
+        <w:tc>
+          <w:tcPr>
+            <w:tcW w:type="dxa" w:w="1900"/>
+            <w:tcBorders>
+              <w:top w:val="single" w:color="B7C4BF" w:sz="4"/>
+              <w:left w:val="single" w:color="B7C4BF" w:sz="4"/>
+              <w:bottom w:val="single" w:color="B7C4BF" w:sz="4"/>
+              <w:right w:val="single" w:color="B7C4BF" w:sz="4"/>
+            </w:tcBorders>
+            <w:tcMar>
+              <w:top w:type="dxa" w:w="60"/>
+              <w:left w:type="dxa" w:w="100"/>
+              <w:bottom w:type="dxa" w:w="60"/>
+              <w:right w:type="dxa" w:w="100"/>
+            </w:tcMar>
+          </w:tcPr>
+          <w:p>
+            <w:pPr>
+              <w:spacing w:after="0" w:line="276"/>
+            </w:pPr>
+            <w:r>
+              <w:rPr>
+                <w:rFonts w:ascii="Arial" w:cs="Arial" w:eastAsia="Arial" w:hAnsi="Arial"/>
+                <w:b/>
+                <w:bCs/>
+                <w:sz w:val="24"/>
+                <w:szCs w:val="24"/>
+              </w:rPr>
+              <w:t xml:space="preserve">RM3,277.40</w:t>
+            </w:r>
+          </w:p>
+        </w:tc>
+      </w:tr>
+    </w:tbl>
+    <w:p>
+      <w:pPr>
+        <w:spacing w:after="120"/>
+      </w:pPr>
     </w:p>
     <w:p>
       <w:pPr>
         <w:spacing w:after="160" w:line="360"/>
-        <w:ind w:left="360"/>
-      </w:pPr>
-      <w:r>
-        <w:rPr>
-          <w:rFonts w:ascii="Arial" w:cs="Arial" w:eastAsia="Arial" w:hAnsi="Arial"/>
-          <w:i/>
-          <w:iCs/>
-          <w:color w:val="A33A0C"/>
-          <w:sz w:val="24"/>
-          <w:szCs w:val="24"/>
-        </w:rPr>
-        <w:t xml:space="preserve">[ISI] Nyatakan penjimatan kertas A4 dan toner setahun dalam Ringgit Malaysia daripada rekod Stor.</w:t>
+        <w:jc w:val="both"/>
+      </w:pPr>
+      <w:r>
+        <w:rPr>
+          <w:rFonts w:ascii="Arial" w:cs="Arial" w:eastAsia="Arial" w:hAnsi="Arial"/>
+          <w:sz w:val="24"/>
+          <w:szCs w:val="24"/>
+        </w:rPr>
+        <w:t xml:space="preserve">Selepas ditolak kos operasi PharmaSync sebanyak RM1,213 setahun (domain RM13 dan pelayan RM1,200), klinik menjimatkan </w:t>
+      </w:r>
+      <w:r>
+        <w:rPr>
+          <w:rFonts w:ascii="Arial" w:cs="Arial" w:eastAsia="Arial" w:hAnsi="Arial"/>
+          <w:b/>
+          <w:bCs/>
+          <w:sz w:val="24"/>
+          <w:szCs w:val="24"/>
+        </w:rPr>
+        <w:t xml:space="preserve">RM2,064.40 setahun</w:t>
+      </w:r>
+      <w:r>
+        <w:rPr>
+          <w:rFonts w:ascii="Arial" w:cs="Arial" w:eastAsia="Arial" w:hAnsi="Arial"/>
+          <w:sz w:val="24"/>
+          <w:szCs w:val="24"/>
+        </w:rPr>
+        <w:t xml:space="preserve">.</w:t>
       </w:r>
     </w:p>
     <w:p>
@@ -4073,7 +4632,7 @@
           <w:sz w:val="24"/>
           <w:szCs w:val="24"/>
         </w:rPr>
-        <w:t xml:space="preserve"> Tiada kos pembangunan dan tiada perkakasan baharu; kos operasi kira-kira RM3.32 sehari.</w:t>
+        <w:t xml:space="preserve"> Tiada kos pembangunan dan tiada perkakasan baharu. Kertas dan toner bernilai RM3,277.40 setahun dijimatkan; selepas ditolak kos operasi RM1,213 setahun, penjimatan bersih ialah RM2,064.40 setahun (Jadual 4).</w:t>
       </w:r>
     </w:p>
     <w:p>

</xml_diff>

<commit_message>
Refocus KIJS report on UKK quota, digital ABX form and AI dose suggestion
Drop the drug stock feature from the report. Expand the three headline
features in section 1, add a dose row to Jadual 3 and the dose
suggestion to objectives, benefits, section 3 and the conclusion.
Tighter paragraph and heading spacing, two-column acronym table and no
page break before Rujukan keep the report at 15 pages.

Co-Authored-By: Claude Fable 5.1 <noreply@anthropic.com>
Claude-Session: https://claude.ai/code/session_01MAcNfHd5W4h5KoFbAUasoU
</commit_message>
<xml_diff>
--- a/Laporan_Projek_Inovasi_PharmaSync_8.docx
+++ b/Laporan_Projek_Inovasi_PharmaSync_8.docx
@@ -120,7 +120,7 @@
     </w:p>
     <w:p>
       <w:pPr>
-        <w:spacing w:after="160" w:line="360"/>
+        <w:spacing w:after="100" w:line="360"/>
         <w:jc w:val="both"/>
       </w:pPr>
       <w:r>
@@ -134,7 +134,7 @@
     </w:p>
     <w:p>
       <w:pPr>
-        <w:spacing w:after="160" w:line="360"/>
+        <w:spacing w:after="100" w:line="360"/>
         <w:jc w:val="both"/>
       </w:pPr>
       <w:r>
@@ -143,12 +143,12 @@
           <w:sz w:val="24"/>
           <w:szCs w:val="24"/>
         </w:rPr>
-        <w:t xml:space="preserve">Inovasi ini dihasilkan oleh Unit Farmasi klinik. Unit ini mempunyai empat fungsi teras, iaitu pengurusan stok ubat, pemprosesan permohonan ubat daripada pegawai perubatan, kelulusan Ubat Kawalan Khusus (UKK) oleh Pakar Perubatan Keluarga (FMS) dan kelulusan antibiotik terkawal mengikut Clinical Pathway National Antimicrobial Guideline (NAG) 2024, serta pendispensan ubat kepada pesakit.</w:t>
-      </w:r>
-    </w:p>
-    <w:p>
-      <w:pPr>
-        <w:spacing w:after="160" w:line="360"/>
+        <w:t xml:space="preserve">Inovasi ini dihasilkan oleh Unit Farmasi klinik. Unit ini mempunyai tiga fungsi teras, iaitu pemprosesan permohonan ubat daripada pegawai perubatan, kelulusan Ubat Kawalan Khusus (UKK) oleh Pakar Perubatan Keluarga (FMS) dan kelulusan antibiotik terkawal mengikut Clinical Pathway National Antimicrobial Guideline (NAG) 2024, serta pendispensan ubat kepada pesakit.</w:t>
+      </w:r>
+    </w:p>
+    <w:p>
+      <w:pPr>
+        <w:spacing w:after="100" w:line="360"/>
         <w:jc w:val="both"/>
       </w:pPr>
       <w:r>
@@ -210,15 +210,16 @@
             </w:tcBorders>
             <w:shd w:fill="E3EFEA" w:color="auto" w:val="clear"/>
             <w:tcMar>
-              <w:top w:type="dxa" w:w="60"/>
-              <w:left w:type="dxa" w:w="100"/>
-              <w:bottom w:type="dxa" w:w="60"/>
-              <w:right w:type="dxa" w:w="100"/>
-            </w:tcMar>
-          </w:tcPr>
-          <w:p>
-            <w:pPr>
-              <w:spacing w:after="0" w:line="276"/>
+              <w:top w:type="dxa" w:w="40"/>
+              <w:left w:type="dxa" w:w="100"/>
+              <w:bottom w:type="dxa" w:w="40"/>
+              <w:right w:type="dxa" w:w="100"/>
+            </w:tcMar>
+          </w:tcPr>
+          <w:p>
+            <w:pPr>
+              <w:keepNext w:val="false"/>
+              <w:spacing w:after="0" w:line="264"/>
             </w:pPr>
             <w:r>
               <w:rPr>
@@ -243,15 +244,16 @@
             </w:tcBorders>
             <w:shd w:fill="E3EFEA" w:color="auto" w:val="clear"/>
             <w:tcMar>
-              <w:top w:type="dxa" w:w="60"/>
-              <w:left w:type="dxa" w:w="100"/>
-              <w:bottom w:type="dxa" w:w="60"/>
-              <w:right w:type="dxa" w:w="100"/>
-            </w:tcMar>
-          </w:tcPr>
-          <w:p>
-            <w:pPr>
-              <w:spacing w:after="0" w:line="276"/>
+              <w:top w:type="dxa" w:w="40"/>
+              <w:left w:type="dxa" w:w="100"/>
+              <w:bottom w:type="dxa" w:w="40"/>
+              <w:right w:type="dxa" w:w="100"/>
+            </w:tcMar>
+          </w:tcPr>
+          <w:p>
+            <w:pPr>
+              <w:keepNext w:val="false"/>
+              <w:spacing w:after="0" w:line="264"/>
             </w:pPr>
             <w:r>
               <w:rPr>
@@ -276,15 +278,16 @@
             </w:tcBorders>
             <w:shd w:fill="E3EFEA" w:color="auto" w:val="clear"/>
             <w:tcMar>
-              <w:top w:type="dxa" w:w="60"/>
-              <w:left w:type="dxa" w:w="100"/>
-              <w:bottom w:type="dxa" w:w="60"/>
-              <w:right w:type="dxa" w:w="100"/>
-            </w:tcMar>
-          </w:tcPr>
-          <w:p>
-            <w:pPr>
-              <w:spacing w:after="0" w:line="276"/>
+              <w:top w:type="dxa" w:w="40"/>
+              <w:left w:type="dxa" w:w="100"/>
+              <w:bottom w:type="dxa" w:w="40"/>
+              <w:right w:type="dxa" w:w="100"/>
+            </w:tcMar>
+          </w:tcPr>
+          <w:p>
+            <w:pPr>
+              <w:keepNext w:val="false"/>
+              <w:spacing w:after="0" w:line="264"/>
             </w:pPr>
             <w:r>
               <w:rPr>
@@ -309,15 +312,16 @@
             </w:tcBorders>
             <w:shd w:fill="E3EFEA" w:color="auto" w:val="clear"/>
             <w:tcMar>
-              <w:top w:type="dxa" w:w="60"/>
-              <w:left w:type="dxa" w:w="100"/>
-              <w:bottom w:type="dxa" w:w="60"/>
-              <w:right w:type="dxa" w:w="100"/>
-            </w:tcMar>
-          </w:tcPr>
-          <w:p>
-            <w:pPr>
-              <w:spacing w:after="0" w:line="276"/>
+              <w:top w:type="dxa" w:w="40"/>
+              <w:left w:type="dxa" w:w="100"/>
+              <w:bottom w:type="dxa" w:w="40"/>
+              <w:right w:type="dxa" w:w="100"/>
+            </w:tcMar>
+          </w:tcPr>
+          <w:p>
+            <w:pPr>
+              <w:keepNext w:val="false"/>
+              <w:spacing w:after="0" w:line="264"/>
             </w:pPr>
             <w:r>
               <w:rPr>
@@ -347,15 +351,16 @@
               <w:right w:val="single" w:color="B7C4BF" w:sz="4"/>
             </w:tcBorders>
             <w:tcMar>
-              <w:top w:type="dxa" w:w="60"/>
-              <w:left w:type="dxa" w:w="100"/>
-              <w:bottom w:type="dxa" w:w="60"/>
-              <w:right w:type="dxa" w:w="100"/>
-            </w:tcMar>
-          </w:tcPr>
-          <w:p>
-            <w:pPr>
-              <w:spacing w:after="0" w:line="276"/>
+              <w:top w:type="dxa" w:w="40"/>
+              <w:left w:type="dxa" w:w="100"/>
+              <w:bottom w:type="dxa" w:w="40"/>
+              <w:right w:type="dxa" w:w="100"/>
+            </w:tcMar>
+          </w:tcPr>
+          <w:p>
+            <w:pPr>
+              <w:keepNext w:val="false"/>
+              <w:spacing w:after="0" w:line="264"/>
             </w:pPr>
             <w:r>
               <w:rPr>
@@ -377,15 +382,16 @@
               <w:right w:val="single" w:color="B7C4BF" w:sz="4"/>
             </w:tcBorders>
             <w:tcMar>
-              <w:top w:type="dxa" w:w="60"/>
-              <w:left w:type="dxa" w:w="100"/>
-              <w:bottom w:type="dxa" w:w="60"/>
-              <w:right w:type="dxa" w:w="100"/>
-            </w:tcMar>
-          </w:tcPr>
-          <w:p>
-            <w:pPr>
-              <w:spacing w:after="0" w:line="276"/>
+              <w:top w:type="dxa" w:w="40"/>
+              <w:left w:type="dxa" w:w="100"/>
+              <w:bottom w:type="dxa" w:w="40"/>
+              <w:right w:type="dxa" w:w="100"/>
+            </w:tcMar>
+          </w:tcPr>
+          <w:p>
+            <w:pPr>
+              <w:keepNext w:val="false"/>
+              <w:spacing w:after="0" w:line="264"/>
             </w:pPr>
             <w:r>
               <w:rPr>
@@ -407,15 +413,16 @@
               <w:right w:val="single" w:color="B7C4BF" w:sz="4"/>
             </w:tcBorders>
             <w:tcMar>
-              <w:top w:type="dxa" w:w="60"/>
-              <w:left w:type="dxa" w:w="100"/>
-              <w:bottom w:type="dxa" w:w="60"/>
-              <w:right w:type="dxa" w:w="100"/>
-            </w:tcMar>
-          </w:tcPr>
-          <w:p>
-            <w:pPr>
-              <w:spacing w:after="0" w:line="276"/>
+              <w:top w:type="dxa" w:w="40"/>
+              <w:left w:type="dxa" w:w="100"/>
+              <w:bottom w:type="dxa" w:w="40"/>
+              <w:right w:type="dxa" w:w="100"/>
+            </w:tcMar>
+          </w:tcPr>
+          <w:p>
+            <w:pPr>
+              <w:keepNext w:val="false"/>
+              <w:spacing w:after="0" w:line="264"/>
             </w:pPr>
             <w:r>
               <w:rPr>
@@ -437,15 +444,16 @@
               <w:right w:val="single" w:color="B7C4BF" w:sz="4"/>
             </w:tcBorders>
             <w:tcMar>
-              <w:top w:type="dxa" w:w="60"/>
-              <w:left w:type="dxa" w:w="100"/>
-              <w:bottom w:type="dxa" w:w="60"/>
-              <w:right w:type="dxa" w:w="100"/>
-            </w:tcMar>
-          </w:tcPr>
-          <w:p>
-            <w:pPr>
-              <w:spacing w:after="0" w:line="276"/>
+              <w:top w:type="dxa" w:w="40"/>
+              <w:left w:type="dxa" w:w="100"/>
+              <w:bottom w:type="dxa" w:w="40"/>
+              <w:right w:type="dxa" w:w="100"/>
+            </w:tcMar>
+          </w:tcPr>
+          <w:p>
+            <w:pPr>
+              <w:keepNext w:val="false"/>
+              <w:spacing w:after="0" w:line="264"/>
             </w:pPr>
             <w:r>
               <w:rPr>
@@ -473,15 +481,16 @@
               <w:right w:val="single" w:color="B7C4BF" w:sz="4"/>
             </w:tcBorders>
             <w:tcMar>
-              <w:top w:type="dxa" w:w="60"/>
-              <w:left w:type="dxa" w:w="100"/>
-              <w:bottom w:type="dxa" w:w="60"/>
-              <w:right w:type="dxa" w:w="100"/>
-            </w:tcMar>
-          </w:tcPr>
-          <w:p>
-            <w:pPr>
-              <w:spacing w:after="0" w:line="276"/>
+              <w:top w:type="dxa" w:w="40"/>
+              <w:left w:type="dxa" w:w="100"/>
+              <w:bottom w:type="dxa" w:w="40"/>
+              <w:right w:type="dxa" w:w="100"/>
+            </w:tcMar>
+          </w:tcPr>
+          <w:p>
+            <w:pPr>
+              <w:keepNext w:val="false"/>
+              <w:spacing w:after="0" w:line="264"/>
             </w:pPr>
             <w:r>
               <w:rPr>
@@ -503,15 +512,16 @@
               <w:right w:val="single" w:color="B7C4BF" w:sz="4"/>
             </w:tcBorders>
             <w:tcMar>
-              <w:top w:type="dxa" w:w="60"/>
-              <w:left w:type="dxa" w:w="100"/>
-              <w:bottom w:type="dxa" w:w="60"/>
-              <w:right w:type="dxa" w:w="100"/>
-            </w:tcMar>
-          </w:tcPr>
-          <w:p>
-            <w:pPr>
-              <w:spacing w:after="0" w:line="276"/>
+              <w:top w:type="dxa" w:w="40"/>
+              <w:left w:type="dxa" w:w="100"/>
+              <w:bottom w:type="dxa" w:w="40"/>
+              <w:right w:type="dxa" w:w="100"/>
+            </w:tcMar>
+          </w:tcPr>
+          <w:p>
+            <w:pPr>
+              <w:keepNext w:val="false"/>
+              <w:spacing w:after="0" w:line="264"/>
             </w:pPr>
             <w:r>
               <w:rPr>
@@ -533,15 +543,16 @@
               <w:right w:val="single" w:color="B7C4BF" w:sz="4"/>
             </w:tcBorders>
             <w:tcMar>
-              <w:top w:type="dxa" w:w="60"/>
-              <w:left w:type="dxa" w:w="100"/>
-              <w:bottom w:type="dxa" w:w="60"/>
-              <w:right w:type="dxa" w:w="100"/>
-            </w:tcMar>
-          </w:tcPr>
-          <w:p>
-            <w:pPr>
-              <w:spacing w:after="0" w:line="276"/>
+              <w:top w:type="dxa" w:w="40"/>
+              <w:left w:type="dxa" w:w="100"/>
+              <w:bottom w:type="dxa" w:w="40"/>
+              <w:right w:type="dxa" w:w="100"/>
+            </w:tcMar>
+          </w:tcPr>
+          <w:p>
+            <w:pPr>
+              <w:keepNext w:val="false"/>
+              <w:spacing w:after="0" w:line="264"/>
             </w:pPr>
             <w:r>
               <w:rPr>
@@ -563,15 +574,16 @@
               <w:right w:val="single" w:color="B7C4BF" w:sz="4"/>
             </w:tcBorders>
             <w:tcMar>
-              <w:top w:type="dxa" w:w="60"/>
-              <w:left w:type="dxa" w:w="100"/>
-              <w:bottom w:type="dxa" w:w="60"/>
-              <w:right w:type="dxa" w:w="100"/>
-            </w:tcMar>
-          </w:tcPr>
-          <w:p>
-            <w:pPr>
-              <w:spacing w:after="0" w:line="276"/>
+              <w:top w:type="dxa" w:w="40"/>
+              <w:left w:type="dxa" w:w="100"/>
+              <w:bottom w:type="dxa" w:w="40"/>
+              <w:right w:type="dxa" w:w="100"/>
+            </w:tcMar>
+          </w:tcPr>
+          <w:p>
+            <w:pPr>
+              <w:keepNext w:val="false"/>
+              <w:spacing w:after="0" w:line="264"/>
             </w:pPr>
             <w:r>
               <w:rPr>
@@ -599,15 +611,16 @@
               <w:right w:val="single" w:color="B7C4BF" w:sz="4"/>
             </w:tcBorders>
             <w:tcMar>
-              <w:top w:type="dxa" w:w="60"/>
-              <w:left w:type="dxa" w:w="100"/>
-              <w:bottom w:type="dxa" w:w="60"/>
-              <w:right w:type="dxa" w:w="100"/>
-            </w:tcMar>
-          </w:tcPr>
-          <w:p>
-            <w:pPr>
-              <w:spacing w:after="0" w:line="276"/>
+              <w:top w:type="dxa" w:w="40"/>
+              <w:left w:type="dxa" w:w="100"/>
+              <w:bottom w:type="dxa" w:w="40"/>
+              <w:right w:type="dxa" w:w="100"/>
+            </w:tcMar>
+          </w:tcPr>
+          <w:p>
+            <w:pPr>
+              <w:keepNext w:val="false"/>
+              <w:spacing w:after="0" w:line="264"/>
             </w:pPr>
             <w:r>
               <w:rPr>
@@ -629,15 +642,16 @@
               <w:right w:val="single" w:color="B7C4BF" w:sz="4"/>
             </w:tcBorders>
             <w:tcMar>
-              <w:top w:type="dxa" w:w="60"/>
-              <w:left w:type="dxa" w:w="100"/>
-              <w:bottom w:type="dxa" w:w="60"/>
-              <w:right w:type="dxa" w:w="100"/>
-            </w:tcMar>
-          </w:tcPr>
-          <w:p>
-            <w:pPr>
-              <w:spacing w:after="0" w:line="276"/>
+              <w:top w:type="dxa" w:w="40"/>
+              <w:left w:type="dxa" w:w="100"/>
+              <w:bottom w:type="dxa" w:w="40"/>
+              <w:right w:type="dxa" w:w="100"/>
+            </w:tcMar>
+          </w:tcPr>
+          <w:p>
+            <w:pPr>
+              <w:keepNext w:val="false"/>
+              <w:spacing w:after="0" w:line="264"/>
             </w:pPr>
             <w:r>
               <w:rPr>
@@ -659,15 +673,16 @@
               <w:right w:val="single" w:color="B7C4BF" w:sz="4"/>
             </w:tcBorders>
             <w:tcMar>
-              <w:top w:type="dxa" w:w="60"/>
-              <w:left w:type="dxa" w:w="100"/>
-              <w:bottom w:type="dxa" w:w="60"/>
-              <w:right w:type="dxa" w:w="100"/>
-            </w:tcMar>
-          </w:tcPr>
-          <w:p>
-            <w:pPr>
-              <w:spacing w:after="0" w:line="276"/>
+              <w:top w:type="dxa" w:w="40"/>
+              <w:left w:type="dxa" w:w="100"/>
+              <w:bottom w:type="dxa" w:w="40"/>
+              <w:right w:type="dxa" w:w="100"/>
+            </w:tcMar>
+          </w:tcPr>
+          <w:p>
+            <w:pPr>
+              <w:keepNext w:val="false"/>
+              <w:spacing w:after="0" w:line="264"/>
             </w:pPr>
             <w:r>
               <w:rPr>
@@ -689,15 +704,16 @@
               <w:right w:val="single" w:color="B7C4BF" w:sz="4"/>
             </w:tcBorders>
             <w:tcMar>
-              <w:top w:type="dxa" w:w="60"/>
-              <w:left w:type="dxa" w:w="100"/>
-              <w:bottom w:type="dxa" w:w="60"/>
-              <w:right w:type="dxa" w:w="100"/>
-            </w:tcMar>
-          </w:tcPr>
-          <w:p>
-            <w:pPr>
-              <w:spacing w:after="0" w:line="276"/>
+              <w:top w:type="dxa" w:w="40"/>
+              <w:left w:type="dxa" w:w="100"/>
+              <w:bottom w:type="dxa" w:w="40"/>
+              <w:right w:type="dxa" w:w="100"/>
+            </w:tcMar>
+          </w:tcPr>
+          <w:p>
+            <w:pPr>
+              <w:keepNext w:val="false"/>
+              <w:spacing w:after="0" w:line="264"/>
             </w:pPr>
             <w:r>
               <w:rPr>
@@ -725,15 +741,16 @@
               <w:right w:val="single" w:color="B7C4BF" w:sz="4"/>
             </w:tcBorders>
             <w:tcMar>
-              <w:top w:type="dxa" w:w="60"/>
-              <w:left w:type="dxa" w:w="100"/>
-              <w:bottom w:type="dxa" w:w="60"/>
-              <w:right w:type="dxa" w:w="100"/>
-            </w:tcMar>
-          </w:tcPr>
-          <w:p>
-            <w:pPr>
-              <w:spacing w:after="0" w:line="276"/>
+              <w:top w:type="dxa" w:w="40"/>
+              <w:left w:type="dxa" w:w="100"/>
+              <w:bottom w:type="dxa" w:w="40"/>
+              <w:right w:type="dxa" w:w="100"/>
+            </w:tcMar>
+          </w:tcPr>
+          <w:p>
+            <w:pPr>
+              <w:keepNext w:val="false"/>
+              <w:spacing w:after="0" w:line="264"/>
             </w:pPr>
             <w:r>
               <w:rPr>
@@ -755,15 +772,16 @@
               <w:right w:val="single" w:color="B7C4BF" w:sz="4"/>
             </w:tcBorders>
             <w:tcMar>
-              <w:top w:type="dxa" w:w="60"/>
-              <w:left w:type="dxa" w:w="100"/>
-              <w:bottom w:type="dxa" w:w="60"/>
-              <w:right w:type="dxa" w:w="100"/>
-            </w:tcMar>
-          </w:tcPr>
-          <w:p>
-            <w:pPr>
-              <w:spacing w:after="0" w:line="276"/>
+              <w:top w:type="dxa" w:w="40"/>
+              <w:left w:type="dxa" w:w="100"/>
+              <w:bottom w:type="dxa" w:w="40"/>
+              <w:right w:type="dxa" w:w="100"/>
+            </w:tcMar>
+          </w:tcPr>
+          <w:p>
+            <w:pPr>
+              <w:keepNext w:val="false"/>
+              <w:spacing w:after="0" w:line="264"/>
             </w:pPr>
             <w:r>
               <w:rPr>
@@ -785,15 +803,16 @@
               <w:right w:val="single" w:color="B7C4BF" w:sz="4"/>
             </w:tcBorders>
             <w:tcMar>
-              <w:top w:type="dxa" w:w="60"/>
-              <w:left w:type="dxa" w:w="100"/>
-              <w:bottom w:type="dxa" w:w="60"/>
-              <w:right w:type="dxa" w:w="100"/>
-            </w:tcMar>
-          </w:tcPr>
-          <w:p>
-            <w:pPr>
-              <w:spacing w:after="0" w:line="276"/>
+              <w:top w:type="dxa" w:w="40"/>
+              <w:left w:type="dxa" w:w="100"/>
+              <w:bottom w:type="dxa" w:w="40"/>
+              <w:right w:type="dxa" w:w="100"/>
+            </w:tcMar>
+          </w:tcPr>
+          <w:p>
+            <w:pPr>
+              <w:keepNext w:val="false"/>
+              <w:spacing w:after="0" w:line="264"/>
             </w:pPr>
             <w:r>
               <w:rPr>
@@ -815,15 +834,16 @@
               <w:right w:val="single" w:color="B7C4BF" w:sz="4"/>
             </w:tcBorders>
             <w:tcMar>
-              <w:top w:type="dxa" w:w="60"/>
-              <w:left w:type="dxa" w:w="100"/>
-              <w:bottom w:type="dxa" w:w="60"/>
-              <w:right w:type="dxa" w:w="100"/>
-            </w:tcMar>
-          </w:tcPr>
-          <w:p>
-            <w:pPr>
-              <w:spacing w:after="0" w:line="276"/>
+              <w:top w:type="dxa" w:w="40"/>
+              <w:left w:type="dxa" w:w="100"/>
+              <w:bottom w:type="dxa" w:w="40"/>
+              <w:right w:type="dxa" w:w="100"/>
+            </w:tcMar>
+          </w:tcPr>
+          <w:p>
+            <w:pPr>
+              <w:keepNext w:val="false"/>
+              <w:spacing w:after="0" w:line="264"/>
             </w:pPr>
             <w:r>
               <w:rPr>
@@ -851,15 +871,16 @@
               <w:right w:val="single" w:color="B7C4BF" w:sz="4"/>
             </w:tcBorders>
             <w:tcMar>
-              <w:top w:type="dxa" w:w="60"/>
-              <w:left w:type="dxa" w:w="100"/>
-              <w:bottom w:type="dxa" w:w="60"/>
-              <w:right w:type="dxa" w:w="100"/>
-            </w:tcMar>
-          </w:tcPr>
-          <w:p>
-            <w:pPr>
-              <w:spacing w:after="0" w:line="276"/>
+              <w:top w:type="dxa" w:w="40"/>
+              <w:left w:type="dxa" w:w="100"/>
+              <w:bottom w:type="dxa" w:w="40"/>
+              <w:right w:type="dxa" w:w="100"/>
+            </w:tcMar>
+          </w:tcPr>
+          <w:p>
+            <w:pPr>
+              <w:keepNext w:val="false"/>
+              <w:spacing w:after="0" w:line="264"/>
             </w:pPr>
             <w:r>
               <w:rPr>
@@ -881,15 +902,16 @@
               <w:right w:val="single" w:color="B7C4BF" w:sz="4"/>
             </w:tcBorders>
             <w:tcMar>
-              <w:top w:type="dxa" w:w="60"/>
-              <w:left w:type="dxa" w:w="100"/>
-              <w:bottom w:type="dxa" w:w="60"/>
-              <w:right w:type="dxa" w:w="100"/>
-            </w:tcMar>
-          </w:tcPr>
-          <w:p>
-            <w:pPr>
-              <w:spacing w:after="0" w:line="276"/>
+              <w:top w:type="dxa" w:w="40"/>
+              <w:left w:type="dxa" w:w="100"/>
+              <w:bottom w:type="dxa" w:w="40"/>
+              <w:right w:type="dxa" w:w="100"/>
+            </w:tcMar>
+          </w:tcPr>
+          <w:p>
+            <w:pPr>
+              <w:keepNext w:val="false"/>
+              <w:spacing w:after="0" w:line="264"/>
             </w:pPr>
             <w:r>
               <w:rPr>
@@ -911,15 +933,16 @@
               <w:right w:val="single" w:color="B7C4BF" w:sz="4"/>
             </w:tcBorders>
             <w:tcMar>
-              <w:top w:type="dxa" w:w="60"/>
-              <w:left w:type="dxa" w:w="100"/>
-              <w:bottom w:type="dxa" w:w="60"/>
-              <w:right w:type="dxa" w:w="100"/>
-            </w:tcMar>
-          </w:tcPr>
-          <w:p>
-            <w:pPr>
-              <w:spacing w:after="0" w:line="276"/>
+              <w:top w:type="dxa" w:w="40"/>
+              <w:left w:type="dxa" w:w="100"/>
+              <w:bottom w:type="dxa" w:w="40"/>
+              <w:right w:type="dxa" w:w="100"/>
+            </w:tcMar>
+          </w:tcPr>
+          <w:p>
+            <w:pPr>
+              <w:keepNext w:val="false"/>
+              <w:spacing w:after="0" w:line="264"/>
             </w:pPr>
             <w:r>
               <w:rPr>
@@ -941,15 +964,16 @@
               <w:right w:val="single" w:color="B7C4BF" w:sz="4"/>
             </w:tcBorders>
             <w:tcMar>
-              <w:top w:type="dxa" w:w="60"/>
-              <w:left w:type="dxa" w:w="100"/>
-              <w:bottom w:type="dxa" w:w="60"/>
-              <w:right w:type="dxa" w:w="100"/>
-            </w:tcMar>
-          </w:tcPr>
-          <w:p>
-            <w:pPr>
-              <w:spacing w:after="0" w:line="276"/>
+              <w:top w:type="dxa" w:w="40"/>
+              <w:left w:type="dxa" w:w="100"/>
+              <w:bottom w:type="dxa" w:w="40"/>
+              <w:right w:type="dxa" w:w="100"/>
+            </w:tcMar>
+          </w:tcPr>
+          <w:p>
+            <w:pPr>
+              <w:keepNext w:val="false"/>
+              <w:spacing w:after="0" w:line="264"/>
             </w:pPr>
             <w:r>
               <w:rPr>
@@ -977,15 +1001,16 @@
               <w:right w:val="single" w:color="B7C4BF" w:sz="4"/>
             </w:tcBorders>
             <w:tcMar>
-              <w:top w:type="dxa" w:w="60"/>
-              <w:left w:type="dxa" w:w="100"/>
-              <w:bottom w:type="dxa" w:w="60"/>
-              <w:right w:type="dxa" w:w="100"/>
-            </w:tcMar>
-          </w:tcPr>
-          <w:p>
-            <w:pPr>
-              <w:spacing w:after="0" w:line="276"/>
+              <w:top w:type="dxa" w:w="40"/>
+              <w:left w:type="dxa" w:w="100"/>
+              <w:bottom w:type="dxa" w:w="40"/>
+              <w:right w:type="dxa" w:w="100"/>
+            </w:tcMar>
+          </w:tcPr>
+          <w:p>
+            <w:pPr>
+              <w:keepNext w:val="false"/>
+              <w:spacing w:after="0" w:line="264"/>
             </w:pPr>
             <w:r>
               <w:rPr>
@@ -1007,15 +1032,16 @@
               <w:right w:val="single" w:color="B7C4BF" w:sz="4"/>
             </w:tcBorders>
             <w:tcMar>
-              <w:top w:type="dxa" w:w="60"/>
-              <w:left w:type="dxa" w:w="100"/>
-              <w:bottom w:type="dxa" w:w="60"/>
-              <w:right w:type="dxa" w:w="100"/>
-            </w:tcMar>
-          </w:tcPr>
-          <w:p>
-            <w:pPr>
-              <w:spacing w:after="0" w:line="276"/>
+              <w:top w:type="dxa" w:w="40"/>
+              <w:left w:type="dxa" w:w="100"/>
+              <w:bottom w:type="dxa" w:w="40"/>
+              <w:right w:type="dxa" w:w="100"/>
+            </w:tcMar>
+          </w:tcPr>
+          <w:p>
+            <w:pPr>
+              <w:keepNext w:val="false"/>
+              <w:spacing w:after="0" w:line="264"/>
             </w:pPr>
             <w:r>
               <w:rPr>
@@ -1037,15 +1063,16 @@
               <w:right w:val="single" w:color="B7C4BF" w:sz="4"/>
             </w:tcBorders>
             <w:tcMar>
-              <w:top w:type="dxa" w:w="60"/>
-              <w:left w:type="dxa" w:w="100"/>
-              <w:bottom w:type="dxa" w:w="60"/>
-              <w:right w:type="dxa" w:w="100"/>
-            </w:tcMar>
-          </w:tcPr>
-          <w:p>
-            <w:pPr>
-              <w:spacing w:after="0" w:line="276"/>
+              <w:top w:type="dxa" w:w="40"/>
+              <w:left w:type="dxa" w:w="100"/>
+              <w:bottom w:type="dxa" w:w="40"/>
+              <w:right w:type="dxa" w:w="100"/>
+            </w:tcMar>
+          </w:tcPr>
+          <w:p>
+            <w:pPr>
+              <w:keepNext w:val="false"/>
+              <w:spacing w:after="0" w:line="264"/>
             </w:pPr>
             <w:r>
               <w:rPr>
@@ -1067,15 +1094,16 @@
               <w:right w:val="single" w:color="B7C4BF" w:sz="4"/>
             </w:tcBorders>
             <w:tcMar>
-              <w:top w:type="dxa" w:w="60"/>
-              <w:left w:type="dxa" w:w="100"/>
-              <w:bottom w:type="dxa" w:w="60"/>
-              <w:right w:type="dxa" w:w="100"/>
-            </w:tcMar>
-          </w:tcPr>
-          <w:p>
-            <w:pPr>
-              <w:spacing w:after="0" w:line="276"/>
+              <w:top w:type="dxa" w:w="40"/>
+              <w:left w:type="dxa" w:w="100"/>
+              <w:bottom w:type="dxa" w:w="40"/>
+              <w:right w:type="dxa" w:w="100"/>
+            </w:tcMar>
+          </w:tcPr>
+          <w:p>
+            <w:pPr>
+              <w:keepNext w:val="false"/>
+              <w:spacing w:after="0" w:line="264"/>
             </w:pPr>
             <w:r>
               <w:rPr>
@@ -1112,7 +1140,7 @@
     </w:p>
     <w:p>
       <w:pPr>
-        <w:spacing w:after="160" w:line="360"/>
+        <w:spacing w:after="100" w:line="360"/>
         <w:jc w:val="both"/>
       </w:pPr>
       <w:r>
@@ -1131,7 +1159,7 @@
           <w:sz w:val="24"/>
           <w:szCs w:val="24"/>
         </w:rPr>
-        <w:t xml:space="preserve"> Inovasi Teknologi. PharmaSync ialah sistem aplikasi web yang menghimpunkan aliran kerja farmasi klinik dalam satu sistem, dari permohonan ubat oleh pegawai perubatan, kelulusan pakar dan kawalan kuota, hingga pendispensan dan rekod. Seluruh sistem dibangunkan sendiri oleh Kumpulan Inovasi menggunakan bahasa pengaturcaraan (TypeScript dengan React) dan pangkalan data PostgreSQL, selaras dengan syarat kategori teknologi dalam perkara 5.9 Garis Panduan KIJS 2026.</w:t>
+        <w:t xml:space="preserve"> Inovasi Teknologi. PharmaSync ialah sistem aplikasi web yang menghimpunkan aliran kerja farmasi klinik dalam satu sistem, dari permohonan ubat oleh pegawai perubatan, kelulusan pakar dan kawalan kuota, hingga pendispensan dan rekod. Tiga ciri utamanya ialah pengurusan ubat kuota (UKK), borang antibiotik digital dan cadangan dos antibiotik berbantukan AI. Seluruh sistem dibangunkan sendiri oleh Kumpulan Inovasi menggunakan bahasa pengaturcaraan (TypeScript dengan React) dan pangkalan data PostgreSQL, selaras dengan syarat kategori teknologi dalam perkara 5.9 Garis Panduan KIJS 2026.</w:t>
       </w:r>
     </w:p>
     <w:p>
@@ -1158,16 +1186,26 @@
           <w:ilvl w:val="0"/>
           <w:numId w:val="2"/>
         </w:numPr>
-        <w:spacing w:after="80" w:line="360"/>
+        <w:spacing w:after="40" w:line="360"/>
         <w:jc w:val="both"/>
       </w:pPr>
       <w:r>
         <w:rPr>
           <w:rFonts w:ascii="Arial" w:cs="Arial" w:eastAsia="Arial" w:hAnsi="Arial"/>
-          <w:sz w:val="24"/>
-          <w:szCs w:val="24"/>
-        </w:rPr>
-        <w:t xml:space="preserve">Permohonan dan kelulusan UKK dalam sistem, dengan baki kuota tahunan peringkat daerah dipaparkan kepada pegawai perubatan dan FMS sebelum keputusan dibuat. Pesakit Pesara dikecualikan daripada kuota secara automatik.</w:t>
+          <w:b/>
+          <w:bCs/>
+          <w:sz w:val="24"/>
+          <w:szCs w:val="24"/>
+        </w:rPr>
+        <w:t xml:space="preserve">Pengurusan ubat kuota (UKK):</w:t>
+      </w:r>
+      <w:r>
+        <w:rPr>
+          <w:rFonts w:ascii="Arial" w:cs="Arial" w:eastAsia="Arial" w:hAnsi="Arial"/>
+          <w:sz w:val="24"/>
+          <w:szCs w:val="24"/>
+        </w:rPr>
+        <w:t xml:space="preserve"> permohonan dan kelulusan UKK dibuat dalam sistem. Baki kuota tahunan peringkat daerah dipaparkan kepada pegawai perubatan dan FMS sebelum keputusan dibuat, permohonan yang melebihi peruntukan disekat, senarai pesakit ubat kuota dikemas kini secara automatik, dan pesakit Pesara dikecualikan daripada kuota.</w:t>
       </w:r>
     </w:p>
     <w:p>
@@ -1177,16 +1215,26 @@
           <w:ilvl w:val="0"/>
           <w:numId w:val="2"/>
         </w:numPr>
-        <w:spacing w:after="80" w:line="360"/>
+        <w:spacing w:after="40" w:line="360"/>
         <w:jc w:val="both"/>
       </w:pPr>
       <w:r>
         <w:rPr>
           <w:rFonts w:ascii="Arial" w:cs="Arial" w:eastAsia="Arial" w:hAnsi="Arial"/>
-          <w:sz w:val="24"/>
-          <w:szCs w:val="24"/>
-        </w:rPr>
-        <w:t xml:space="preserve">Borang AMS digital bagi antibiotik terkawal, dengan semakan medan wajib dan semakan Clinical Pathway NAG 2024.</w:t>
+          <w:b/>
+          <w:bCs/>
+          <w:sz w:val="24"/>
+          <w:szCs w:val="24"/>
+        </w:rPr>
+        <w:t xml:space="preserve">Borang antibiotik digital:</w:t>
+      </w:r>
+      <w:r>
+        <w:rPr>
+          <w:rFonts w:ascii="Arial" w:cs="Arial" w:eastAsia="Arial" w:hAnsi="Arial"/>
+          <w:sz w:val="24"/>
+          <w:szCs w:val="24"/>
+        </w:rPr>
+        <w:t xml:space="preserve"> borang AMS bagi antibiotik terkawal dengan senarai semak klinikal mengikut Clinical Pathway NAG 2024. Medan wajib disemak sebelum borang boleh dihantar, keputusan FMS direkodkan bersama kod antibiotik, dan rekod AMS dijana secara automatik.</w:t>
       </w:r>
     </w:p>
     <w:p>
@@ -1196,16 +1244,26 @@
           <w:ilvl w:val="0"/>
           <w:numId w:val="2"/>
         </w:numPr>
-        <w:spacing w:after="80" w:line="360"/>
+        <w:spacing w:after="40" w:line="360"/>
         <w:jc w:val="both"/>
       </w:pPr>
       <w:r>
         <w:rPr>
           <w:rFonts w:ascii="Arial" w:cs="Arial" w:eastAsia="Arial" w:hAnsi="Arial"/>
-          <w:sz w:val="24"/>
-          <w:szCs w:val="24"/>
-        </w:rPr>
-        <w:t xml:space="preserve">Semakan keselamatan preskripsi, iaitu penyemak kekurangan G6PD dan kalkulator dos pediatrik berdasarkan berat badan.</w:t>
+          <w:b/>
+          <w:bCs/>
+          <w:sz w:val="24"/>
+          <w:szCs w:val="24"/>
+        </w:rPr>
+        <w:t xml:space="preserve">Cadangan dos antibiotik berbantukan AI:</w:t>
+      </w:r>
+      <w:r>
+        <w:rPr>
+          <w:rFonts w:ascii="Arial" w:cs="Arial" w:eastAsia="Arial" w:hAnsi="Arial"/>
+          <w:sz w:val="24"/>
+          <w:szCs w:val="24"/>
+        </w:rPr>
+        <w:t xml:space="preserve"> berdasarkan diagnosis, senarai semak klinikal, umur, berat badan dan status alahan pesakit, sistem mencadangkan regimen antibiotik mengikut NAG 2024. Dos kanak-kanak dikira mengikut berat badan dan dihadkan pada dos maksimum. Model AI tempatan yang dihoskan di Malaysia memadankan diagnosis dengan nota dos garis panduan yang ditulis oleh pegawai farmasi, dan memaparkan teks dos itu tanpa perubahan. Cadangan hanya masuk ke dalam preskripsi apabila pegawai perubatan mengesahkannya; jika tiada laluan yang sepadan, sistem mencadangkan rujukan kepada pakar.</w:t>
       </w:r>
     </w:p>
     <w:p>
@@ -1215,7 +1273,7 @@
           <w:ilvl w:val="0"/>
           <w:numId w:val="2"/>
         </w:numPr>
-        <w:spacing w:after="80" w:line="360"/>
+        <w:spacing w:after="40" w:line="360"/>
         <w:jc w:val="both"/>
       </w:pPr>
       <w:r>
@@ -1224,7 +1282,7 @@
           <w:sz w:val="24"/>
           <w:szCs w:val="24"/>
         </w:rPr>
-        <w:t xml:space="preserve">Cadangan antibiotik dengan bantuan AI menggunakan model tempatan yang dihoskan di Malaysia.</w:t>
+        <w:t xml:space="preserve">Semakan keselamatan preskripsi, iaitu penyemak kekurangan G6PD dan kalkulator dos pediatrik berdasarkan berat badan.</w:t>
       </w:r>
     </w:p>
     <w:p>
@@ -1234,7 +1292,7 @@
           <w:ilvl w:val="0"/>
           <w:numId w:val="2"/>
         </w:numPr>
-        <w:spacing w:after="80" w:line="360"/>
+        <w:spacing w:after="40" w:line="360"/>
         <w:jc w:val="both"/>
       </w:pPr>
       <w:r>
@@ -1243,7 +1301,7 @@
           <w:sz w:val="24"/>
           <w:szCs w:val="24"/>
         </w:rPr>
-        <w:t xml:space="preserve">Pengurusan stok ubat, log audit bagi setiap transaksi, dan notifikasi kepada FMS apabila permohonan baharu dihantar.</w:t>
+        <w:t xml:space="preserve">Log audit bagi setiap tindakan, dan notifikasi kepada FMS apabila permohonan baharu dihantar.</w:t>
       </w:r>
     </w:p>
     <w:p>
@@ -1270,7 +1328,7 @@
           <w:ilvl w:val="0"/>
           <w:numId w:val="3"/>
         </w:numPr>
-        <w:spacing w:after="80" w:line="360"/>
+        <w:spacing w:after="40" w:line="360"/>
         <w:jc w:val="both"/>
       </w:pPr>
       <w:r>
@@ -1289,7 +1347,7 @@
           <w:ilvl w:val="0"/>
           <w:numId w:val="3"/>
         </w:numPr>
-        <w:spacing w:after="80" w:line="360"/>
+        <w:spacing w:after="40" w:line="360"/>
         <w:jc w:val="both"/>
       </w:pPr>
       <w:r>
@@ -1308,7 +1366,7 @@
           <w:ilvl w:val="0"/>
           <w:numId w:val="3"/>
         </w:numPr>
-        <w:spacing w:after="80" w:line="360"/>
+        <w:spacing w:after="40" w:line="360"/>
         <w:jc w:val="both"/>
       </w:pPr>
       <w:r>
@@ -1327,7 +1385,7 @@
           <w:ilvl w:val="0"/>
           <w:numId w:val="3"/>
         </w:numPr>
-        <w:spacing w:after="80" w:line="360"/>
+        <w:spacing w:after="40" w:line="360"/>
         <w:jc w:val="both"/>
       </w:pPr>
       <w:r>
@@ -1346,7 +1404,7 @@
           <w:ilvl w:val="0"/>
           <w:numId w:val="3"/>
         </w:numPr>
-        <w:spacing w:after="80" w:line="360"/>
+        <w:spacing w:after="40" w:line="360"/>
         <w:jc w:val="both"/>
       </w:pPr>
       <w:r>
@@ -1355,7 +1413,7 @@
           <w:sz w:val="24"/>
           <w:szCs w:val="24"/>
         </w:rPr>
-        <w:t xml:space="preserve">Mengurangkan risiko kesilapan pengubatan semasa preskripsi ditulis.</w:t>
+        <w:t xml:space="preserve">Mengurangkan risiko kesilapan pengubatan dengan semakan keselamatan dan cadangan dos antibiotik mengikut NAG 2024 semasa preskripsi ditulis.</w:t>
       </w:r>
     </w:p>
     <w:p>
@@ -1406,7 +1464,7 @@
           <w:ilvl w:val="0"/>
           <w:numId w:val="4"/>
         </w:numPr>
-        <w:spacing w:after="80" w:line="360"/>
+        <w:spacing w:after="40" w:line="360"/>
         <w:jc w:val="both"/>
       </w:pPr>
       <w:r>
@@ -1425,7 +1483,7 @@
           <w:ilvl w:val="0"/>
           <w:numId w:val="4"/>
         </w:numPr>
-        <w:spacing w:after="80" w:line="360"/>
+        <w:spacing w:after="40" w:line="360"/>
         <w:jc w:val="both"/>
       </w:pPr>
       <w:r>
@@ -1444,7 +1502,7 @@
           <w:ilvl w:val="0"/>
           <w:numId w:val="4"/>
         </w:numPr>
-        <w:spacing w:after="80" w:line="360"/>
+        <w:spacing w:after="40" w:line="360"/>
         <w:jc w:val="both"/>
       </w:pPr>
       <w:r>
@@ -1463,7 +1521,7 @@
           <w:ilvl w:val="0"/>
           <w:numId w:val="4"/>
         </w:numPr>
-        <w:spacing w:after="80" w:line="360"/>
+        <w:spacing w:after="40" w:line="360"/>
         <w:jc w:val="both"/>
       </w:pPr>
       <w:r>
@@ -1482,7 +1540,7 @@
           <w:ilvl w:val="0"/>
           <w:numId w:val="4"/>
         </w:numPr>
-        <w:spacing w:after="80" w:line="360"/>
+        <w:spacing w:after="40" w:line="360"/>
         <w:jc w:val="both"/>
       </w:pPr>
       <w:r>
@@ -1496,20 +1554,6 @@
     </w:p>
     <w:p>
       <w:pPr>
-        <w:spacing w:after="160" w:before="80" w:line="360"/>
-        <w:jc w:val="both"/>
-      </w:pPr>
-      <w:r>
-        <w:rPr>
-          <w:rFonts w:ascii="Arial" w:cs="Arial" w:eastAsia="Arial" w:hAnsi="Arial"/>
-          <w:sz w:val="24"/>
-          <w:szCs w:val="24"/>
-        </w:rPr>
-        <w:t xml:space="preserve">Carta aliran kerja penuh bagi UKK dan antibiotik terkawal, sebelum dan selepas inovasi, ditunjukkan dalam Rajah 1 hingga Rajah 4 di Bahagian 2.</w:t>
-      </w:r>
-    </w:p>
-    <w:p>
-      <w:pPr>
         <w:pStyle w:val="Heading3"/>
       </w:pPr>
       <w:r>
@@ -1518,7 +1562,7 @@
     </w:p>
     <w:p>
       <w:pPr>
-        <w:spacing w:after="160" w:line="360"/>
+        <w:spacing w:after="100" w:line="360"/>
         <w:jc w:val="both"/>
       </w:pPr>
       <w:r>
@@ -1586,15 +1630,16 @@
             </w:tcBorders>
             <w:shd w:fill="E3EFEA" w:color="auto" w:val="clear"/>
             <w:tcMar>
-              <w:top w:type="dxa" w:w="60"/>
-              <w:left w:type="dxa" w:w="100"/>
-              <w:bottom w:type="dxa" w:w="60"/>
-              <w:right w:type="dxa" w:w="100"/>
-            </w:tcMar>
-          </w:tcPr>
-          <w:p>
-            <w:pPr>
-              <w:spacing w:after="0" w:line="276"/>
+              <w:top w:type="dxa" w:w="40"/>
+              <w:left w:type="dxa" w:w="100"/>
+              <w:bottom w:type="dxa" w:w="40"/>
+              <w:right w:type="dxa" w:w="100"/>
+            </w:tcMar>
+          </w:tcPr>
+          <w:p>
+            <w:pPr>
+              <w:keepNext w:val="false"/>
+              <w:spacing w:after="0" w:line="264"/>
             </w:pPr>
             <w:r>
               <w:rPr>
@@ -1619,15 +1664,16 @@
             </w:tcBorders>
             <w:shd w:fill="E3EFEA" w:color="auto" w:val="clear"/>
             <w:tcMar>
-              <w:top w:type="dxa" w:w="60"/>
-              <w:left w:type="dxa" w:w="100"/>
-              <w:bottom w:type="dxa" w:w="60"/>
-              <w:right w:type="dxa" w:w="100"/>
-            </w:tcMar>
-          </w:tcPr>
-          <w:p>
-            <w:pPr>
-              <w:spacing w:after="0" w:line="276"/>
+              <w:top w:type="dxa" w:w="40"/>
+              <w:left w:type="dxa" w:w="100"/>
+              <w:bottom w:type="dxa" w:w="40"/>
+              <w:right w:type="dxa" w:w="100"/>
+            </w:tcMar>
+          </w:tcPr>
+          <w:p>
+            <w:pPr>
+              <w:keepNext w:val="false"/>
+              <w:spacing w:after="0" w:line="264"/>
             </w:pPr>
             <w:r>
               <w:rPr>
@@ -1657,15 +1703,16 @@
               <w:right w:val="single" w:color="B7C4BF" w:sz="4"/>
             </w:tcBorders>
             <w:tcMar>
-              <w:top w:type="dxa" w:w="60"/>
-              <w:left w:type="dxa" w:w="100"/>
-              <w:bottom w:type="dxa" w:w="60"/>
-              <w:right w:type="dxa" w:w="100"/>
-            </w:tcMar>
-          </w:tcPr>
-          <w:p>
-            <w:pPr>
-              <w:spacing w:after="0" w:line="276"/>
+              <w:top w:type="dxa" w:w="40"/>
+              <w:left w:type="dxa" w:w="100"/>
+              <w:bottom w:type="dxa" w:w="40"/>
+              <w:right w:type="dxa" w:w="100"/>
+            </w:tcMar>
+          </w:tcPr>
+          <w:p>
+            <w:pPr>
+              <w:keepNext w:val="false"/>
+              <w:spacing w:after="0" w:line="264"/>
             </w:pPr>
             <w:r>
               <w:rPr>
@@ -1687,15 +1734,16 @@
               <w:right w:val="single" w:color="B7C4BF" w:sz="4"/>
             </w:tcBorders>
             <w:tcMar>
-              <w:top w:type="dxa" w:w="60"/>
-              <w:left w:type="dxa" w:w="100"/>
-              <w:bottom w:type="dxa" w:w="60"/>
-              <w:right w:type="dxa" w:w="100"/>
-            </w:tcMar>
-          </w:tcPr>
-          <w:p>
-            <w:pPr>
-              <w:spacing w:after="0" w:line="276"/>
+              <w:top w:type="dxa" w:w="40"/>
+              <w:left w:type="dxa" w:w="100"/>
+              <w:bottom w:type="dxa" w:w="40"/>
+              <w:right w:type="dxa" w:w="100"/>
+            </w:tcMar>
+          </w:tcPr>
+          <w:p>
+            <w:pPr>
+              <w:keepNext w:val="false"/>
+              <w:spacing w:after="0" w:line="264"/>
             </w:pPr>
             <w:r>
               <w:rPr>
@@ -1723,15 +1771,16 @@
               <w:right w:val="single" w:color="B7C4BF" w:sz="4"/>
             </w:tcBorders>
             <w:tcMar>
-              <w:top w:type="dxa" w:w="60"/>
-              <w:left w:type="dxa" w:w="100"/>
-              <w:bottom w:type="dxa" w:w="60"/>
-              <w:right w:type="dxa" w:w="100"/>
-            </w:tcMar>
-          </w:tcPr>
-          <w:p>
-            <w:pPr>
-              <w:spacing w:after="0" w:line="276"/>
+              <w:top w:type="dxa" w:w="40"/>
+              <w:left w:type="dxa" w:w="100"/>
+              <w:bottom w:type="dxa" w:w="40"/>
+              <w:right w:type="dxa" w:w="100"/>
+            </w:tcMar>
+          </w:tcPr>
+          <w:p>
+            <w:pPr>
+              <w:keepNext w:val="false"/>
+              <w:spacing w:after="0" w:line="264"/>
             </w:pPr>
             <w:r>
               <w:rPr>
@@ -1753,15 +1802,16 @@
               <w:right w:val="single" w:color="B7C4BF" w:sz="4"/>
             </w:tcBorders>
             <w:tcMar>
-              <w:top w:type="dxa" w:w="60"/>
-              <w:left w:type="dxa" w:w="100"/>
-              <w:bottom w:type="dxa" w:w="60"/>
-              <w:right w:type="dxa" w:w="100"/>
-            </w:tcMar>
-          </w:tcPr>
-          <w:p>
-            <w:pPr>
-              <w:spacing w:after="0" w:line="276"/>
+              <w:top w:type="dxa" w:w="40"/>
+              <w:left w:type="dxa" w:w="100"/>
+              <w:bottom w:type="dxa" w:w="40"/>
+              <w:right w:type="dxa" w:w="100"/>
+            </w:tcMar>
+          </w:tcPr>
+          <w:p>
+            <w:pPr>
+              <w:keepNext w:val="false"/>
+              <w:spacing w:after="0" w:line="264"/>
             </w:pPr>
             <w:r>
               <w:rPr>
@@ -1789,15 +1839,16 @@
               <w:right w:val="single" w:color="B7C4BF" w:sz="4"/>
             </w:tcBorders>
             <w:tcMar>
-              <w:top w:type="dxa" w:w="60"/>
-              <w:left w:type="dxa" w:w="100"/>
-              <w:bottom w:type="dxa" w:w="60"/>
-              <w:right w:type="dxa" w:w="100"/>
-            </w:tcMar>
-          </w:tcPr>
-          <w:p>
-            <w:pPr>
-              <w:spacing w:after="0" w:line="276"/>
+              <w:top w:type="dxa" w:w="40"/>
+              <w:left w:type="dxa" w:w="100"/>
+              <w:bottom w:type="dxa" w:w="40"/>
+              <w:right w:type="dxa" w:w="100"/>
+            </w:tcMar>
+          </w:tcPr>
+          <w:p>
+            <w:pPr>
+              <w:keepNext w:val="false"/>
+              <w:spacing w:after="0" w:line="264"/>
             </w:pPr>
             <w:r>
               <w:rPr>
@@ -1819,15 +1870,16 @@
               <w:right w:val="single" w:color="B7C4BF" w:sz="4"/>
             </w:tcBorders>
             <w:tcMar>
-              <w:top w:type="dxa" w:w="60"/>
-              <w:left w:type="dxa" w:w="100"/>
-              <w:bottom w:type="dxa" w:w="60"/>
-              <w:right w:type="dxa" w:w="100"/>
-            </w:tcMar>
-          </w:tcPr>
-          <w:p>
-            <w:pPr>
-              <w:spacing w:after="0" w:line="276"/>
+              <w:top w:type="dxa" w:w="40"/>
+              <w:left w:type="dxa" w:w="100"/>
+              <w:bottom w:type="dxa" w:w="40"/>
+              <w:right w:type="dxa" w:w="100"/>
+            </w:tcMar>
+          </w:tcPr>
+          <w:p>
+            <w:pPr>
+              <w:keepNext w:val="false"/>
+              <w:spacing w:after="0" w:line="264"/>
             </w:pPr>
             <w:r>
               <w:rPr>
@@ -1855,15 +1907,16 @@
               <w:right w:val="single" w:color="B7C4BF" w:sz="4"/>
             </w:tcBorders>
             <w:tcMar>
-              <w:top w:type="dxa" w:w="60"/>
-              <w:left w:type="dxa" w:w="100"/>
-              <w:bottom w:type="dxa" w:w="60"/>
-              <w:right w:type="dxa" w:w="100"/>
-            </w:tcMar>
-          </w:tcPr>
-          <w:p>
-            <w:pPr>
-              <w:spacing w:after="0" w:line="276"/>
+              <w:top w:type="dxa" w:w="40"/>
+              <w:left w:type="dxa" w:w="100"/>
+              <w:bottom w:type="dxa" w:w="40"/>
+              <w:right w:type="dxa" w:w="100"/>
+            </w:tcMar>
+          </w:tcPr>
+          <w:p>
+            <w:pPr>
+              <w:keepNext w:val="false"/>
+              <w:spacing w:after="0" w:line="264"/>
             </w:pPr>
             <w:r>
               <w:rPr>
@@ -1885,15 +1938,16 @@
               <w:right w:val="single" w:color="B7C4BF" w:sz="4"/>
             </w:tcBorders>
             <w:tcMar>
-              <w:top w:type="dxa" w:w="60"/>
-              <w:left w:type="dxa" w:w="100"/>
-              <w:bottom w:type="dxa" w:w="60"/>
-              <w:right w:type="dxa" w:w="100"/>
-            </w:tcMar>
-          </w:tcPr>
-          <w:p>
-            <w:pPr>
-              <w:spacing w:after="0" w:line="276"/>
+              <w:top w:type="dxa" w:w="40"/>
+              <w:left w:type="dxa" w:w="100"/>
+              <w:bottom w:type="dxa" w:w="40"/>
+              <w:right w:type="dxa" w:w="100"/>
+            </w:tcMar>
+          </w:tcPr>
+          <w:p>
+            <w:pPr>
+              <w:keepNext w:val="false"/>
+              <w:spacing w:after="0" w:line="264"/>
             </w:pPr>
             <w:r>
               <w:rPr>
@@ -1921,15 +1975,16 @@
               <w:right w:val="single" w:color="B7C4BF" w:sz="4"/>
             </w:tcBorders>
             <w:tcMar>
-              <w:top w:type="dxa" w:w="60"/>
-              <w:left w:type="dxa" w:w="100"/>
-              <w:bottom w:type="dxa" w:w="60"/>
-              <w:right w:type="dxa" w:w="100"/>
-            </w:tcMar>
-          </w:tcPr>
-          <w:p>
-            <w:pPr>
-              <w:spacing w:after="0" w:line="276"/>
+              <w:top w:type="dxa" w:w="40"/>
+              <w:left w:type="dxa" w:w="100"/>
+              <w:bottom w:type="dxa" w:w="40"/>
+              <w:right w:type="dxa" w:w="100"/>
+            </w:tcMar>
+          </w:tcPr>
+          <w:p>
+            <w:pPr>
+              <w:keepNext w:val="false"/>
+              <w:spacing w:after="0" w:line="264"/>
             </w:pPr>
             <w:r>
               <w:rPr>
@@ -1951,15 +2006,16 @@
               <w:right w:val="single" w:color="B7C4BF" w:sz="4"/>
             </w:tcBorders>
             <w:tcMar>
-              <w:top w:type="dxa" w:w="60"/>
-              <w:left w:type="dxa" w:w="100"/>
-              <w:bottom w:type="dxa" w:w="60"/>
-              <w:right w:type="dxa" w:w="100"/>
-            </w:tcMar>
-          </w:tcPr>
-          <w:p>
-            <w:pPr>
-              <w:spacing w:after="0" w:line="276"/>
+              <w:top w:type="dxa" w:w="40"/>
+              <w:left w:type="dxa" w:w="100"/>
+              <w:bottom w:type="dxa" w:w="40"/>
+              <w:right w:type="dxa" w:w="100"/>
+            </w:tcMar>
+          </w:tcPr>
+          <w:p>
+            <w:pPr>
+              <w:keepNext w:val="false"/>
+              <w:spacing w:after="0" w:line="264"/>
             </w:pPr>
             <w:r>
               <w:rPr>
@@ -1987,15 +2043,16 @@
               <w:right w:val="single" w:color="B7C4BF" w:sz="4"/>
             </w:tcBorders>
             <w:tcMar>
-              <w:top w:type="dxa" w:w="60"/>
-              <w:left w:type="dxa" w:w="100"/>
-              <w:bottom w:type="dxa" w:w="60"/>
-              <w:right w:type="dxa" w:w="100"/>
-            </w:tcMar>
-          </w:tcPr>
-          <w:p>
-            <w:pPr>
-              <w:spacing w:after="0" w:line="276"/>
+              <w:top w:type="dxa" w:w="40"/>
+              <w:left w:type="dxa" w:w="100"/>
+              <w:bottom w:type="dxa" w:w="40"/>
+              <w:right w:type="dxa" w:w="100"/>
+            </w:tcMar>
+          </w:tcPr>
+          <w:p>
+            <w:pPr>
+              <w:keepNext w:val="false"/>
+              <w:spacing w:after="0" w:line="264"/>
             </w:pPr>
             <w:r>
               <w:rPr>
@@ -2017,15 +2074,16 @@
               <w:right w:val="single" w:color="B7C4BF" w:sz="4"/>
             </w:tcBorders>
             <w:tcMar>
-              <w:top w:type="dxa" w:w="60"/>
-              <w:left w:type="dxa" w:w="100"/>
-              <w:bottom w:type="dxa" w:w="60"/>
-              <w:right w:type="dxa" w:w="100"/>
-            </w:tcMar>
-          </w:tcPr>
-          <w:p>
-            <w:pPr>
-              <w:spacing w:after="0" w:line="276"/>
+              <w:top w:type="dxa" w:w="40"/>
+              <w:left w:type="dxa" w:w="100"/>
+              <w:bottom w:type="dxa" w:w="40"/>
+              <w:right w:type="dxa" w:w="100"/>
+            </w:tcMar>
+          </w:tcPr>
+          <w:p>
+            <w:pPr>
+              <w:keepNext w:val="false"/>
+              <w:spacing w:after="0" w:line="264"/>
             </w:pPr>
             <w:r>
               <w:rPr>
@@ -2053,15 +2111,16 @@
               <w:right w:val="single" w:color="B7C4BF" w:sz="4"/>
             </w:tcBorders>
             <w:tcMar>
-              <w:top w:type="dxa" w:w="60"/>
-              <w:left w:type="dxa" w:w="100"/>
-              <w:bottom w:type="dxa" w:w="60"/>
-              <w:right w:type="dxa" w:w="100"/>
-            </w:tcMar>
-          </w:tcPr>
-          <w:p>
-            <w:pPr>
-              <w:spacing w:after="0" w:line="276"/>
+              <w:top w:type="dxa" w:w="40"/>
+              <w:left w:type="dxa" w:w="100"/>
+              <w:bottom w:type="dxa" w:w="40"/>
+              <w:right w:type="dxa" w:w="100"/>
+            </w:tcMar>
+          </w:tcPr>
+          <w:p>
+            <w:pPr>
+              <w:keepNext w:val="false"/>
+              <w:spacing w:after="0" w:line="264"/>
             </w:pPr>
             <w:r>
               <w:rPr>
@@ -2083,15 +2142,16 @@
               <w:right w:val="single" w:color="B7C4BF" w:sz="4"/>
             </w:tcBorders>
             <w:tcMar>
-              <w:top w:type="dxa" w:w="60"/>
-              <w:left w:type="dxa" w:w="100"/>
-              <w:bottom w:type="dxa" w:w="60"/>
-              <w:right w:type="dxa" w:w="100"/>
-            </w:tcMar>
-          </w:tcPr>
-          <w:p>
-            <w:pPr>
-              <w:spacing w:after="0" w:line="276"/>
+              <w:top w:type="dxa" w:w="40"/>
+              <w:left w:type="dxa" w:w="100"/>
+              <w:bottom w:type="dxa" w:w="40"/>
+              <w:right w:type="dxa" w:w="100"/>
+            </w:tcMar>
+          </w:tcPr>
+          <w:p>
+            <w:pPr>
+              <w:keepNext w:val="false"/>
+              <w:spacing w:after="0" w:line="264"/>
             </w:pPr>
             <w:r>
               <w:rPr>
@@ -2119,15 +2179,16 @@
               <w:right w:val="single" w:color="B7C4BF" w:sz="4"/>
             </w:tcBorders>
             <w:tcMar>
-              <w:top w:type="dxa" w:w="60"/>
-              <w:left w:type="dxa" w:w="100"/>
-              <w:bottom w:type="dxa" w:w="60"/>
-              <w:right w:type="dxa" w:w="100"/>
-            </w:tcMar>
-          </w:tcPr>
-          <w:p>
-            <w:pPr>
-              <w:spacing w:after="0" w:line="276"/>
+              <w:top w:type="dxa" w:w="40"/>
+              <w:left w:type="dxa" w:w="100"/>
+              <w:bottom w:type="dxa" w:w="40"/>
+              <w:right w:type="dxa" w:w="100"/>
+            </w:tcMar>
+          </w:tcPr>
+          <w:p>
+            <w:pPr>
+              <w:keepNext w:val="false"/>
+              <w:spacing w:after="0" w:line="264"/>
             </w:pPr>
             <w:r>
               <w:rPr>
@@ -2149,89 +2210,24 @@
               <w:right w:val="single" w:color="B7C4BF" w:sz="4"/>
             </w:tcBorders>
             <w:tcMar>
-              <w:top w:type="dxa" w:w="60"/>
-              <w:left w:type="dxa" w:w="100"/>
-              <w:bottom w:type="dxa" w:w="60"/>
-              <w:right w:type="dxa" w:w="100"/>
-            </w:tcMar>
-          </w:tcPr>
-          <w:p>
-            <w:pPr>
-              <w:spacing w:after="0" w:line="276"/>
-            </w:pPr>
-            <w:r>
-              <w:rPr>
-                <w:rFonts w:ascii="Arial" w:cs="Arial" w:eastAsia="Arial" w:hAnsi="Arial"/>
-                <w:sz w:val="24"/>
-                <w:szCs w:val="24"/>
-              </w:rPr>
-              <w:t xml:space="preserve">Pegawai perubatan, Pakar Perubatan Keluarga, pegawai farmasi dan pegawai farmasi logistik</w:t>
-            </w:r>
-          </w:p>
-        </w:tc>
-      </w:tr>
-      <w:tr>
-        <w:trPr>
-          <w:cantSplit/>
-          <w:tblHeader w:val="off"/>
-        </w:trPr>
-        <w:tc>
-          <w:tcPr>
-            <w:tcW w:type="dxa" w:w="2900"/>
-            <w:tcBorders>
-              <w:top w:val="single" w:color="B7C4BF" w:sz="4"/>
-              <w:left w:val="single" w:color="B7C4BF" w:sz="4"/>
-              <w:bottom w:val="single" w:color="B7C4BF" w:sz="4"/>
-              <w:right w:val="single" w:color="B7C4BF" w:sz="4"/>
-            </w:tcBorders>
-            <w:tcMar>
-              <w:top w:type="dxa" w:w="60"/>
-              <w:left w:type="dxa" w:w="100"/>
-              <w:bottom w:type="dxa" w:w="60"/>
-              <w:right w:type="dxa" w:w="100"/>
-            </w:tcMar>
-          </w:tcPr>
-          <w:p>
-            <w:pPr>
-              <w:spacing w:after="0" w:line="276"/>
-            </w:pPr>
-            <w:r>
-              <w:rPr>
-                <w:rFonts w:ascii="Arial" w:cs="Arial" w:eastAsia="Arial" w:hAnsi="Arial"/>
-                <w:sz w:val="24"/>
-                <w:szCs w:val="24"/>
-              </w:rPr>
-              <w:t xml:space="preserve">Kos operasi</w:t>
-            </w:r>
-          </w:p>
-        </w:tc>
-        <w:tc>
-          <w:tcPr>
-            <w:tcW w:type="dxa" w:w="6126"/>
-            <w:tcBorders>
-              <w:top w:val="single" w:color="B7C4BF" w:sz="4"/>
-              <w:left w:val="single" w:color="B7C4BF" w:sz="4"/>
-              <w:bottom w:val="single" w:color="B7C4BF" w:sz="4"/>
-              <w:right w:val="single" w:color="B7C4BF" w:sz="4"/>
-            </w:tcBorders>
-            <w:tcMar>
-              <w:top w:type="dxa" w:w="60"/>
-              <w:left w:type="dxa" w:w="100"/>
-              <w:bottom w:type="dxa" w:w="60"/>
-              <w:right w:type="dxa" w:w="100"/>
-            </w:tcMar>
-          </w:tcPr>
-          <w:p>
-            <w:pPr>
-              <w:spacing w:after="0" w:line="276"/>
-            </w:pPr>
-            <w:r>
-              <w:rPr>
-                <w:rFonts w:ascii="Arial" w:cs="Arial" w:eastAsia="Arial" w:hAnsi="Arial"/>
-                <w:sz w:val="24"/>
-                <w:szCs w:val="24"/>
-              </w:rPr>
-              <w:t xml:space="preserve">Domain RM13 setahun dan pelayan RM100 sebulan, iaitu kira-kira RM3.32 sehari. Tiada kos pembangunan.</w:t>
+              <w:top w:type="dxa" w:w="40"/>
+              <w:left w:type="dxa" w:w="100"/>
+              <w:bottom w:type="dxa" w:w="40"/>
+              <w:right w:type="dxa" w:w="100"/>
+            </w:tcMar>
+          </w:tcPr>
+          <w:p>
+            <w:pPr>
+              <w:keepNext w:val="false"/>
+              <w:spacing w:after="0" w:line="264"/>
+            </w:pPr>
+            <w:r>
+              <w:rPr>
+                <w:rFonts w:ascii="Arial" w:cs="Arial" w:eastAsia="Arial" w:hAnsi="Arial"/>
+                <w:sz w:val="24"/>
+                <w:szCs w:val="24"/>
+              </w:rPr>
+              <w:t xml:space="preserve">Pegawai perubatan, Pakar Perubatan Keluarga dan pegawai farmasi</w:t>
             </w:r>
           </w:p>
         </w:tc>
@@ -2260,7 +2256,7 @@
     </w:p>
     <w:p>
       <w:pPr>
-        <w:spacing w:after="160" w:line="360"/>
+        <w:spacing w:after="100" w:line="360"/>
         <w:jc w:val="both"/>
       </w:pPr>
       <w:r>
@@ -2279,7 +2275,7 @@
           <w:ilvl w:val="0"/>
           <w:numId w:val="5"/>
         </w:numPr>
-        <w:spacing w:after="80" w:line="360"/>
+        <w:spacing w:after="40" w:line="360"/>
         <w:jc w:val="both"/>
       </w:pPr>
       <w:r>
@@ -2298,7 +2294,7 @@
           <w:ilvl w:val="0"/>
           <w:numId w:val="5"/>
         </w:numPr>
-        <w:spacing w:after="80" w:line="360"/>
+        <w:spacing w:after="40" w:line="360"/>
         <w:jc w:val="both"/>
       </w:pPr>
       <w:r>
@@ -2317,7 +2313,7 @@
           <w:ilvl w:val="0"/>
           <w:numId w:val="5"/>
         </w:numPr>
-        <w:spacing w:after="80" w:line="360"/>
+        <w:spacing w:after="40" w:line="360"/>
         <w:jc w:val="both"/>
       </w:pPr>
       <w:r>
@@ -2336,7 +2332,7 @@
           <w:ilvl w:val="0"/>
           <w:numId w:val="5"/>
         </w:numPr>
-        <w:spacing w:after="80" w:line="360"/>
+        <w:spacing w:after="40" w:line="360"/>
         <w:jc w:val="both"/>
       </w:pPr>
       <w:r>
@@ -2355,7 +2351,7 @@
           <w:ilvl w:val="0"/>
           <w:numId w:val="5"/>
         </w:numPr>
-        <w:spacing w:after="80" w:line="360"/>
+        <w:spacing w:after="40" w:line="360"/>
         <w:jc w:val="both"/>
       </w:pPr>
       <w:r>
@@ -2364,7 +2360,7 @@
           <w:sz w:val="24"/>
           <w:szCs w:val="24"/>
         </w:rPr>
-        <w:t xml:space="preserve">Tiada rekod berpusat untuk mengukur pematuhan Clinical Pathway NAG 2024, dan tiada log audit bagi transaksi ubat.</w:t>
+        <w:t xml:space="preserve">Tiada rekod berpusat untuk mengukur pematuhan Clinical Pathway NAG 2024, dan pegawai perubatan merujuk dos antibiotik secara manual daripada buku garis panduan.</w:t>
       </w:r>
     </w:p>
     <w:p>
@@ -2391,7 +2387,7 @@
     </w:p>
     <w:p>
       <w:pPr>
-        <w:spacing w:after="160" w:line="360"/>
+        <w:spacing w:after="100" w:line="360"/>
         <w:jc w:val="both"/>
       </w:pPr>
       <w:r>
@@ -2452,15 +2448,16 @@
             </w:tcBorders>
             <w:shd w:fill="E3EFEA" w:color="auto" w:val="clear"/>
             <w:tcMar>
-              <w:top w:type="dxa" w:w="60"/>
-              <w:left w:type="dxa" w:w="100"/>
-              <w:bottom w:type="dxa" w:w="60"/>
-              <w:right w:type="dxa" w:w="100"/>
-            </w:tcMar>
-          </w:tcPr>
-          <w:p>
-            <w:pPr>
-              <w:spacing w:after="0" w:line="276"/>
+              <w:top w:type="dxa" w:w="40"/>
+              <w:left w:type="dxa" w:w="100"/>
+              <w:bottom w:type="dxa" w:w="40"/>
+              <w:right w:type="dxa" w:w="100"/>
+            </w:tcMar>
+          </w:tcPr>
+          <w:p>
+            <w:pPr>
+              <w:keepNext/>
+              <w:spacing w:after="0" w:line="264"/>
             </w:pPr>
             <w:r>
               <w:rPr>
@@ -2485,15 +2482,16 @@
             </w:tcBorders>
             <w:shd w:fill="E3EFEA" w:color="auto" w:val="clear"/>
             <w:tcMar>
-              <w:top w:type="dxa" w:w="60"/>
-              <w:left w:type="dxa" w:w="100"/>
-              <w:bottom w:type="dxa" w:w="60"/>
-              <w:right w:type="dxa" w:w="100"/>
-            </w:tcMar>
-          </w:tcPr>
-          <w:p>
-            <w:pPr>
-              <w:spacing w:after="0" w:line="276"/>
+              <w:top w:type="dxa" w:w="40"/>
+              <w:left w:type="dxa" w:w="100"/>
+              <w:bottom w:type="dxa" w:w="40"/>
+              <w:right w:type="dxa" w:w="100"/>
+            </w:tcMar>
+          </w:tcPr>
+          <w:p>
+            <w:pPr>
+              <w:keepNext/>
+              <w:spacing w:after="0" w:line="264"/>
             </w:pPr>
             <w:r>
               <w:rPr>
@@ -2518,15 +2516,16 @@
             </w:tcBorders>
             <w:shd w:fill="E3EFEA" w:color="auto" w:val="clear"/>
             <w:tcMar>
-              <w:top w:type="dxa" w:w="60"/>
-              <w:left w:type="dxa" w:w="100"/>
-              <w:bottom w:type="dxa" w:w="60"/>
-              <w:right w:type="dxa" w:w="100"/>
-            </w:tcMar>
-          </w:tcPr>
-          <w:p>
-            <w:pPr>
-              <w:spacing w:after="0" w:line="276"/>
+              <w:top w:type="dxa" w:w="40"/>
+              <w:left w:type="dxa" w:w="100"/>
+              <w:bottom w:type="dxa" w:w="40"/>
+              <w:right w:type="dxa" w:w="100"/>
+            </w:tcMar>
+          </w:tcPr>
+          <w:p>
+            <w:pPr>
+              <w:keepNext/>
+              <w:spacing w:after="0" w:line="264"/>
             </w:pPr>
             <w:r>
               <w:rPr>
@@ -2556,15 +2555,16 @@
               <w:right w:val="single" w:color="B7C4BF" w:sz="4"/>
             </w:tcBorders>
             <w:tcMar>
-              <w:top w:type="dxa" w:w="60"/>
-              <w:left w:type="dxa" w:w="100"/>
-              <w:bottom w:type="dxa" w:w="60"/>
-              <w:right w:type="dxa" w:w="100"/>
-            </w:tcMar>
-          </w:tcPr>
-          <w:p>
-            <w:pPr>
-              <w:spacing w:after="0" w:line="276"/>
+              <w:top w:type="dxa" w:w="40"/>
+              <w:left w:type="dxa" w:w="100"/>
+              <w:bottom w:type="dxa" w:w="40"/>
+              <w:right w:type="dxa" w:w="100"/>
+            </w:tcMar>
+          </w:tcPr>
+          <w:p>
+            <w:pPr>
+              <w:keepNext/>
+              <w:spacing w:after="0" w:line="264"/>
             </w:pPr>
             <w:r>
               <w:rPr>
@@ -2586,15 +2586,16 @@
               <w:right w:val="single" w:color="B7C4BF" w:sz="4"/>
             </w:tcBorders>
             <w:tcMar>
-              <w:top w:type="dxa" w:w="60"/>
-              <w:left w:type="dxa" w:w="100"/>
-              <w:bottom w:type="dxa" w:w="60"/>
-              <w:right w:type="dxa" w:w="100"/>
-            </w:tcMar>
-          </w:tcPr>
-          <w:p>
-            <w:pPr>
-              <w:spacing w:after="0" w:line="276"/>
+              <w:top w:type="dxa" w:w="40"/>
+              <w:left w:type="dxa" w:w="100"/>
+              <w:bottom w:type="dxa" w:w="40"/>
+              <w:right w:type="dxa" w:w="100"/>
+            </w:tcMar>
+          </w:tcPr>
+          <w:p>
+            <w:pPr>
+              <w:keepNext/>
+              <w:spacing w:after="0" w:line="264"/>
             </w:pPr>
             <w:r>
               <w:rPr>
@@ -2616,15 +2617,16 @@
               <w:right w:val="single" w:color="B7C4BF" w:sz="4"/>
             </w:tcBorders>
             <w:tcMar>
-              <w:top w:type="dxa" w:w="60"/>
-              <w:left w:type="dxa" w:w="100"/>
-              <w:bottom w:type="dxa" w:w="60"/>
-              <w:right w:type="dxa" w:w="100"/>
-            </w:tcMar>
-          </w:tcPr>
-          <w:p>
-            <w:pPr>
-              <w:spacing w:after="0" w:line="276"/>
+              <w:top w:type="dxa" w:w="40"/>
+              <w:left w:type="dxa" w:w="100"/>
+              <w:bottom w:type="dxa" w:w="40"/>
+              <w:right w:type="dxa" w:w="100"/>
+            </w:tcMar>
+          </w:tcPr>
+          <w:p>
+            <w:pPr>
+              <w:keepNext/>
+              <w:spacing w:after="0" w:line="264"/>
             </w:pPr>
             <w:r>
               <w:rPr>
@@ -2652,15 +2654,16 @@
               <w:right w:val="single" w:color="B7C4BF" w:sz="4"/>
             </w:tcBorders>
             <w:tcMar>
-              <w:top w:type="dxa" w:w="60"/>
-              <w:left w:type="dxa" w:w="100"/>
-              <w:bottom w:type="dxa" w:w="60"/>
-              <w:right w:type="dxa" w:w="100"/>
-            </w:tcMar>
-          </w:tcPr>
-          <w:p>
-            <w:pPr>
-              <w:spacing w:after="0" w:line="276"/>
+              <w:top w:type="dxa" w:w="40"/>
+              <w:left w:type="dxa" w:w="100"/>
+              <w:bottom w:type="dxa" w:w="40"/>
+              <w:right w:type="dxa" w:w="100"/>
+            </w:tcMar>
+          </w:tcPr>
+          <w:p>
+            <w:pPr>
+              <w:keepNext/>
+              <w:spacing w:after="0" w:line="264"/>
             </w:pPr>
             <w:r>
               <w:rPr>
@@ -2682,15 +2685,16 @@
               <w:right w:val="single" w:color="B7C4BF" w:sz="4"/>
             </w:tcBorders>
             <w:tcMar>
-              <w:top w:type="dxa" w:w="60"/>
-              <w:left w:type="dxa" w:w="100"/>
-              <w:bottom w:type="dxa" w:w="60"/>
-              <w:right w:type="dxa" w:w="100"/>
-            </w:tcMar>
-          </w:tcPr>
-          <w:p>
-            <w:pPr>
-              <w:spacing w:after="0" w:line="276"/>
+              <w:top w:type="dxa" w:w="40"/>
+              <w:left w:type="dxa" w:w="100"/>
+              <w:bottom w:type="dxa" w:w="40"/>
+              <w:right w:type="dxa" w:w="100"/>
+            </w:tcMar>
+          </w:tcPr>
+          <w:p>
+            <w:pPr>
+              <w:keepNext/>
+              <w:spacing w:after="0" w:line="264"/>
             </w:pPr>
             <w:r>
               <w:rPr>
@@ -2712,15 +2716,16 @@
               <w:right w:val="single" w:color="B7C4BF" w:sz="4"/>
             </w:tcBorders>
             <w:tcMar>
-              <w:top w:type="dxa" w:w="60"/>
-              <w:left w:type="dxa" w:w="100"/>
-              <w:bottom w:type="dxa" w:w="60"/>
-              <w:right w:type="dxa" w:w="100"/>
-            </w:tcMar>
-          </w:tcPr>
-          <w:p>
-            <w:pPr>
-              <w:spacing w:after="0" w:line="276"/>
+              <w:top w:type="dxa" w:w="40"/>
+              <w:left w:type="dxa" w:w="100"/>
+              <w:bottom w:type="dxa" w:w="40"/>
+              <w:right w:type="dxa" w:w="100"/>
+            </w:tcMar>
+          </w:tcPr>
+          <w:p>
+            <w:pPr>
+              <w:keepNext/>
+              <w:spacing w:after="0" w:line="264"/>
             </w:pPr>
             <w:r>
               <w:rPr>
@@ -2748,15 +2753,16 @@
               <w:right w:val="single" w:color="B7C4BF" w:sz="4"/>
             </w:tcBorders>
             <w:tcMar>
-              <w:top w:type="dxa" w:w="60"/>
-              <w:left w:type="dxa" w:w="100"/>
-              <w:bottom w:type="dxa" w:w="60"/>
-              <w:right w:type="dxa" w:w="100"/>
-            </w:tcMar>
-          </w:tcPr>
-          <w:p>
-            <w:pPr>
-              <w:spacing w:after="0" w:line="276"/>
+              <w:top w:type="dxa" w:w="40"/>
+              <w:left w:type="dxa" w:w="100"/>
+              <w:bottom w:type="dxa" w:w="40"/>
+              <w:right w:type="dxa" w:w="100"/>
+            </w:tcMar>
+          </w:tcPr>
+          <w:p>
+            <w:pPr>
+              <w:keepNext/>
+              <w:spacing w:after="0" w:line="264"/>
             </w:pPr>
             <w:r>
               <w:rPr>
@@ -2778,15 +2784,16 @@
               <w:right w:val="single" w:color="B7C4BF" w:sz="4"/>
             </w:tcBorders>
             <w:tcMar>
-              <w:top w:type="dxa" w:w="60"/>
-              <w:left w:type="dxa" w:w="100"/>
-              <w:bottom w:type="dxa" w:w="60"/>
-              <w:right w:type="dxa" w:w="100"/>
-            </w:tcMar>
-          </w:tcPr>
-          <w:p>
-            <w:pPr>
-              <w:spacing w:after="0" w:line="276"/>
+              <w:top w:type="dxa" w:w="40"/>
+              <w:left w:type="dxa" w:w="100"/>
+              <w:bottom w:type="dxa" w:w="40"/>
+              <w:right w:type="dxa" w:w="100"/>
+            </w:tcMar>
+          </w:tcPr>
+          <w:p>
+            <w:pPr>
+              <w:keepNext/>
+              <w:spacing w:after="0" w:line="264"/>
             </w:pPr>
             <w:r>
               <w:rPr>
@@ -2808,15 +2815,16 @@
               <w:right w:val="single" w:color="B7C4BF" w:sz="4"/>
             </w:tcBorders>
             <w:tcMar>
-              <w:top w:type="dxa" w:w="60"/>
-              <w:left w:type="dxa" w:w="100"/>
-              <w:bottom w:type="dxa" w:w="60"/>
-              <w:right w:type="dxa" w:w="100"/>
-            </w:tcMar>
-          </w:tcPr>
-          <w:p>
-            <w:pPr>
-              <w:spacing w:after="0" w:line="276"/>
+              <w:top w:type="dxa" w:w="40"/>
+              <w:left w:type="dxa" w:w="100"/>
+              <w:bottom w:type="dxa" w:w="40"/>
+              <w:right w:type="dxa" w:w="100"/>
+            </w:tcMar>
+          </w:tcPr>
+          <w:p>
+            <w:pPr>
+              <w:keepNext/>
+              <w:spacing w:after="0" w:line="264"/>
             </w:pPr>
             <w:r>
               <w:rPr>
@@ -2844,15 +2852,16 @@
               <w:right w:val="single" w:color="B7C4BF" w:sz="4"/>
             </w:tcBorders>
             <w:tcMar>
-              <w:top w:type="dxa" w:w="60"/>
-              <w:left w:type="dxa" w:w="100"/>
-              <w:bottom w:type="dxa" w:w="60"/>
-              <w:right w:type="dxa" w:w="100"/>
-            </w:tcMar>
-          </w:tcPr>
-          <w:p>
-            <w:pPr>
-              <w:spacing w:after="0" w:line="276"/>
+              <w:top w:type="dxa" w:w="40"/>
+              <w:left w:type="dxa" w:w="100"/>
+              <w:bottom w:type="dxa" w:w="40"/>
+              <w:right w:type="dxa" w:w="100"/>
+            </w:tcMar>
+          </w:tcPr>
+          <w:p>
+            <w:pPr>
+              <w:keepNext/>
+              <w:spacing w:after="0" w:line="264"/>
             </w:pPr>
             <w:r>
               <w:rPr>
@@ -2874,15 +2883,16 @@
               <w:right w:val="single" w:color="B7C4BF" w:sz="4"/>
             </w:tcBorders>
             <w:tcMar>
-              <w:top w:type="dxa" w:w="60"/>
-              <w:left w:type="dxa" w:w="100"/>
-              <w:bottom w:type="dxa" w:w="60"/>
-              <w:right w:type="dxa" w:w="100"/>
-            </w:tcMar>
-          </w:tcPr>
-          <w:p>
-            <w:pPr>
-              <w:spacing w:after="0" w:line="276"/>
+              <w:top w:type="dxa" w:w="40"/>
+              <w:left w:type="dxa" w:w="100"/>
+              <w:bottom w:type="dxa" w:w="40"/>
+              <w:right w:type="dxa" w:w="100"/>
+            </w:tcMar>
+          </w:tcPr>
+          <w:p>
+            <w:pPr>
+              <w:keepNext/>
+              <w:spacing w:after="0" w:line="264"/>
             </w:pPr>
             <w:r>
               <w:rPr>
@@ -2904,15 +2914,16 @@
               <w:right w:val="single" w:color="B7C4BF" w:sz="4"/>
             </w:tcBorders>
             <w:tcMar>
-              <w:top w:type="dxa" w:w="60"/>
-              <w:left w:type="dxa" w:w="100"/>
-              <w:bottom w:type="dxa" w:w="60"/>
-              <w:right w:type="dxa" w:w="100"/>
-            </w:tcMar>
-          </w:tcPr>
-          <w:p>
-            <w:pPr>
-              <w:spacing w:after="0" w:line="276"/>
+              <w:top w:type="dxa" w:w="40"/>
+              <w:left w:type="dxa" w:w="100"/>
+              <w:bottom w:type="dxa" w:w="40"/>
+              <w:right w:type="dxa" w:w="100"/>
+            </w:tcMar>
+          </w:tcPr>
+          <w:p>
+            <w:pPr>
+              <w:keepNext/>
+              <w:spacing w:after="0" w:line="264"/>
             </w:pPr>
             <w:r>
               <w:rPr>
@@ -2940,15 +2951,16 @@
               <w:right w:val="single" w:color="B7C4BF" w:sz="4"/>
             </w:tcBorders>
             <w:tcMar>
-              <w:top w:type="dxa" w:w="60"/>
-              <w:left w:type="dxa" w:w="100"/>
-              <w:bottom w:type="dxa" w:w="60"/>
-              <w:right w:type="dxa" w:w="100"/>
-            </w:tcMar>
-          </w:tcPr>
-          <w:p>
-            <w:pPr>
-              <w:spacing w:after="0" w:line="276"/>
+              <w:top w:type="dxa" w:w="40"/>
+              <w:left w:type="dxa" w:w="100"/>
+              <w:bottom w:type="dxa" w:w="40"/>
+              <w:right w:type="dxa" w:w="100"/>
+            </w:tcMar>
+          </w:tcPr>
+          <w:p>
+            <w:pPr>
+              <w:keepNext/>
+              <w:spacing w:after="0" w:line="264"/>
             </w:pPr>
             <w:r>
               <w:rPr>
@@ -2970,15 +2982,16 @@
               <w:right w:val="single" w:color="B7C4BF" w:sz="4"/>
             </w:tcBorders>
             <w:tcMar>
-              <w:top w:type="dxa" w:w="60"/>
-              <w:left w:type="dxa" w:w="100"/>
-              <w:bottom w:type="dxa" w:w="60"/>
-              <w:right w:type="dxa" w:w="100"/>
-            </w:tcMar>
-          </w:tcPr>
-          <w:p>
-            <w:pPr>
-              <w:spacing w:after="0" w:line="276"/>
+              <w:top w:type="dxa" w:w="40"/>
+              <w:left w:type="dxa" w:w="100"/>
+              <w:bottom w:type="dxa" w:w="40"/>
+              <w:right w:type="dxa" w:w="100"/>
+            </w:tcMar>
+          </w:tcPr>
+          <w:p>
+            <w:pPr>
+              <w:keepNext/>
+              <w:spacing w:after="0" w:line="264"/>
             </w:pPr>
             <w:r>
               <w:rPr>
@@ -3000,15 +3013,16 @@
               <w:right w:val="single" w:color="B7C4BF" w:sz="4"/>
             </w:tcBorders>
             <w:tcMar>
-              <w:top w:type="dxa" w:w="60"/>
-              <w:left w:type="dxa" w:w="100"/>
-              <w:bottom w:type="dxa" w:w="60"/>
-              <w:right w:type="dxa" w:w="100"/>
-            </w:tcMar>
-          </w:tcPr>
-          <w:p>
-            <w:pPr>
-              <w:spacing w:after="0" w:line="276"/>
+              <w:top w:type="dxa" w:w="40"/>
+              <w:left w:type="dxa" w:w="100"/>
+              <w:bottom w:type="dxa" w:w="40"/>
+              <w:right w:type="dxa" w:w="100"/>
+            </w:tcMar>
+          </w:tcPr>
+          <w:p>
+            <w:pPr>
+              <w:keepNext/>
+              <w:spacing w:after="0" w:line="264"/>
             </w:pPr>
             <w:r>
               <w:rPr>
@@ -3036,23 +3050,24 @@
               <w:right w:val="single" w:color="B7C4BF" w:sz="4"/>
             </w:tcBorders>
             <w:tcMar>
-              <w:top w:type="dxa" w:w="60"/>
-              <w:left w:type="dxa" w:w="100"/>
-              <w:bottom w:type="dxa" w:w="60"/>
-              <w:right w:type="dxa" w:w="100"/>
-            </w:tcMar>
-          </w:tcPr>
-          <w:p>
-            <w:pPr>
-              <w:spacing w:after="0" w:line="276"/>
-            </w:pPr>
-            <w:r>
-              <w:rPr>
-                <w:rFonts w:ascii="Arial" w:cs="Arial" w:eastAsia="Arial" w:hAnsi="Arial"/>
-                <w:sz w:val="24"/>
-                <w:szCs w:val="24"/>
-              </w:rPr>
-              <w:t xml:space="preserve">Aliran kerja UKK</w:t>
+              <w:top w:type="dxa" w:w="40"/>
+              <w:left w:type="dxa" w:w="100"/>
+              <w:bottom w:type="dxa" w:w="40"/>
+              <w:right w:type="dxa" w:w="100"/>
+            </w:tcMar>
+          </w:tcPr>
+          <w:p>
+            <w:pPr>
+              <w:keepNext/>
+              <w:spacing w:after="0" w:line="264"/>
+            </w:pPr>
+            <w:r>
+              <w:rPr>
+                <w:rFonts w:ascii="Arial" w:cs="Arial" w:eastAsia="Arial" w:hAnsi="Arial"/>
+                <w:sz w:val="24"/>
+                <w:szCs w:val="24"/>
+              </w:rPr>
+              <w:t xml:space="preserve">Dos antibiotik</w:t>
             </w:r>
           </w:p>
         </w:tc>
@@ -3066,23 +3081,24 @@
               <w:right w:val="single" w:color="B7C4BF" w:sz="4"/>
             </w:tcBorders>
             <w:tcMar>
-              <w:top w:type="dxa" w:w="60"/>
-              <w:left w:type="dxa" w:w="100"/>
-              <w:bottom w:type="dxa" w:w="60"/>
-              <w:right w:type="dxa" w:w="100"/>
-            </w:tcMar>
-          </w:tcPr>
-          <w:p>
-            <w:pPr>
-              <w:spacing w:after="0" w:line="276"/>
-            </w:pPr>
-            <w:r>
-              <w:rPr>
-                <w:rFonts w:ascii="Arial" w:cs="Arial" w:eastAsia="Arial" w:hAnsi="Arial"/>
-                <w:sz w:val="24"/>
-                <w:szCs w:val="24"/>
-              </w:rPr>
-              <w:t xml:space="preserve">12 langkah, 1 kitaran kerja semula</w:t>
+              <w:top w:type="dxa" w:w="40"/>
+              <w:left w:type="dxa" w:w="100"/>
+              <w:bottom w:type="dxa" w:w="40"/>
+              <w:right w:type="dxa" w:w="100"/>
+            </w:tcMar>
+          </w:tcPr>
+          <w:p>
+            <w:pPr>
+              <w:keepNext/>
+              <w:spacing w:after="0" w:line="264"/>
+            </w:pPr>
+            <w:r>
+              <w:rPr>
+                <w:rFonts w:ascii="Arial" w:cs="Arial" w:eastAsia="Arial" w:hAnsi="Arial"/>
+                <w:sz w:val="24"/>
+                <w:szCs w:val="24"/>
+              </w:rPr>
+              <w:t xml:space="preserve">Dirujuk secara manual daripada buku garis panduan</w:t>
             </w:r>
           </w:p>
         </w:tc>
@@ -3096,23 +3112,24 @@
               <w:right w:val="single" w:color="B7C4BF" w:sz="4"/>
             </w:tcBorders>
             <w:tcMar>
-              <w:top w:type="dxa" w:w="60"/>
-              <w:left w:type="dxa" w:w="100"/>
-              <w:bottom w:type="dxa" w:w="60"/>
-              <w:right w:type="dxa" w:w="100"/>
-            </w:tcMar>
-          </w:tcPr>
-          <w:p>
-            <w:pPr>
-              <w:spacing w:after="0" w:line="276"/>
-            </w:pPr>
-            <w:r>
-              <w:rPr>
-                <w:rFonts w:ascii="Arial" w:cs="Arial" w:eastAsia="Arial" w:hAnsi="Arial"/>
-                <w:sz w:val="24"/>
-                <w:szCs w:val="24"/>
-              </w:rPr>
-              <w:t xml:space="preserve">10 langkah, tiada kitaran kerja semula</w:t>
+              <w:top w:type="dxa" w:w="40"/>
+              <w:left w:type="dxa" w:w="100"/>
+              <w:bottom w:type="dxa" w:w="40"/>
+              <w:right w:type="dxa" w:w="100"/>
+            </w:tcMar>
+          </w:tcPr>
+          <w:p>
+            <w:pPr>
+              <w:keepNext/>
+              <w:spacing w:after="0" w:line="264"/>
+            </w:pPr>
+            <w:r>
+              <w:rPr>
+                <w:rFonts w:ascii="Arial" w:cs="Arial" w:eastAsia="Arial" w:hAnsi="Arial"/>
+                <w:sz w:val="24"/>
+                <w:szCs w:val="24"/>
+              </w:rPr>
+              <w:t xml:space="preserve">Dicadangkan oleh sistem mengikut NAG 2024 dan disahkan oleh pegawai perubatan</w:t>
             </w:r>
           </w:p>
         </w:tc>
@@ -3132,15 +3149,115 @@
               <w:right w:val="single" w:color="B7C4BF" w:sz="4"/>
             </w:tcBorders>
             <w:tcMar>
-              <w:top w:type="dxa" w:w="60"/>
-              <w:left w:type="dxa" w:w="100"/>
-              <w:bottom w:type="dxa" w:w="60"/>
-              <w:right w:type="dxa" w:w="100"/>
-            </w:tcMar>
-          </w:tcPr>
-          <w:p>
-            <w:pPr>
-              <w:spacing w:after="0" w:line="276"/>
+              <w:top w:type="dxa" w:w="40"/>
+              <w:left w:type="dxa" w:w="100"/>
+              <w:bottom w:type="dxa" w:w="40"/>
+              <w:right w:type="dxa" w:w="100"/>
+            </w:tcMar>
+          </w:tcPr>
+          <w:p>
+            <w:pPr>
+              <w:keepNext/>
+              <w:spacing w:after="0" w:line="264"/>
+            </w:pPr>
+            <w:r>
+              <w:rPr>
+                <w:rFonts w:ascii="Arial" w:cs="Arial" w:eastAsia="Arial" w:hAnsi="Arial"/>
+                <w:sz w:val="24"/>
+                <w:szCs w:val="24"/>
+              </w:rPr>
+              <w:t xml:space="preserve">Aliran kerja UKK</w:t>
+            </w:r>
+          </w:p>
+        </w:tc>
+        <w:tc>
+          <w:tcPr>
+            <w:tcW w:type="dxa" w:w="3363"/>
+            <w:tcBorders>
+              <w:top w:val="single" w:color="B7C4BF" w:sz="4"/>
+              <w:left w:val="single" w:color="B7C4BF" w:sz="4"/>
+              <w:bottom w:val="single" w:color="B7C4BF" w:sz="4"/>
+              <w:right w:val="single" w:color="B7C4BF" w:sz="4"/>
+            </w:tcBorders>
+            <w:tcMar>
+              <w:top w:type="dxa" w:w="40"/>
+              <w:left w:type="dxa" w:w="100"/>
+              <w:bottom w:type="dxa" w:w="40"/>
+              <w:right w:type="dxa" w:w="100"/>
+            </w:tcMar>
+          </w:tcPr>
+          <w:p>
+            <w:pPr>
+              <w:keepNext/>
+              <w:spacing w:after="0" w:line="264"/>
+            </w:pPr>
+            <w:r>
+              <w:rPr>
+                <w:rFonts w:ascii="Arial" w:cs="Arial" w:eastAsia="Arial" w:hAnsi="Arial"/>
+                <w:sz w:val="24"/>
+                <w:szCs w:val="24"/>
+              </w:rPr>
+              <w:t xml:space="preserve">12 langkah, 1 kitaran kerja semula</w:t>
+            </w:r>
+          </w:p>
+        </w:tc>
+        <w:tc>
+          <w:tcPr>
+            <w:tcW w:type="dxa" w:w="3363"/>
+            <w:tcBorders>
+              <w:top w:val="single" w:color="B7C4BF" w:sz="4"/>
+              <w:left w:val="single" w:color="B7C4BF" w:sz="4"/>
+              <w:bottom w:val="single" w:color="B7C4BF" w:sz="4"/>
+              <w:right w:val="single" w:color="B7C4BF" w:sz="4"/>
+            </w:tcBorders>
+            <w:tcMar>
+              <w:top w:type="dxa" w:w="40"/>
+              <w:left w:type="dxa" w:w="100"/>
+              <w:bottom w:type="dxa" w:w="40"/>
+              <w:right w:type="dxa" w:w="100"/>
+            </w:tcMar>
+          </w:tcPr>
+          <w:p>
+            <w:pPr>
+              <w:keepNext/>
+              <w:spacing w:after="0" w:line="264"/>
+            </w:pPr>
+            <w:r>
+              <w:rPr>
+                <w:rFonts w:ascii="Arial" w:cs="Arial" w:eastAsia="Arial" w:hAnsi="Arial"/>
+                <w:sz w:val="24"/>
+                <w:szCs w:val="24"/>
+              </w:rPr>
+              <w:t xml:space="preserve">10 langkah, tiada kitaran kerja semula</w:t>
+            </w:r>
+          </w:p>
+        </w:tc>
+      </w:tr>
+      <w:tr>
+        <w:trPr>
+          <w:cantSplit/>
+          <w:tblHeader w:val="off"/>
+        </w:trPr>
+        <w:tc>
+          <w:tcPr>
+            <w:tcW w:type="dxa" w:w="2300"/>
+            <w:tcBorders>
+              <w:top w:val="single" w:color="B7C4BF" w:sz="4"/>
+              <w:left w:val="single" w:color="B7C4BF" w:sz="4"/>
+              <w:bottom w:val="single" w:color="B7C4BF" w:sz="4"/>
+              <w:right w:val="single" w:color="B7C4BF" w:sz="4"/>
+            </w:tcBorders>
+            <w:tcMar>
+              <w:top w:type="dxa" w:w="40"/>
+              <w:left w:type="dxa" w:w="100"/>
+              <w:bottom w:type="dxa" w:w="40"/>
+              <w:right w:type="dxa" w:w="100"/>
+            </w:tcMar>
+          </w:tcPr>
+          <w:p>
+            <w:pPr>
+              <w:keepNext w:val="false"/>
+              <w:spacing w:after="0" w:line="264"/>
             </w:pPr>
             <w:r>
               <w:rPr>
@@ -3162,15 +3279,16 @@
               <w:right w:val="single" w:color="B7C4BF" w:sz="4"/>
             </w:tcBorders>
             <w:tcMar>
-              <w:top w:type="dxa" w:w="60"/>
-              <w:left w:type="dxa" w:w="100"/>
-              <w:bottom w:type="dxa" w:w="60"/>
-              <w:right w:type="dxa" w:w="100"/>
-            </w:tcMar>
-          </w:tcPr>
-          <w:p>
-            <w:pPr>
-              <w:spacing w:after="0" w:line="276"/>
+              <w:top w:type="dxa" w:w="40"/>
+              <w:left w:type="dxa" w:w="100"/>
+              <w:bottom w:type="dxa" w:w="40"/>
+              <w:right w:type="dxa" w:w="100"/>
+            </w:tcMar>
+          </w:tcPr>
+          <w:p>
+            <w:pPr>
+              <w:keepNext w:val="false"/>
+              <w:spacing w:after="0" w:line="264"/>
             </w:pPr>
             <w:r>
               <w:rPr>
@@ -3192,15 +3310,16 @@
               <w:right w:val="single" w:color="B7C4BF" w:sz="4"/>
             </w:tcBorders>
             <w:tcMar>
-              <w:top w:type="dxa" w:w="60"/>
-              <w:left w:type="dxa" w:w="100"/>
-              <w:bottom w:type="dxa" w:w="60"/>
-              <w:right w:type="dxa" w:w="100"/>
-            </w:tcMar>
-          </w:tcPr>
-          <w:p>
-            <w:pPr>
-              <w:spacing w:after="0" w:line="276"/>
+              <w:top w:type="dxa" w:w="40"/>
+              <w:left w:type="dxa" w:w="100"/>
+              <w:bottom w:type="dxa" w:w="40"/>
+              <w:right w:type="dxa" w:w="100"/>
+            </w:tcMar>
+          </w:tcPr>
+          <w:p>
+            <w:pPr>
+              <w:keepNext w:val="false"/>
+              <w:spacing w:after="0" w:line="264"/>
             </w:pPr>
             <w:r>
               <w:rPr>
@@ -3221,7 +3340,7 @@
     </w:p>
     <w:p>
       <w:pPr>
-        <w:spacing w:after="160" w:line="360"/>
+        <w:spacing w:after="100" w:line="360"/>
         <w:jc w:val="both"/>
       </w:pPr>
       <w:r>
@@ -3235,7 +3354,7 @@
     </w:p>
     <w:p>
       <w:pPr>
-        <w:spacing w:after="160" w:before="60"/>
+        <w:spacing w:after="100" w:before="40"/>
         <w:jc w:val="center"/>
       </w:pPr>
       <w:r>
@@ -3281,7 +3400,7 @@
     </w:p>
     <w:p>
       <w:pPr>
-        <w:spacing w:after="160" w:before="60"/>
+        <w:spacing w:after="100" w:before="40"/>
         <w:jc w:val="center"/>
       </w:pPr>
       <w:r>
@@ -3327,7 +3446,7 @@
     </w:p>
     <w:p>
       <w:pPr>
-        <w:spacing w:after="160" w:before="60"/>
+        <w:spacing w:after="100" w:before="40"/>
         <w:jc w:val="center"/>
       </w:pPr>
       <w:r>
@@ -3373,7 +3492,7 @@
     </w:p>
     <w:p>
       <w:pPr>
-        <w:spacing w:after="160" w:before="60"/>
+        <w:spacing w:after="100" w:before="40"/>
         <w:jc w:val="center"/>
       </w:pPr>
       <w:r>
@@ -3435,7 +3554,7 @@
     </w:p>
     <w:p>
       <w:pPr>
-        <w:spacing w:after="160" w:line="360"/>
+        <w:spacing w:after="100" w:line="360"/>
         <w:jc w:val="both"/>
       </w:pPr>
       <w:r>
@@ -3497,15 +3616,16 @@
             </w:tcBorders>
             <w:shd w:fill="E3EFEA" w:color="auto" w:val="clear"/>
             <w:tcMar>
-              <w:top w:type="dxa" w:w="60"/>
-              <w:left w:type="dxa" w:w="100"/>
-              <w:bottom w:type="dxa" w:w="60"/>
-              <w:right w:type="dxa" w:w="100"/>
-            </w:tcMar>
-          </w:tcPr>
-          <w:p>
-            <w:pPr>
-              <w:spacing w:after="0" w:line="276"/>
+              <w:top w:type="dxa" w:w="40"/>
+              <w:left w:type="dxa" w:w="100"/>
+              <w:bottom w:type="dxa" w:w="40"/>
+              <w:right w:type="dxa" w:w="100"/>
+            </w:tcMar>
+          </w:tcPr>
+          <w:p>
+            <w:pPr>
+              <w:keepNext w:val="false"/>
+              <w:spacing w:after="0" w:line="264"/>
             </w:pPr>
             <w:r>
               <w:rPr>
@@ -3530,15 +3650,16 @@
             </w:tcBorders>
             <w:shd w:fill="E3EFEA" w:color="auto" w:val="clear"/>
             <w:tcMar>
-              <w:top w:type="dxa" w:w="60"/>
-              <w:left w:type="dxa" w:w="100"/>
-              <w:bottom w:type="dxa" w:w="60"/>
-              <w:right w:type="dxa" w:w="100"/>
-            </w:tcMar>
-          </w:tcPr>
-          <w:p>
-            <w:pPr>
-              <w:spacing w:after="0" w:line="276"/>
+              <w:top w:type="dxa" w:w="40"/>
+              <w:left w:type="dxa" w:w="100"/>
+              <w:bottom w:type="dxa" w:w="40"/>
+              <w:right w:type="dxa" w:w="100"/>
+            </w:tcMar>
+          </w:tcPr>
+          <w:p>
+            <w:pPr>
+              <w:keepNext w:val="false"/>
+              <w:spacing w:after="0" w:line="264"/>
             </w:pPr>
             <w:r>
               <w:rPr>
@@ -3563,15 +3684,16 @@
             </w:tcBorders>
             <w:shd w:fill="E3EFEA" w:color="auto" w:val="clear"/>
             <w:tcMar>
-              <w:top w:type="dxa" w:w="60"/>
-              <w:left w:type="dxa" w:w="100"/>
-              <w:bottom w:type="dxa" w:w="60"/>
-              <w:right w:type="dxa" w:w="100"/>
-            </w:tcMar>
-          </w:tcPr>
-          <w:p>
-            <w:pPr>
-              <w:spacing w:after="0" w:line="276"/>
+              <w:top w:type="dxa" w:w="40"/>
+              <w:left w:type="dxa" w:w="100"/>
+              <w:bottom w:type="dxa" w:w="40"/>
+              <w:right w:type="dxa" w:w="100"/>
+            </w:tcMar>
+          </w:tcPr>
+          <w:p>
+            <w:pPr>
+              <w:keepNext w:val="false"/>
+              <w:spacing w:after="0" w:line="264"/>
             </w:pPr>
             <w:r>
               <w:rPr>
@@ -3596,15 +3718,16 @@
             </w:tcBorders>
             <w:shd w:fill="E3EFEA" w:color="auto" w:val="clear"/>
             <w:tcMar>
-              <w:top w:type="dxa" w:w="60"/>
-              <w:left w:type="dxa" w:w="100"/>
-              <w:bottom w:type="dxa" w:w="60"/>
-              <w:right w:type="dxa" w:w="100"/>
-            </w:tcMar>
-          </w:tcPr>
-          <w:p>
-            <w:pPr>
-              <w:spacing w:after="0" w:line="276"/>
+              <w:top w:type="dxa" w:w="40"/>
+              <w:left w:type="dxa" w:w="100"/>
+              <w:bottom w:type="dxa" w:w="40"/>
+              <w:right w:type="dxa" w:w="100"/>
+            </w:tcMar>
+          </w:tcPr>
+          <w:p>
+            <w:pPr>
+              <w:keepNext w:val="false"/>
+              <w:spacing w:after="0" w:line="264"/>
             </w:pPr>
             <w:r>
               <w:rPr>
@@ -3634,15 +3757,16 @@
               <w:right w:val="single" w:color="B7C4BF" w:sz="4"/>
             </w:tcBorders>
             <w:tcMar>
-              <w:top w:type="dxa" w:w="60"/>
-              <w:left w:type="dxa" w:w="100"/>
-              <w:bottom w:type="dxa" w:w="60"/>
-              <w:right w:type="dxa" w:w="100"/>
-            </w:tcMar>
-          </w:tcPr>
-          <w:p>
-            <w:pPr>
-              <w:spacing w:after="0" w:line="276"/>
+              <w:top w:type="dxa" w:w="40"/>
+              <w:left w:type="dxa" w:w="100"/>
+              <w:bottom w:type="dxa" w:w="40"/>
+              <w:right w:type="dxa" w:w="100"/>
+            </w:tcMar>
+          </w:tcPr>
+          <w:p>
+            <w:pPr>
+              <w:keepNext w:val="false"/>
+              <w:spacing w:after="0" w:line="264"/>
             </w:pPr>
             <w:r>
               <w:rPr>
@@ -3664,15 +3788,16 @@
               <w:right w:val="single" w:color="B7C4BF" w:sz="4"/>
             </w:tcBorders>
             <w:tcMar>
-              <w:top w:type="dxa" w:w="60"/>
-              <w:left w:type="dxa" w:w="100"/>
-              <w:bottom w:type="dxa" w:w="60"/>
-              <w:right w:type="dxa" w:w="100"/>
-            </w:tcMar>
-          </w:tcPr>
-          <w:p>
-            <w:pPr>
-              <w:spacing w:after="0" w:line="276"/>
+              <w:top w:type="dxa" w:w="40"/>
+              <w:left w:type="dxa" w:w="100"/>
+              <w:bottom w:type="dxa" w:w="40"/>
+              <w:right w:type="dxa" w:w="100"/>
+            </w:tcMar>
+          </w:tcPr>
+          <w:p>
+            <w:pPr>
+              <w:keepNext w:val="false"/>
+              <w:spacing w:after="0" w:line="264"/>
             </w:pPr>
             <w:r>
               <w:rPr>
@@ -3694,15 +3819,16 @@
               <w:right w:val="single" w:color="B7C4BF" w:sz="4"/>
             </w:tcBorders>
             <w:tcMar>
-              <w:top w:type="dxa" w:w="60"/>
-              <w:left w:type="dxa" w:w="100"/>
-              <w:bottom w:type="dxa" w:w="60"/>
-              <w:right w:type="dxa" w:w="100"/>
-            </w:tcMar>
-          </w:tcPr>
-          <w:p>
-            <w:pPr>
-              <w:spacing w:after="0" w:line="276"/>
+              <w:top w:type="dxa" w:w="40"/>
+              <w:left w:type="dxa" w:w="100"/>
+              <w:bottom w:type="dxa" w:w="40"/>
+              <w:right w:type="dxa" w:w="100"/>
+            </w:tcMar>
+          </w:tcPr>
+          <w:p>
+            <w:pPr>
+              <w:keepNext w:val="false"/>
+              <w:spacing w:after="0" w:line="264"/>
             </w:pPr>
             <w:r>
               <w:rPr>
@@ -3724,15 +3850,16 @@
               <w:right w:val="single" w:color="B7C4BF" w:sz="4"/>
             </w:tcBorders>
             <w:tcMar>
-              <w:top w:type="dxa" w:w="60"/>
-              <w:left w:type="dxa" w:w="100"/>
-              <w:bottom w:type="dxa" w:w="60"/>
-              <w:right w:type="dxa" w:w="100"/>
-            </w:tcMar>
-          </w:tcPr>
-          <w:p>
-            <w:pPr>
-              <w:spacing w:after="0" w:line="276"/>
+              <w:top w:type="dxa" w:w="40"/>
+              <w:left w:type="dxa" w:w="100"/>
+              <w:bottom w:type="dxa" w:w="40"/>
+              <w:right w:type="dxa" w:w="100"/>
+            </w:tcMar>
+          </w:tcPr>
+          <w:p>
+            <w:pPr>
+              <w:keepNext w:val="false"/>
+              <w:spacing w:after="0" w:line="264"/>
             </w:pPr>
             <w:r>
               <w:rPr>
@@ -3760,15 +3887,16 @@
               <w:right w:val="single" w:color="B7C4BF" w:sz="4"/>
             </w:tcBorders>
             <w:tcMar>
-              <w:top w:type="dxa" w:w="60"/>
-              <w:left w:type="dxa" w:w="100"/>
-              <w:bottom w:type="dxa" w:w="60"/>
-              <w:right w:type="dxa" w:w="100"/>
-            </w:tcMar>
-          </w:tcPr>
-          <w:p>
-            <w:pPr>
-              <w:spacing w:after="0" w:line="276"/>
+              <w:top w:type="dxa" w:w="40"/>
+              <w:left w:type="dxa" w:w="100"/>
+              <w:bottom w:type="dxa" w:w="40"/>
+              <w:right w:type="dxa" w:w="100"/>
+            </w:tcMar>
+          </w:tcPr>
+          <w:p>
+            <w:pPr>
+              <w:keepNext w:val="false"/>
+              <w:spacing w:after="0" w:line="264"/>
             </w:pPr>
             <w:r>
               <w:rPr>
@@ -3790,15 +3918,16 @@
               <w:right w:val="single" w:color="B7C4BF" w:sz="4"/>
             </w:tcBorders>
             <w:tcMar>
-              <w:top w:type="dxa" w:w="60"/>
-              <w:left w:type="dxa" w:w="100"/>
-              <w:bottom w:type="dxa" w:w="60"/>
-              <w:right w:type="dxa" w:w="100"/>
-            </w:tcMar>
-          </w:tcPr>
-          <w:p>
-            <w:pPr>
-              <w:spacing w:after="0" w:line="276"/>
+              <w:top w:type="dxa" w:w="40"/>
+              <w:left w:type="dxa" w:w="100"/>
+              <w:bottom w:type="dxa" w:w="40"/>
+              <w:right w:type="dxa" w:w="100"/>
+            </w:tcMar>
+          </w:tcPr>
+          <w:p>
+            <w:pPr>
+              <w:keepNext w:val="false"/>
+              <w:spacing w:after="0" w:line="264"/>
             </w:pPr>
             <w:r>
               <w:rPr>
@@ -3820,15 +3949,16 @@
               <w:right w:val="single" w:color="B7C4BF" w:sz="4"/>
             </w:tcBorders>
             <w:tcMar>
-              <w:top w:type="dxa" w:w="60"/>
-              <w:left w:type="dxa" w:w="100"/>
-              <w:bottom w:type="dxa" w:w="60"/>
-              <w:right w:type="dxa" w:w="100"/>
-            </w:tcMar>
-          </w:tcPr>
-          <w:p>
-            <w:pPr>
-              <w:spacing w:after="0" w:line="276"/>
+              <w:top w:type="dxa" w:w="40"/>
+              <w:left w:type="dxa" w:w="100"/>
+              <w:bottom w:type="dxa" w:w="40"/>
+              <w:right w:type="dxa" w:w="100"/>
+            </w:tcMar>
+          </w:tcPr>
+          <w:p>
+            <w:pPr>
+              <w:keepNext w:val="false"/>
+              <w:spacing w:after="0" w:line="264"/>
             </w:pPr>
             <w:r>
               <w:rPr>
@@ -3850,15 +3980,16 @@
               <w:right w:val="single" w:color="B7C4BF" w:sz="4"/>
             </w:tcBorders>
             <w:tcMar>
-              <w:top w:type="dxa" w:w="60"/>
-              <w:left w:type="dxa" w:w="100"/>
-              <w:bottom w:type="dxa" w:w="60"/>
-              <w:right w:type="dxa" w:w="100"/>
-            </w:tcMar>
-          </w:tcPr>
-          <w:p>
-            <w:pPr>
-              <w:spacing w:after="0" w:line="276"/>
+              <w:top w:type="dxa" w:w="40"/>
+              <w:left w:type="dxa" w:w="100"/>
+              <w:bottom w:type="dxa" w:w="40"/>
+              <w:right w:type="dxa" w:w="100"/>
+            </w:tcMar>
+          </w:tcPr>
+          <w:p>
+            <w:pPr>
+              <w:keepNext w:val="false"/>
+              <w:spacing w:after="0" w:line="264"/>
             </w:pPr>
             <w:r>
               <w:rPr>
@@ -3886,15 +4017,16 @@
               <w:right w:val="single" w:color="B7C4BF" w:sz="4"/>
             </w:tcBorders>
             <w:tcMar>
-              <w:top w:type="dxa" w:w="60"/>
-              <w:left w:type="dxa" w:w="100"/>
-              <w:bottom w:type="dxa" w:w="60"/>
-              <w:right w:type="dxa" w:w="100"/>
-            </w:tcMar>
-          </w:tcPr>
-          <w:p>
-            <w:pPr>
-              <w:spacing w:after="0" w:line="276"/>
+              <w:top w:type="dxa" w:w="40"/>
+              <w:left w:type="dxa" w:w="100"/>
+              <w:bottom w:type="dxa" w:w="40"/>
+              <w:right w:type="dxa" w:w="100"/>
+            </w:tcMar>
+          </w:tcPr>
+          <w:p>
+            <w:pPr>
+              <w:keepNext w:val="false"/>
+              <w:spacing w:after="0" w:line="264"/>
             </w:pPr>
             <w:r>
               <w:rPr>
@@ -3918,15 +4050,16 @@
               <w:right w:val="single" w:color="B7C4BF" w:sz="4"/>
             </w:tcBorders>
             <w:tcMar>
-              <w:top w:type="dxa" w:w="60"/>
-              <w:left w:type="dxa" w:w="100"/>
-              <w:bottom w:type="dxa" w:w="60"/>
-              <w:right w:type="dxa" w:w="100"/>
-            </w:tcMar>
-          </w:tcPr>
-          <w:p>
-            <w:pPr>
-              <w:spacing w:after="0" w:line="276"/>
+              <w:top w:type="dxa" w:w="40"/>
+              <w:left w:type="dxa" w:w="100"/>
+              <w:bottom w:type="dxa" w:w="40"/>
+              <w:right w:type="dxa" w:w="100"/>
+            </w:tcMar>
+          </w:tcPr>
+          <w:p>
+            <w:pPr>
+              <w:keepNext w:val="false"/>
+              <w:spacing w:after="0" w:line="264"/>
             </w:pPr>
           </w:p>
         </w:tc>
@@ -3940,15 +4073,16 @@
               <w:right w:val="single" w:color="B7C4BF" w:sz="4"/>
             </w:tcBorders>
             <w:tcMar>
-              <w:top w:type="dxa" w:w="60"/>
-              <w:left w:type="dxa" w:w="100"/>
-              <w:bottom w:type="dxa" w:w="60"/>
-              <w:right w:type="dxa" w:w="100"/>
-            </w:tcMar>
-          </w:tcPr>
-          <w:p>
-            <w:pPr>
-              <w:spacing w:after="0" w:line="276"/>
+              <w:top w:type="dxa" w:w="40"/>
+              <w:left w:type="dxa" w:w="100"/>
+              <w:bottom w:type="dxa" w:w="40"/>
+              <w:right w:type="dxa" w:w="100"/>
+            </w:tcMar>
+          </w:tcPr>
+          <w:p>
+            <w:pPr>
+              <w:keepNext w:val="false"/>
+              <w:spacing w:after="0" w:line="264"/>
             </w:pPr>
           </w:p>
         </w:tc>
@@ -3962,15 +4096,16 @@
               <w:right w:val="single" w:color="B7C4BF" w:sz="4"/>
             </w:tcBorders>
             <w:tcMar>
-              <w:top w:type="dxa" w:w="60"/>
-              <w:left w:type="dxa" w:w="100"/>
-              <w:bottom w:type="dxa" w:w="60"/>
-              <w:right w:type="dxa" w:w="100"/>
-            </w:tcMar>
-          </w:tcPr>
-          <w:p>
-            <w:pPr>
-              <w:spacing w:after="0" w:line="276"/>
+              <w:top w:type="dxa" w:w="40"/>
+              <w:left w:type="dxa" w:w="100"/>
+              <w:bottom w:type="dxa" w:w="40"/>
+              <w:right w:type="dxa" w:w="100"/>
+            </w:tcMar>
+          </w:tcPr>
+          <w:p>
+            <w:pPr>
+              <w:keepNext w:val="false"/>
+              <w:spacing w:after="0" w:line="264"/>
             </w:pPr>
             <w:r>
               <w:rPr>
@@ -3993,7 +4128,7 @@
     </w:p>
     <w:p>
       <w:pPr>
-        <w:spacing w:after="160" w:line="360"/>
+        <w:spacing w:after="100" w:line="360"/>
         <w:jc w:val="both"/>
       </w:pPr>
       <w:r>
@@ -4033,7 +4168,7 @@
     </w:p>
     <w:p>
       <w:pPr>
-        <w:spacing w:after="160" w:line="360"/>
+        <w:spacing w:after="100" w:line="360"/>
         <w:jc w:val="both"/>
       </w:pPr>
       <w:r>
@@ -4047,13 +4182,52 @@
     </w:p>
     <w:p>
       <w:pPr>
-        <w:spacing w:after="160" w:before="60"/>
+        <w:pStyle w:val="Heading3"/>
+      </w:pPr>
+      <w:r>
+        <w:t xml:space="preserve">iii.  Peningkatan Tahap Produktiviti</w:t>
+      </w:r>
+    </w:p>
+    <w:p>
+      <w:pPr>
+        <w:spacing w:after="100" w:line="360"/>
+        <w:jc w:val="both"/>
+      </w:pPr>
+      <w:r>
+        <w:rPr>
+          <w:rFonts w:ascii="Arial" w:cs="Arial" w:eastAsia="Arial" w:hAnsi="Arial"/>
+          <w:sz w:val="24"/>
+          <w:szCs w:val="24"/>
+        </w:rPr>
+        <w:t xml:space="preserve">Pegawai farmasi tidak lagi mencari tangkap layar, menelefon pegawai perubatan untuk pengesahan, atau mengira baki kuota dan mengisi Excel semasa saringan. Kitaran kerja semula dalam kedua-dua aliran kerja sudah tiada, jadi setiap preskripsi diselesaikan dalam satu laluan. Masa yang dijimatkan boleh digunakan untuk kaunseling ubat kepada pesakit.</w:t>
+      </w:r>
+    </w:p>
+    <w:p>
+      <w:pPr>
+        <w:spacing w:after="100" w:line="360"/>
+        <w:ind w:left="360"/>
+      </w:pPr>
+      <w:r>
+        <w:rPr>
+          <w:rFonts w:ascii="Arial" w:cs="Arial" w:eastAsia="Arial" w:hAnsi="Arial"/>
+          <w:i/>
+          <w:iCs/>
+          <w:color w:val="A33A0C"/>
+          <w:sz w:val="24"/>
+          <w:szCs w:val="24"/>
+        </w:rPr>
+        <w:t xml:space="preserve">[ISI] Sertakan bilangan preskripsi atau permohonan yang diproses sebulan, sebelum dan selepas pelaksanaan.</w:t>
+      </w:r>
+    </w:p>
+    <w:p>
+      <w:pPr>
+        <w:spacing w:after="100" w:before="40"/>
         <w:jc w:val="center"/>
       </w:pPr>
       <w:r>
         <w:drawing>
           <wp:inline distT="0" distB="0" distL="0" distR="0">
-            <wp:extent cx="5514975" cy="3524250"/>
+            <wp:extent cx="5448300" cy="2857500"/>
             <wp:effectExtent t="0" r="0" b="0" l="0"/>
             <wp:docPr id="5" name="" descr="" title=""/>
             <wp:cNvGraphicFramePr>
@@ -4078,7 +4252,7 @@
                   <pic:spPr bwMode="auto">
                     <a:xfrm>
                       <a:off x="0" y="0"/>
-                      <a:ext cx="5514975" cy="3524250"/>
+                      <a:ext cx="5448300" cy="2857500"/>
                     </a:xfrm>
                     <a:prstGeom prst="rect">
                       <a:avLst/>
@@ -4096,51 +4270,12 @@
         <w:pStyle w:val="Heading3"/>
       </w:pPr>
       <w:r>
-        <w:t xml:space="preserve">iii.  Peningkatan Tahap Produktiviti</w:t>
-      </w:r>
-    </w:p>
-    <w:p>
-      <w:pPr>
-        <w:spacing w:after="160" w:line="360"/>
-        <w:jc w:val="both"/>
-      </w:pPr>
-      <w:r>
-        <w:rPr>
-          <w:rFonts w:ascii="Arial" w:cs="Arial" w:eastAsia="Arial" w:hAnsi="Arial"/>
-          <w:sz w:val="24"/>
-          <w:szCs w:val="24"/>
-        </w:rPr>
-        <w:t xml:space="preserve">Pegawai farmasi tidak lagi mencari tangkap layar, menelefon pegawai perubatan untuk pengesahan, atau mengira baki kuota dan mengisi Excel semasa saringan. Kitaran kerja semula dalam kedua-dua aliran kerja sudah tiada, jadi setiap preskripsi diselesaikan dalam satu laluan. Masa yang dijimatkan boleh digunakan untuk kaunseling ubat kepada pesakit.</w:t>
-      </w:r>
-    </w:p>
-    <w:p>
-      <w:pPr>
-        <w:spacing w:after="160" w:line="360"/>
-        <w:ind w:left="360"/>
-      </w:pPr>
-      <w:r>
-        <w:rPr>
-          <w:rFonts w:ascii="Arial" w:cs="Arial" w:eastAsia="Arial" w:hAnsi="Arial"/>
-          <w:i/>
-          <w:iCs/>
-          <w:color w:val="A33A0C"/>
-          <w:sz w:val="24"/>
-          <w:szCs w:val="24"/>
-        </w:rPr>
-        <w:t xml:space="preserve">[ISI] Sertakan bilangan preskripsi atau permohonan yang diproses sebulan, sebelum dan selepas pelaksanaan.</w:t>
-      </w:r>
-    </w:p>
-    <w:p>
-      <w:pPr>
-        <w:pStyle w:val="Heading3"/>
-      </w:pPr>
-      <w:r>
         <w:t xml:space="preserve">iv.  Peningkatan Tahap Kepuasan Hati Pelanggan</w:t>
       </w:r>
     </w:p>
     <w:p>
       <w:pPr>
-        <w:spacing w:after="160" w:line="360"/>
+        <w:spacing w:after="100" w:line="360"/>
         <w:jc w:val="both"/>
       </w:pPr>
       <w:r>
@@ -4159,7 +4294,7 @@
           <w:ilvl w:val="0"/>
           <w:numId w:val="6"/>
         </w:numPr>
-        <w:spacing w:after="80" w:line="360"/>
+        <w:spacing w:after="40" w:line="360"/>
         <w:jc w:val="both"/>
       </w:pPr>
       <w:r>
@@ -4178,7 +4313,7 @@
           <w:ilvl w:val="0"/>
           <w:numId w:val="6"/>
         </w:numPr>
-        <w:spacing w:after="80" w:line="360"/>
+        <w:spacing w:after="40" w:line="360"/>
         <w:jc w:val="both"/>
       </w:pPr>
       <w:r>
@@ -4197,7 +4332,7 @@
           <w:ilvl w:val="0"/>
           <w:numId w:val="6"/>
         </w:numPr>
-        <w:spacing w:after="80" w:line="360"/>
+        <w:spacing w:after="40" w:line="360"/>
         <w:jc w:val="both"/>
       </w:pPr>
       <w:r>
@@ -4206,7 +4341,7 @@
           <w:sz w:val="24"/>
           <w:szCs w:val="24"/>
         </w:rPr>
-        <w:t xml:space="preserve">Preskripsi lebih selamat. Sistem memberi amaran jika ubat berisiko kepada pesakit yang kekurangan G6PD, dan mengira dos kanak-kanak berdasarkan berat badan sebelum ubat sampai kepada pesakit.</w:t>
+        <w:t xml:space="preserve">Preskripsi lebih selamat. Sistem memberi amaran jika ubat berisiko kepada pesakit yang kekurangan G6PD, mengira dos kanak-kanak berdasarkan berat badan, dan mencadangkan dos antibiotik mengikut NAG 2024 sebelum ubat sampai kepada pesakit.</w:t>
       </w:r>
     </w:p>
     <w:p>
@@ -4216,7 +4351,7 @@
           <w:ilvl w:val="0"/>
           <w:numId w:val="6"/>
         </w:numPr>
-        <w:spacing w:after="80" w:line="360"/>
+        <w:spacing w:after="40" w:line="360"/>
         <w:jc w:val="both"/>
       </w:pPr>
       <w:r>
@@ -4235,7 +4370,7 @@
           <w:ilvl w:val="0"/>
           <w:numId w:val="6"/>
         </w:numPr>
-        <w:spacing w:after="80" w:line="360"/>
+        <w:spacing w:after="40" w:line="360"/>
         <w:jc w:val="both"/>
       </w:pPr>
       <w:r>
@@ -4254,7 +4389,7 @@
           <w:ilvl w:val="0"/>
           <w:numId w:val="6"/>
         </w:numPr>
-        <w:spacing w:after="80" w:line="360"/>
+        <w:spacing w:after="40" w:line="360"/>
         <w:jc w:val="both"/>
       </w:pPr>
       <w:r>
@@ -4268,7 +4403,7 @@
     </w:p>
     <w:p>
       <w:pPr>
-        <w:spacing w:after="160" w:line="360"/>
+        <w:spacing w:after="100" w:line="360"/>
         <w:ind w:left="360"/>
       </w:pPr>
       <w:r>
@@ -4293,7 +4428,7 @@
     </w:p>
     <w:p>
       <w:pPr>
-        <w:spacing w:after="160" w:line="360"/>
+        <w:spacing w:after="100" w:line="360"/>
         <w:jc w:val="both"/>
       </w:pPr>
       <w:r>
@@ -4307,7 +4442,7 @@
     </w:p>
     <w:p>
       <w:pPr>
-        <w:spacing w:after="160" w:line="360"/>
+        <w:spacing w:after="100" w:line="360"/>
         <w:ind w:left="360"/>
       </w:pPr>
       <w:r>
@@ -4337,7 +4472,7 @@
           <w:ilvl w:val="0"/>
           <w:numId w:val="2"/>
         </w:numPr>
-        <w:spacing w:after="80" w:line="360"/>
+        <w:spacing w:after="40" w:line="360"/>
         <w:jc w:val="both"/>
       </w:pPr>
       <w:r>
@@ -4356,7 +4491,7 @@
           <w:ilvl w:val="0"/>
           <w:numId w:val="2"/>
         </w:numPr>
-        <w:spacing w:after="80" w:line="360"/>
+        <w:spacing w:after="40" w:line="360"/>
         <w:jc w:val="both"/>
       </w:pPr>
       <w:r>
@@ -4375,7 +4510,7 @@
           <w:ilvl w:val="0"/>
           <w:numId w:val="2"/>
         </w:numPr>
-        <w:spacing w:after="80" w:line="360"/>
+        <w:spacing w:after="40" w:line="360"/>
         <w:jc w:val="both"/>
       </w:pPr>
       <w:r>
@@ -4405,7 +4540,7 @@
     </w:p>
     <w:p>
       <w:pPr>
-        <w:spacing w:after="160" w:line="360"/>
+        <w:spacing w:after="100" w:line="360"/>
         <w:jc w:val="both"/>
       </w:pPr>
       <w:r>
@@ -4429,7 +4564,7 @@
     </w:p>
     <w:p>
       <w:pPr>
-        <w:spacing w:after="160" w:line="360"/>
+        <w:spacing w:after="100" w:line="360"/>
         <w:jc w:val="both"/>
       </w:pPr>
       <w:r>
@@ -4448,7 +4583,7 @@
           <w:sz w:val="24"/>
           <w:szCs w:val="24"/>
         </w:rPr>
-        <w:t xml:space="preserve"> Kelulusan pakar yang dahulunya hanya wujud sebagai perbualan telefon dan tangkap layar kini direkodkan bersama nama dan cap masa. FMS boleh menerima notifikasi pada telefon apabila permohonan dihantar, dan dapat melihat baki kuota daerah sebelum meluluskannya. Borang AMS tidak lengkap turun daripada purata 10 sebulan kepada sifar. Semua ini dibina sendiri oleh Kumpulan Inovasi dan berjalan dengan kos kira-kira RM3.32 sehari.</w:t>
+        <w:t xml:space="preserve"> Kelulusan pakar yang dahulunya hanya wujud sebagai perbualan telefon dan tangkap layar kini direkodkan bersama nama dan cap masa. FMS boleh menerima notifikasi pada telefon apabila permohonan dihantar, dan dapat melihat baki kuota daerah sebelum meluluskannya. Borang AMS tidak lengkap turun daripada purata 10 sebulan kepada sifar. Pegawai perubatan pula mendapat cadangan dos antibiotik mengikut NAG 2024 semasa menulis preskripsi, daripada model AI yang dihoskan sendiri di Malaysia. Semua ini dibina sendiri oleh Kumpulan Inovasi dan berjalan dengan kos kira-kira RM3.32 sehari.</w:t>
       </w:r>
     </w:p>
     <w:p>
@@ -4461,7 +4596,7 @@
     </w:p>
     <w:p>
       <w:pPr>
-        <w:spacing w:after="160" w:line="360"/>
+        <w:spacing w:after="100" w:line="360"/>
         <w:jc w:val="both"/>
       </w:pPr>
       <w:r>
@@ -4480,12 +4615,12 @@
           <w:sz w:val="24"/>
           <w:szCs w:val="24"/>
         </w:rPr>
-        <w:t xml:space="preserve"> PharmaSync ialah projek asli yang ditulis sendiri oleh Kumpulan Inovasi menggunakan bahasa pengaturcaraan. Beberapa ciri tidak terdapat dalam kaedah sedia ada: kuota UKK diperuntukkan sebagai kadar bagi setiap FMS didarab dengan bilangan FMS daerah, pesakit Pesara dikecualikan daripada kuota secara automatik, dan semakan keselamatan dibina dalam proses menulis preskripsi.</w:t>
-      </w:r>
-    </w:p>
-    <w:p>
-      <w:pPr>
-        <w:spacing w:after="160" w:line="360"/>
+        <w:t xml:space="preserve"> PharmaSync ialah projek asli yang ditulis sendiri oleh Kumpulan Inovasi menggunakan bahasa pengaturcaraan. Beberapa ciri tidak terdapat dalam kaedah sedia ada: kuota UKK diperuntukkan sebagai kadar bagi setiap FMS didarab dengan bilangan FMS daerah, pesakit Pesara dikecualikan daripada kuota secara automatik, semakan keselamatan dibina dalam proses menulis preskripsi, dan cadangan dos antibiotik diberi oleh model AI tempatan yang hanya memaparkan teks garis panduan tanpa mengubahnya.</w:t>
+      </w:r>
+    </w:p>
+    <w:p>
+      <w:pPr>
+        <w:spacing w:after="100" w:line="360"/>
         <w:jc w:val="both"/>
       </w:pPr>
       <w:r>
@@ -4504,12 +4639,12 @@
           <w:sz w:val="24"/>
           <w:szCs w:val="24"/>
         </w:rPr>
-        <w:t xml:space="preserve"> Bagi keselamatan pesakit, sistem menyediakan penyemak kekurangan G6PD, kalkulator dos pediatrik dan semakan Clinical Pathway NAG 2024. Bagi keselamatan data, log masuk terhad kepada akaun rasmi @moh.gov.my, capaian dikawal mengikut peranan, setiap tindakan direkodkan dalam log audit, dan semua data disimpan di Malaysia selaras dengan Akta Perlindungan Data Peribadi 2010. Model AI yang digunakan ialah model tempatan, jadi data klinikal tidak dihantar ke luar negara.</w:t>
-      </w:r>
-    </w:p>
-    <w:p>
-      <w:pPr>
-        <w:spacing w:after="160" w:line="360"/>
+        <w:t xml:space="preserve"> Bagi keselamatan pesakit, sistem menyediakan penyemak kekurangan G6PD, kalkulator dos pediatrik, semakan Clinical Pathway NAG 2024 dan cadangan dos antibiotik yang mesti disahkan oleh pegawai perubatan sebelum digunakan. Bagi keselamatan data, log masuk terhad kepada akaun rasmi @moh.gov.my, capaian dikawal mengikut peranan, setiap tindakan direkodkan dalam log audit, dan semua data disimpan di Malaysia selaras dengan Akta Perlindungan Data Peribadi 2010. Model AI yang digunakan ialah model tempatan, jadi data klinikal tidak dihantar ke luar negara.</w:t>
+      </w:r>
+    </w:p>
+    <w:p>
+      <w:pPr>
+        <w:spacing w:after="100" w:line="360"/>
         <w:jc w:val="both"/>
       </w:pPr>
       <w:r>
@@ -4541,7 +4676,7 @@
     </w:p>
     <w:p>
       <w:pPr>
-        <w:spacing w:after="160" w:line="360"/>
+        <w:spacing w:after="100" w:line="360"/>
         <w:jc w:val="both"/>
       </w:pPr>
       <w:r>
@@ -4560,12 +4695,12 @@
           <w:sz w:val="24"/>
           <w:szCs w:val="24"/>
         </w:rPr>
-        <w:t xml:space="preserve"> Pegawai perubatan melihat baki kuota sebelum menghantar permohonan. FMS meluluskan permohonan dari papan pemuka tanpa perlu bersemuka. Pegawai farmasi melihat kelulusan terus dalam sistem, dan pesakit menunggu lebih singkat.</w:t>
-      </w:r>
-    </w:p>
-    <w:p>
-      <w:pPr>
-        <w:spacing w:after="160" w:line="360"/>
+        <w:t xml:space="preserve"> Pegawai perubatan melihat baki kuota sebelum menghantar permohonan dan mendapat cadangan dos antibiotik semasa mengisi borang. FMS meluluskan permohonan dari papan pemuka tanpa perlu bersemuka. Pegawai farmasi melihat kelulusan terus dalam sistem, dan pesakit menunggu lebih singkat.</w:t>
+      </w:r>
+    </w:p>
+    <w:p>
+      <w:pPr>
+        <w:spacing w:after="100" w:line="360"/>
         <w:jc w:val="both"/>
       </w:pPr>
       <w:r>
@@ -4589,7 +4724,7 @@
     </w:p>
     <w:p>
       <w:pPr>
-        <w:spacing w:after="160" w:line="360"/>
+        <w:spacing w:after="100" w:line="360"/>
         <w:jc w:val="both"/>
       </w:pPr>
       <w:r>
@@ -4613,7 +4748,7 @@
     </w:p>
     <w:p>
       <w:pPr>
-        <w:spacing w:after="160" w:line="360"/>
+        <w:spacing w:after="100" w:line="360"/>
         <w:jc w:val="both"/>
       </w:pPr>
       <w:r>
@@ -4637,7 +4772,7 @@
     </w:p>
     <w:p>
       <w:pPr>
-        <w:spacing w:after="160" w:line="360"/>
+        <w:spacing w:after="100" w:line="360"/>
         <w:jc w:val="both"/>
       </w:pPr>
       <w:r>
@@ -4669,7 +4804,7 @@
     </w:p>
     <w:p>
       <w:pPr>
-        <w:spacing w:after="160" w:line="360"/>
+        <w:spacing w:after="100" w:line="360"/>
         <w:jc w:val="both"/>
       </w:pPr>
       <w:r>
@@ -4683,7 +4818,7 @@
     </w:p>
     <w:p>
       <w:pPr>
-        <w:spacing w:after="160" w:line="360"/>
+        <w:spacing w:after="100" w:line="360"/>
         <w:ind w:left="360"/>
       </w:pPr>
       <w:r>
@@ -4708,7 +4843,7 @@
     </w:p>
     <w:p>
       <w:pPr>
-        <w:spacing w:after="160" w:line="360"/>
+        <w:spacing w:after="100" w:line="360"/>
         <w:jc w:val="both"/>
       </w:pPr>
       <w:r>
@@ -4722,7 +4857,7 @@
     </w:p>
     <w:p>
       <w:pPr>
-        <w:spacing w:after="160" w:line="360"/>
+        <w:spacing w:after="100" w:line="360"/>
         <w:ind w:left="360"/>
       </w:pPr>
       <w:r>
@@ -4747,7 +4882,7 @@
     </w:p>
     <w:p>
       <w:pPr>
-        <w:spacing w:after="160" w:line="360"/>
+        <w:spacing w:after="100" w:line="360"/>
         <w:jc w:val="both"/>
       </w:pPr>
       <w:r>
@@ -4756,12 +4891,12 @@
           <w:sz w:val="24"/>
           <w:szCs w:val="24"/>
         </w:rPr>
-        <w:t xml:space="preserve">PharmaSync memberi faedah langsung kepada pesakit Klinik Kesihatan Kempas. Pesakit kini menunggu lebih singkat di kaunter farmasi, tidak lagi dihantar semula ke bilik doktor kerana borang tidak lengkap, dan menerima preskripsi yang telah disemak dari segi risiko G6PD dan dos kanak-kanak semasa ditulis.</w:t>
-      </w:r>
-    </w:p>
-    <w:p>
-      <w:pPr>
-        <w:spacing w:after="160" w:line="360"/>
+        <w:t xml:space="preserve">PharmaSync memberi faedah langsung kepada pesakit Klinik Kesihatan Kempas. Pesakit kini menunggu lebih singkat di kaunter farmasi, tidak lagi dihantar semula ke bilik doktor kerana borang tidak lengkap, dan menerima preskripsi antibiotik yang dosnya dicadangkan mengikut NAG 2024 dan disemak dari segi risiko G6PD semasa ditulis.</w:t>
+      </w:r>
+    </w:p>
+    <w:p>
+      <w:pPr>
+        <w:spacing w:after="100" w:line="360"/>
         <w:jc w:val="both"/>
       </w:pPr>
       <w:r>
@@ -4771,11 +4906,6 @@
           <w:szCs w:val="24"/>
         </w:rPr>
         <w:t xml:space="preserve">Bagi klinik pula, setiap kelulusan UKK kini direkodkan dan baki kuota daerah dipantau sebelum keputusan dibuat. Semua ini dicapai dengan kos operasi kira-kira RM3.32 sehari. Sistem ini kini turut digunakan oleh klinik lain di bawah PKDJB, supaya lebih ramai pesakit mendapat faedah yang sama.</w:t>
-      </w:r>
-    </w:p>
-    <w:p>
-      <w:r>
-        <w:br w:type="page"/>
       </w:r>
     </w:p>
     <w:p>
@@ -4793,7 +4923,7 @@
           <w:ilvl w:val="0"/>
           <w:numId w:val="7"/>
         </w:numPr>
-        <w:spacing w:after="80" w:line="360"/>
+        <w:spacing w:after="40" w:line="360"/>
         <w:jc w:val="both"/>
       </w:pPr>
       <w:r>
@@ -4812,7 +4942,7 @@
           <w:ilvl w:val="0"/>
           <w:numId w:val="7"/>
         </w:numPr>
-        <w:spacing w:after="80" w:line="360"/>
+        <w:spacing w:after="40" w:line="360"/>
         <w:jc w:val="both"/>
       </w:pPr>
       <w:r>
@@ -4845,8 +4975,10 @@
         </w:tblBorders>
       </w:tblPr>
       <w:tblGrid>
-        <w:gridCol w:w="1600"/>
-        <w:gridCol w:w="7426"/>
+        <w:gridCol w:w="1250"/>
+        <w:gridCol w:w="3263"/>
+        <w:gridCol w:w="1250"/>
+        <w:gridCol w:w="3263"/>
       </w:tblGrid>
       <w:tr>
         <w:trPr>
@@ -4855,7 +4987,7 @@
         </w:trPr>
         <w:tc>
           <w:tcPr>
-            <w:tcW w:type="dxa" w:w="1600"/>
+            <w:tcW w:type="dxa" w:w="1250"/>
             <w:tcBorders>
               <w:top w:val="single" w:color="B7C4BF" w:sz="4"/>
               <w:left w:val="single" w:color="B7C4BF" w:sz="4"/>
@@ -4864,15 +4996,16 @@
             </w:tcBorders>
             <w:shd w:fill="E3EFEA" w:color="auto" w:val="clear"/>
             <w:tcMar>
-              <w:top w:type="dxa" w:w="60"/>
-              <w:left w:type="dxa" w:w="100"/>
-              <w:bottom w:type="dxa" w:w="60"/>
-              <w:right w:type="dxa" w:w="100"/>
-            </w:tcMar>
-          </w:tcPr>
-          <w:p>
-            <w:pPr>
-              <w:spacing w:after="0" w:line="276"/>
+              <w:top w:type="dxa" w:w="40"/>
+              <w:left w:type="dxa" w:w="100"/>
+              <w:bottom w:type="dxa" w:w="40"/>
+              <w:right w:type="dxa" w:w="100"/>
+            </w:tcMar>
+          </w:tcPr>
+          <w:p>
+            <w:pPr>
+              <w:keepNext w:val="false"/>
+              <w:spacing w:after="0" w:line="264"/>
             </w:pPr>
             <w:r>
               <w:rPr>
@@ -4888,7 +5021,7 @@
         </w:tc>
         <w:tc>
           <w:tcPr>
-            <w:tcW w:type="dxa" w:w="7426"/>
+            <w:tcW w:type="dxa" w:w="3263"/>
             <w:tcBorders>
               <w:top w:val="single" w:color="B7C4BF" w:sz="4"/>
               <w:left w:val="single" w:color="B7C4BF" w:sz="4"/>
@@ -4897,15 +5030,84 @@
             </w:tcBorders>
             <w:shd w:fill="E3EFEA" w:color="auto" w:val="clear"/>
             <w:tcMar>
-              <w:top w:type="dxa" w:w="60"/>
-              <w:left w:type="dxa" w:w="100"/>
-              <w:bottom w:type="dxa" w:w="60"/>
-              <w:right w:type="dxa" w:w="100"/>
-            </w:tcMar>
-          </w:tcPr>
-          <w:p>
-            <w:pPr>
-              <w:spacing w:after="0" w:line="276"/>
+              <w:top w:type="dxa" w:w="40"/>
+              <w:left w:type="dxa" w:w="100"/>
+              <w:bottom w:type="dxa" w:w="40"/>
+              <w:right w:type="dxa" w:w="100"/>
+            </w:tcMar>
+          </w:tcPr>
+          <w:p>
+            <w:pPr>
+              <w:keepNext w:val="false"/>
+              <w:spacing w:after="0" w:line="264"/>
+            </w:pPr>
+            <w:r>
+              <w:rPr>
+                <w:rFonts w:ascii="Arial" w:cs="Arial" w:eastAsia="Arial" w:hAnsi="Arial"/>
+                <w:b/>
+                <w:bCs/>
+                <w:sz w:val="24"/>
+                <w:szCs w:val="24"/>
+              </w:rPr>
+              <w:t xml:space="preserve">Maksud</w:t>
+            </w:r>
+          </w:p>
+        </w:tc>
+        <w:tc>
+          <w:tcPr>
+            <w:tcW w:type="dxa" w:w="1250"/>
+            <w:tcBorders>
+              <w:top w:val="single" w:color="B7C4BF" w:sz="4"/>
+              <w:left w:val="single" w:color="B7C4BF" w:sz="4"/>
+              <w:bottom w:val="single" w:color="B7C4BF" w:sz="4"/>
+              <w:right w:val="single" w:color="B7C4BF" w:sz="4"/>
+            </w:tcBorders>
+            <w:shd w:fill="E3EFEA" w:color="auto" w:val="clear"/>
+            <w:tcMar>
+              <w:top w:type="dxa" w:w="40"/>
+              <w:left w:type="dxa" w:w="100"/>
+              <w:bottom w:type="dxa" w:w="40"/>
+              <w:right w:type="dxa" w:w="100"/>
+            </w:tcMar>
+          </w:tcPr>
+          <w:p>
+            <w:pPr>
+              <w:keepNext w:val="false"/>
+              <w:spacing w:after="0" w:line="264"/>
+            </w:pPr>
+            <w:r>
+              <w:rPr>
+                <w:rFonts w:ascii="Arial" w:cs="Arial" w:eastAsia="Arial" w:hAnsi="Arial"/>
+                <w:b/>
+                <w:bCs/>
+                <w:sz w:val="24"/>
+                <w:szCs w:val="24"/>
+              </w:rPr>
+              <w:t xml:space="preserve">Akronim</w:t>
+            </w:r>
+          </w:p>
+        </w:tc>
+        <w:tc>
+          <w:tcPr>
+            <w:tcW w:type="dxa" w:w="3263"/>
+            <w:tcBorders>
+              <w:top w:val="single" w:color="B7C4BF" w:sz="4"/>
+              <w:left w:val="single" w:color="B7C4BF" w:sz="4"/>
+              <w:bottom w:val="single" w:color="B7C4BF" w:sz="4"/>
+              <w:right w:val="single" w:color="B7C4BF" w:sz="4"/>
+            </w:tcBorders>
+            <w:shd w:fill="E3EFEA" w:color="auto" w:val="clear"/>
+            <w:tcMar>
+              <w:top w:type="dxa" w:w="40"/>
+              <w:left w:type="dxa" w:w="100"/>
+              <w:bottom w:type="dxa" w:w="40"/>
+              <w:right w:type="dxa" w:w="100"/>
+            </w:tcMar>
+          </w:tcPr>
+          <w:p>
+            <w:pPr>
+              <w:keepNext w:val="false"/>
+              <w:spacing w:after="0" w:line="264"/>
             </w:pPr>
             <w:r>
               <w:rPr>
@@ -4927,23 +5129,24 @@
         </w:trPr>
         <w:tc>
           <w:tcPr>
-            <w:tcW w:type="dxa" w:w="1600"/>
-            <w:tcBorders>
-              <w:top w:val="single" w:color="B7C4BF" w:sz="4"/>
-              <w:left w:val="single" w:color="B7C4BF" w:sz="4"/>
-              <w:bottom w:val="single" w:color="B7C4BF" w:sz="4"/>
-              <w:right w:val="single" w:color="B7C4BF" w:sz="4"/>
-            </w:tcBorders>
-            <w:tcMar>
-              <w:top w:type="dxa" w:w="60"/>
-              <w:left w:type="dxa" w:w="100"/>
-              <w:bottom w:type="dxa" w:w="60"/>
-              <w:right w:type="dxa" w:w="100"/>
-            </w:tcMar>
-          </w:tcPr>
-          <w:p>
-            <w:pPr>
-              <w:spacing w:after="0" w:line="276"/>
+            <w:tcW w:type="dxa" w:w="1250"/>
+            <w:tcBorders>
+              <w:top w:val="single" w:color="B7C4BF" w:sz="4"/>
+              <w:left w:val="single" w:color="B7C4BF" w:sz="4"/>
+              <w:bottom w:val="single" w:color="B7C4BF" w:sz="4"/>
+              <w:right w:val="single" w:color="B7C4BF" w:sz="4"/>
+            </w:tcBorders>
+            <w:tcMar>
+              <w:top w:type="dxa" w:w="40"/>
+              <w:left w:type="dxa" w:w="100"/>
+              <w:bottom w:type="dxa" w:w="40"/>
+              <w:right w:type="dxa" w:w="100"/>
+            </w:tcMar>
+          </w:tcPr>
+          <w:p>
+            <w:pPr>
+              <w:keepNext w:val="false"/>
+              <w:spacing w:after="0" w:line="264"/>
             </w:pPr>
             <w:r>
               <w:rPr>
@@ -4957,23 +5160,24 @@
         </w:tc>
         <w:tc>
           <w:tcPr>
-            <w:tcW w:type="dxa" w:w="7426"/>
-            <w:tcBorders>
-              <w:top w:val="single" w:color="B7C4BF" w:sz="4"/>
-              <w:left w:val="single" w:color="B7C4BF" w:sz="4"/>
-              <w:bottom w:val="single" w:color="B7C4BF" w:sz="4"/>
-              <w:right w:val="single" w:color="B7C4BF" w:sz="4"/>
-            </w:tcBorders>
-            <w:tcMar>
-              <w:top w:type="dxa" w:w="60"/>
-              <w:left w:type="dxa" w:w="100"/>
-              <w:bottom w:type="dxa" w:w="60"/>
-              <w:right w:type="dxa" w:w="100"/>
-            </w:tcMar>
-          </w:tcPr>
-          <w:p>
-            <w:pPr>
-              <w:spacing w:after="0" w:line="276"/>
+            <w:tcW w:type="dxa" w:w="3263"/>
+            <w:tcBorders>
+              <w:top w:val="single" w:color="B7C4BF" w:sz="4"/>
+              <w:left w:val="single" w:color="B7C4BF" w:sz="4"/>
+              <w:bottom w:val="single" w:color="B7C4BF" w:sz="4"/>
+              <w:right w:val="single" w:color="B7C4BF" w:sz="4"/>
+            </w:tcBorders>
+            <w:tcMar>
+              <w:top w:type="dxa" w:w="40"/>
+              <w:left w:type="dxa" w:w="100"/>
+              <w:bottom w:type="dxa" w:w="40"/>
+              <w:right w:type="dxa" w:w="100"/>
+            </w:tcMar>
+          </w:tcPr>
+          <w:p>
+            <w:pPr>
+              <w:keepNext w:val="false"/>
+              <w:spacing w:after="0" w:line="264"/>
             </w:pPr>
             <w:r>
               <w:rPr>
@@ -4982,6 +5186,68 @@
                 <w:szCs w:val="24"/>
               </w:rPr>
               <w:t xml:space="preserve">Artificial Intelligence (Kecerdasan Buatan)</w:t>
+            </w:r>
+          </w:p>
+        </w:tc>
+        <w:tc>
+          <w:tcPr>
+            <w:tcW w:type="dxa" w:w="1250"/>
+            <w:tcBorders>
+              <w:top w:val="single" w:color="B7C4BF" w:sz="4"/>
+              <w:left w:val="single" w:color="B7C4BF" w:sz="4"/>
+              <w:bottom w:val="single" w:color="B7C4BF" w:sz="4"/>
+              <w:right w:val="single" w:color="B7C4BF" w:sz="4"/>
+            </w:tcBorders>
+            <w:tcMar>
+              <w:top w:type="dxa" w:w="40"/>
+              <w:left w:type="dxa" w:w="100"/>
+              <w:bottom w:type="dxa" w:w="40"/>
+              <w:right w:type="dxa" w:w="100"/>
+            </w:tcMar>
+          </w:tcPr>
+          <w:p>
+            <w:pPr>
+              <w:keepNext w:val="false"/>
+              <w:spacing w:after="0" w:line="264"/>
+            </w:pPr>
+            <w:r>
+              <w:rPr>
+                <w:rFonts w:ascii="Arial" w:cs="Arial" w:eastAsia="Arial" w:hAnsi="Arial"/>
+                <w:sz w:val="24"/>
+                <w:szCs w:val="24"/>
+              </w:rPr>
+              <w:t xml:space="preserve">NAG</w:t>
+            </w:r>
+          </w:p>
+        </w:tc>
+        <w:tc>
+          <w:tcPr>
+            <w:tcW w:type="dxa" w:w="3263"/>
+            <w:tcBorders>
+              <w:top w:val="single" w:color="B7C4BF" w:sz="4"/>
+              <w:left w:val="single" w:color="B7C4BF" w:sz="4"/>
+              <w:bottom w:val="single" w:color="B7C4BF" w:sz="4"/>
+              <w:right w:val="single" w:color="B7C4BF" w:sz="4"/>
+            </w:tcBorders>
+            <w:tcMar>
+              <w:top w:type="dxa" w:w="40"/>
+              <w:left w:type="dxa" w:w="100"/>
+              <w:bottom w:type="dxa" w:w="40"/>
+              <w:right w:type="dxa" w:w="100"/>
+            </w:tcMar>
+          </w:tcPr>
+          <w:p>
+            <w:pPr>
+              <w:keepNext w:val="false"/>
+              <w:spacing w:after="0" w:line="264"/>
+            </w:pPr>
+            <w:r>
+              <w:rPr>
+                <w:rFonts w:ascii="Arial" w:cs="Arial" w:eastAsia="Arial" w:hAnsi="Arial"/>
+                <w:sz w:val="24"/>
+                <w:szCs w:val="24"/>
+              </w:rPr>
+              <w:t xml:space="preserve">National Antimicrobial Guideline</w:t>
             </w:r>
           </w:p>
         </w:tc>
@@ -4993,23 +5259,24 @@
         </w:trPr>
         <w:tc>
           <w:tcPr>
-            <w:tcW w:type="dxa" w:w="1600"/>
-            <w:tcBorders>
-              <w:top w:val="single" w:color="B7C4BF" w:sz="4"/>
-              <w:left w:val="single" w:color="B7C4BF" w:sz="4"/>
-              <w:bottom w:val="single" w:color="B7C4BF" w:sz="4"/>
-              <w:right w:val="single" w:color="B7C4BF" w:sz="4"/>
-            </w:tcBorders>
-            <w:tcMar>
-              <w:top w:type="dxa" w:w="60"/>
-              <w:left w:type="dxa" w:w="100"/>
-              <w:bottom w:type="dxa" w:w="60"/>
-              <w:right w:type="dxa" w:w="100"/>
-            </w:tcMar>
-          </w:tcPr>
-          <w:p>
-            <w:pPr>
-              <w:spacing w:after="0" w:line="276"/>
+            <w:tcW w:type="dxa" w:w="1250"/>
+            <w:tcBorders>
+              <w:top w:val="single" w:color="B7C4BF" w:sz="4"/>
+              <w:left w:val="single" w:color="B7C4BF" w:sz="4"/>
+              <w:bottom w:val="single" w:color="B7C4BF" w:sz="4"/>
+              <w:right w:val="single" w:color="B7C4BF" w:sz="4"/>
+            </w:tcBorders>
+            <w:tcMar>
+              <w:top w:type="dxa" w:w="40"/>
+              <w:left w:type="dxa" w:w="100"/>
+              <w:bottom w:type="dxa" w:w="40"/>
+              <w:right w:type="dxa" w:w="100"/>
+            </w:tcMar>
+          </w:tcPr>
+          <w:p>
+            <w:pPr>
+              <w:keepNext w:val="false"/>
+              <w:spacing w:after="0" w:line="264"/>
             </w:pPr>
             <w:r>
               <w:rPr>
@@ -5023,23 +5290,24 @@
         </w:tc>
         <w:tc>
           <w:tcPr>
-            <w:tcW w:type="dxa" w:w="7426"/>
-            <w:tcBorders>
-              <w:top w:val="single" w:color="B7C4BF" w:sz="4"/>
-              <w:left w:val="single" w:color="B7C4BF" w:sz="4"/>
-              <w:bottom w:val="single" w:color="B7C4BF" w:sz="4"/>
-              <w:right w:val="single" w:color="B7C4BF" w:sz="4"/>
-            </w:tcBorders>
-            <w:tcMar>
-              <w:top w:type="dxa" w:w="60"/>
-              <w:left w:type="dxa" w:w="100"/>
-              <w:bottom w:type="dxa" w:w="60"/>
-              <w:right w:type="dxa" w:w="100"/>
-            </w:tcMar>
-          </w:tcPr>
-          <w:p>
-            <w:pPr>
-              <w:spacing w:after="0" w:line="276"/>
+            <w:tcW w:type="dxa" w:w="3263"/>
+            <w:tcBorders>
+              <w:top w:val="single" w:color="B7C4BF" w:sz="4"/>
+              <w:left w:val="single" w:color="B7C4BF" w:sz="4"/>
+              <w:bottom w:val="single" w:color="B7C4BF" w:sz="4"/>
+              <w:right w:val="single" w:color="B7C4BF" w:sz="4"/>
+            </w:tcBorders>
+            <w:tcMar>
+              <w:top w:type="dxa" w:w="40"/>
+              <w:left w:type="dxa" w:w="100"/>
+              <w:bottom w:type="dxa" w:w="40"/>
+              <w:right w:type="dxa" w:w="100"/>
+            </w:tcMar>
+          </w:tcPr>
+          <w:p>
+            <w:pPr>
+              <w:keepNext w:val="false"/>
+              <w:spacing w:after="0" w:line="264"/>
             </w:pPr>
             <w:r>
               <w:rPr>
@@ -5048,6 +5316,68 @@
                 <w:szCs w:val="24"/>
               </w:rPr>
               <w:t xml:space="preserve">Antimicrobial Stewardship</w:t>
+            </w:r>
+          </w:p>
+        </w:tc>
+        <w:tc>
+          <w:tcPr>
+            <w:tcW w:type="dxa" w:w="1250"/>
+            <w:tcBorders>
+              <w:top w:val="single" w:color="B7C4BF" w:sz="4"/>
+              <w:left w:val="single" w:color="B7C4BF" w:sz="4"/>
+              <w:bottom w:val="single" w:color="B7C4BF" w:sz="4"/>
+              <w:right w:val="single" w:color="B7C4BF" w:sz="4"/>
+            </w:tcBorders>
+            <w:tcMar>
+              <w:top w:type="dxa" w:w="40"/>
+              <w:left w:type="dxa" w:w="100"/>
+              <w:bottom w:type="dxa" w:w="40"/>
+              <w:right w:type="dxa" w:w="100"/>
+            </w:tcMar>
+          </w:tcPr>
+          <w:p>
+            <w:pPr>
+              <w:keepNext w:val="false"/>
+              <w:spacing w:after="0" w:line="264"/>
+            </w:pPr>
+            <w:r>
+              <w:rPr>
+                <w:rFonts w:ascii="Arial" w:cs="Arial" w:eastAsia="Arial" w:hAnsi="Arial"/>
+                <w:sz w:val="24"/>
+                <w:szCs w:val="24"/>
+              </w:rPr>
+              <w:t xml:space="preserve">PDPA</w:t>
+            </w:r>
+          </w:p>
+        </w:tc>
+        <w:tc>
+          <w:tcPr>
+            <w:tcW w:type="dxa" w:w="3263"/>
+            <w:tcBorders>
+              <w:top w:val="single" w:color="B7C4BF" w:sz="4"/>
+              <w:left w:val="single" w:color="B7C4BF" w:sz="4"/>
+              <w:bottom w:val="single" w:color="B7C4BF" w:sz="4"/>
+              <w:right w:val="single" w:color="B7C4BF" w:sz="4"/>
+            </w:tcBorders>
+            <w:tcMar>
+              <w:top w:type="dxa" w:w="40"/>
+              <w:left w:type="dxa" w:w="100"/>
+              <w:bottom w:type="dxa" w:w="40"/>
+              <w:right w:type="dxa" w:w="100"/>
+            </w:tcMar>
+          </w:tcPr>
+          <w:p>
+            <w:pPr>
+              <w:keepNext w:val="false"/>
+              <w:spacing w:after="0" w:line="264"/>
+            </w:pPr>
+            <w:r>
+              <w:rPr>
+                <w:rFonts w:ascii="Arial" w:cs="Arial" w:eastAsia="Arial" w:hAnsi="Arial"/>
+                <w:sz w:val="24"/>
+                <w:szCs w:val="24"/>
+              </w:rPr>
+              <w:t xml:space="preserve">Personal Data Protection Act (Akta Perlindungan Data Peribadi)</w:t>
             </w:r>
           </w:p>
         </w:tc>
@@ -5059,23 +5389,24 @@
         </w:trPr>
         <w:tc>
           <w:tcPr>
-            <w:tcW w:type="dxa" w:w="1600"/>
-            <w:tcBorders>
-              <w:top w:val="single" w:color="B7C4BF" w:sz="4"/>
-              <w:left w:val="single" w:color="B7C4BF" w:sz="4"/>
-              <w:bottom w:val="single" w:color="B7C4BF" w:sz="4"/>
-              <w:right w:val="single" w:color="B7C4BF" w:sz="4"/>
-            </w:tcBorders>
-            <w:tcMar>
-              <w:top w:type="dxa" w:w="60"/>
-              <w:left w:type="dxa" w:w="100"/>
-              <w:bottom w:type="dxa" w:w="60"/>
-              <w:right w:type="dxa" w:w="100"/>
-            </w:tcMar>
-          </w:tcPr>
-          <w:p>
-            <w:pPr>
-              <w:spacing w:after="0" w:line="276"/>
+            <w:tcW w:type="dxa" w:w="1250"/>
+            <w:tcBorders>
+              <w:top w:val="single" w:color="B7C4BF" w:sz="4"/>
+              <w:left w:val="single" w:color="B7C4BF" w:sz="4"/>
+              <w:bottom w:val="single" w:color="B7C4BF" w:sz="4"/>
+              <w:right w:val="single" w:color="B7C4BF" w:sz="4"/>
+            </w:tcBorders>
+            <w:tcMar>
+              <w:top w:type="dxa" w:w="40"/>
+              <w:left w:type="dxa" w:w="100"/>
+              <w:bottom w:type="dxa" w:w="40"/>
+              <w:right w:type="dxa" w:w="100"/>
+            </w:tcMar>
+          </w:tcPr>
+          <w:p>
+            <w:pPr>
+              <w:keepNext w:val="false"/>
+              <w:spacing w:after="0" w:line="264"/>
             </w:pPr>
             <w:r>
               <w:rPr>
@@ -5089,23 +5420,24 @@
         </w:tc>
         <w:tc>
           <w:tcPr>
-            <w:tcW w:type="dxa" w:w="7426"/>
-            <w:tcBorders>
-              <w:top w:val="single" w:color="B7C4BF" w:sz="4"/>
-              <w:left w:val="single" w:color="B7C4BF" w:sz="4"/>
-              <w:bottom w:val="single" w:color="B7C4BF" w:sz="4"/>
-              <w:right w:val="single" w:color="B7C4BF" w:sz="4"/>
-            </w:tcBorders>
-            <w:tcMar>
-              <w:top w:type="dxa" w:w="60"/>
-              <w:left w:type="dxa" w:w="100"/>
-              <w:bottom w:type="dxa" w:w="60"/>
-              <w:right w:type="dxa" w:w="100"/>
-            </w:tcMar>
-          </w:tcPr>
-          <w:p>
-            <w:pPr>
-              <w:spacing w:after="0" w:line="276"/>
+            <w:tcW w:type="dxa" w:w="3263"/>
+            <w:tcBorders>
+              <w:top w:val="single" w:color="B7C4BF" w:sz="4"/>
+              <w:left w:val="single" w:color="B7C4BF" w:sz="4"/>
+              <w:bottom w:val="single" w:color="B7C4BF" w:sz="4"/>
+              <w:right w:val="single" w:color="B7C4BF" w:sz="4"/>
+            </w:tcBorders>
+            <w:tcMar>
+              <w:top w:type="dxa" w:w="40"/>
+              <w:left w:type="dxa" w:w="100"/>
+              <w:bottom w:type="dxa" w:w="40"/>
+              <w:right w:type="dxa" w:w="100"/>
+            </w:tcMar>
+          </w:tcPr>
+          <w:p>
+            <w:pPr>
+              <w:keepNext w:val="false"/>
+              <w:spacing w:after="0" w:line="264"/>
             </w:pPr>
             <w:r>
               <w:rPr>
@@ -5114,6 +5446,68 @@
                 <w:szCs w:val="24"/>
               </w:rPr>
               <w:t xml:space="preserve">Family Medicine Specialist (Pakar Perubatan Keluarga)</w:t>
+            </w:r>
+          </w:p>
+        </w:tc>
+        <w:tc>
+          <w:tcPr>
+            <w:tcW w:type="dxa" w:w="1250"/>
+            <w:tcBorders>
+              <w:top w:val="single" w:color="B7C4BF" w:sz="4"/>
+              <w:left w:val="single" w:color="B7C4BF" w:sz="4"/>
+              <w:bottom w:val="single" w:color="B7C4BF" w:sz="4"/>
+              <w:right w:val="single" w:color="B7C4BF" w:sz="4"/>
+            </w:tcBorders>
+            <w:tcMar>
+              <w:top w:type="dxa" w:w="40"/>
+              <w:left w:type="dxa" w:w="100"/>
+              <w:bottom w:type="dxa" w:w="40"/>
+              <w:right w:type="dxa" w:w="100"/>
+            </w:tcMar>
+          </w:tcPr>
+          <w:p>
+            <w:pPr>
+              <w:keepNext w:val="false"/>
+              <w:spacing w:after="0" w:line="264"/>
+            </w:pPr>
+            <w:r>
+              <w:rPr>
+                <w:rFonts w:ascii="Arial" w:cs="Arial" w:eastAsia="Arial" w:hAnsi="Arial"/>
+                <w:sz w:val="24"/>
+                <w:szCs w:val="24"/>
+              </w:rPr>
+              <w:t xml:space="preserve">PhIS</w:t>
+            </w:r>
+          </w:p>
+        </w:tc>
+        <w:tc>
+          <w:tcPr>
+            <w:tcW w:type="dxa" w:w="3263"/>
+            <w:tcBorders>
+              <w:top w:val="single" w:color="B7C4BF" w:sz="4"/>
+              <w:left w:val="single" w:color="B7C4BF" w:sz="4"/>
+              <w:bottom w:val="single" w:color="B7C4BF" w:sz="4"/>
+              <w:right w:val="single" w:color="B7C4BF" w:sz="4"/>
+            </w:tcBorders>
+            <w:tcMar>
+              <w:top w:type="dxa" w:w="40"/>
+              <w:left w:type="dxa" w:w="100"/>
+              <w:bottom w:type="dxa" w:w="40"/>
+              <w:right w:type="dxa" w:w="100"/>
+            </w:tcMar>
+          </w:tcPr>
+          <w:p>
+            <w:pPr>
+              <w:keepNext w:val="false"/>
+              <w:spacing w:after="0" w:line="264"/>
+            </w:pPr>
+            <w:r>
+              <w:rPr>
+                <w:rFonts w:ascii="Arial" w:cs="Arial" w:eastAsia="Arial" w:hAnsi="Arial"/>
+                <w:sz w:val="24"/>
+                <w:szCs w:val="24"/>
+              </w:rPr>
+              <w:t xml:space="preserve">Pharmacy Information System</w:t>
             </w:r>
           </w:p>
         </w:tc>
@@ -5125,23 +5519,24 @@
         </w:trPr>
         <w:tc>
           <w:tcPr>
-            <w:tcW w:type="dxa" w:w="1600"/>
-            <w:tcBorders>
-              <w:top w:val="single" w:color="B7C4BF" w:sz="4"/>
-              <w:left w:val="single" w:color="B7C4BF" w:sz="4"/>
-              <w:bottom w:val="single" w:color="B7C4BF" w:sz="4"/>
-              <w:right w:val="single" w:color="B7C4BF" w:sz="4"/>
-            </w:tcBorders>
-            <w:tcMar>
-              <w:top w:type="dxa" w:w="60"/>
-              <w:left w:type="dxa" w:w="100"/>
-              <w:bottom w:type="dxa" w:w="60"/>
-              <w:right w:type="dxa" w:w="100"/>
-            </w:tcMar>
-          </w:tcPr>
-          <w:p>
-            <w:pPr>
-              <w:spacing w:after="0" w:line="276"/>
+            <w:tcW w:type="dxa" w:w="1250"/>
+            <w:tcBorders>
+              <w:top w:val="single" w:color="B7C4BF" w:sz="4"/>
+              <w:left w:val="single" w:color="B7C4BF" w:sz="4"/>
+              <w:bottom w:val="single" w:color="B7C4BF" w:sz="4"/>
+              <w:right w:val="single" w:color="B7C4BF" w:sz="4"/>
+            </w:tcBorders>
+            <w:tcMar>
+              <w:top w:type="dxa" w:w="40"/>
+              <w:left w:type="dxa" w:w="100"/>
+              <w:bottom w:type="dxa" w:w="40"/>
+              <w:right w:type="dxa" w:w="100"/>
+            </w:tcMar>
+          </w:tcPr>
+          <w:p>
+            <w:pPr>
+              <w:keepNext w:val="false"/>
+              <w:spacing w:after="0" w:line="264"/>
             </w:pPr>
             <w:r>
               <w:rPr>
@@ -5155,23 +5550,24 @@
         </w:tc>
         <w:tc>
           <w:tcPr>
-            <w:tcW w:type="dxa" w:w="7426"/>
-            <w:tcBorders>
-              <w:top w:val="single" w:color="B7C4BF" w:sz="4"/>
-              <w:left w:val="single" w:color="B7C4BF" w:sz="4"/>
-              <w:bottom w:val="single" w:color="B7C4BF" w:sz="4"/>
-              <w:right w:val="single" w:color="B7C4BF" w:sz="4"/>
-            </w:tcBorders>
-            <w:tcMar>
-              <w:top w:type="dxa" w:w="60"/>
-              <w:left w:type="dxa" w:w="100"/>
-              <w:bottom w:type="dxa" w:w="60"/>
-              <w:right w:type="dxa" w:w="100"/>
-            </w:tcMar>
-          </w:tcPr>
-          <w:p>
-            <w:pPr>
-              <w:spacing w:after="0" w:line="276"/>
+            <w:tcW w:type="dxa" w:w="3263"/>
+            <w:tcBorders>
+              <w:top w:val="single" w:color="B7C4BF" w:sz="4"/>
+              <w:left w:val="single" w:color="B7C4BF" w:sz="4"/>
+              <w:bottom w:val="single" w:color="B7C4BF" w:sz="4"/>
+              <w:right w:val="single" w:color="B7C4BF" w:sz="4"/>
+            </w:tcBorders>
+            <w:tcMar>
+              <w:top w:type="dxa" w:w="40"/>
+              <w:left w:type="dxa" w:w="100"/>
+              <w:bottom w:type="dxa" w:w="40"/>
+              <w:right w:type="dxa" w:w="100"/>
+            </w:tcMar>
+          </w:tcPr>
+          <w:p>
+            <w:pPr>
+              <w:keepNext w:val="false"/>
+              <w:spacing w:after="0" w:line="264"/>
             </w:pPr>
             <w:r>
               <w:rPr>
@@ -5180,6 +5576,68 @@
                 <w:szCs w:val="24"/>
               </w:rPr>
               <w:t xml:space="preserve">Glucose-6-Phosphate Dehydrogenase</w:t>
+            </w:r>
+          </w:p>
+        </w:tc>
+        <w:tc>
+          <w:tcPr>
+            <w:tcW w:type="dxa" w:w="1250"/>
+            <w:tcBorders>
+              <w:top w:val="single" w:color="B7C4BF" w:sz="4"/>
+              <w:left w:val="single" w:color="B7C4BF" w:sz="4"/>
+              <w:bottom w:val="single" w:color="B7C4BF" w:sz="4"/>
+              <w:right w:val="single" w:color="B7C4BF" w:sz="4"/>
+            </w:tcBorders>
+            <w:tcMar>
+              <w:top w:type="dxa" w:w="40"/>
+              <w:left w:type="dxa" w:w="100"/>
+              <w:bottom w:type="dxa" w:w="40"/>
+              <w:right w:type="dxa" w:w="100"/>
+            </w:tcMar>
+          </w:tcPr>
+          <w:p>
+            <w:pPr>
+              <w:keepNext w:val="false"/>
+              <w:spacing w:after="0" w:line="264"/>
+            </w:pPr>
+            <w:r>
+              <w:rPr>
+                <w:rFonts w:ascii="Arial" w:cs="Arial" w:eastAsia="Arial" w:hAnsi="Arial"/>
+                <w:sz w:val="24"/>
+                <w:szCs w:val="24"/>
+              </w:rPr>
+              <w:t xml:space="preserve">PKDJB</w:t>
+            </w:r>
+          </w:p>
+        </w:tc>
+        <w:tc>
+          <w:tcPr>
+            <w:tcW w:type="dxa" w:w="3263"/>
+            <w:tcBorders>
+              <w:top w:val="single" w:color="B7C4BF" w:sz="4"/>
+              <w:left w:val="single" w:color="B7C4BF" w:sz="4"/>
+              <w:bottom w:val="single" w:color="B7C4BF" w:sz="4"/>
+              <w:right w:val="single" w:color="B7C4BF" w:sz="4"/>
+            </w:tcBorders>
+            <w:tcMar>
+              <w:top w:type="dxa" w:w="40"/>
+              <w:left w:type="dxa" w:w="100"/>
+              <w:bottom w:type="dxa" w:w="40"/>
+              <w:right w:type="dxa" w:w="100"/>
+            </w:tcMar>
+          </w:tcPr>
+          <w:p>
+            <w:pPr>
+              <w:keepNext w:val="false"/>
+              <w:spacing w:after="0" w:line="264"/>
+            </w:pPr>
+            <w:r>
+              <w:rPr>
+                <w:rFonts w:ascii="Arial" w:cs="Arial" w:eastAsia="Arial" w:hAnsi="Arial"/>
+                <w:sz w:val="24"/>
+                <w:szCs w:val="24"/>
+              </w:rPr>
+              <w:t xml:space="preserve">Pejabat Kesihatan Daerah Johor Bahru</w:t>
             </w:r>
           </w:p>
         </w:tc>
@@ -5191,23 +5649,24 @@
         </w:trPr>
         <w:tc>
           <w:tcPr>
-            <w:tcW w:type="dxa" w:w="1600"/>
-            <w:tcBorders>
-              <w:top w:val="single" w:color="B7C4BF" w:sz="4"/>
-              <w:left w:val="single" w:color="B7C4BF" w:sz="4"/>
-              <w:bottom w:val="single" w:color="B7C4BF" w:sz="4"/>
-              <w:right w:val="single" w:color="B7C4BF" w:sz="4"/>
-            </w:tcBorders>
-            <w:tcMar>
-              <w:top w:type="dxa" w:w="60"/>
-              <w:left w:type="dxa" w:w="100"/>
-              <w:bottom w:type="dxa" w:w="60"/>
-              <w:right w:type="dxa" w:w="100"/>
-            </w:tcMar>
-          </w:tcPr>
-          <w:p>
-            <w:pPr>
-              <w:spacing w:after="0" w:line="276"/>
+            <w:tcW w:type="dxa" w:w="1250"/>
+            <w:tcBorders>
+              <w:top w:val="single" w:color="B7C4BF" w:sz="4"/>
+              <w:left w:val="single" w:color="B7C4BF" w:sz="4"/>
+              <w:bottom w:val="single" w:color="B7C4BF" w:sz="4"/>
+              <w:right w:val="single" w:color="B7C4BF" w:sz="4"/>
+            </w:tcBorders>
+            <w:tcMar>
+              <w:top w:type="dxa" w:w="40"/>
+              <w:left w:type="dxa" w:w="100"/>
+              <w:bottom w:type="dxa" w:w="40"/>
+              <w:right w:type="dxa" w:w="100"/>
+            </w:tcMar>
+          </w:tcPr>
+          <w:p>
+            <w:pPr>
+              <w:keepNext w:val="false"/>
+              <w:spacing w:after="0" w:line="264"/>
             </w:pPr>
             <w:r>
               <w:rPr>
@@ -5221,23 +5680,24 @@
         </w:tc>
         <w:tc>
           <w:tcPr>
-            <w:tcW w:type="dxa" w:w="7426"/>
-            <w:tcBorders>
-              <w:top w:val="single" w:color="B7C4BF" w:sz="4"/>
-              <w:left w:val="single" w:color="B7C4BF" w:sz="4"/>
-              <w:bottom w:val="single" w:color="B7C4BF" w:sz="4"/>
-              <w:right w:val="single" w:color="B7C4BF" w:sz="4"/>
-            </w:tcBorders>
-            <w:tcMar>
-              <w:top w:type="dxa" w:w="60"/>
-              <w:left w:type="dxa" w:w="100"/>
-              <w:bottom w:type="dxa" w:w="60"/>
-              <w:right w:type="dxa" w:w="100"/>
-            </w:tcMar>
-          </w:tcPr>
-          <w:p>
-            <w:pPr>
-              <w:spacing w:after="0" w:line="276"/>
+            <w:tcW w:type="dxa" w:w="3263"/>
+            <w:tcBorders>
+              <w:top w:val="single" w:color="B7C4BF" w:sz="4"/>
+              <w:left w:val="single" w:color="B7C4BF" w:sz="4"/>
+              <w:bottom w:val="single" w:color="B7C4BF" w:sz="4"/>
+              <w:right w:val="single" w:color="B7C4BF" w:sz="4"/>
+            </w:tcBorders>
+            <w:tcMar>
+              <w:top w:type="dxa" w:w="40"/>
+              <w:left w:type="dxa" w:w="100"/>
+              <w:bottom w:type="dxa" w:w="40"/>
+              <w:right w:type="dxa" w:w="100"/>
+            </w:tcMar>
+          </w:tcPr>
+          <w:p>
+            <w:pPr>
+              <w:keepNext w:val="false"/>
+              <w:spacing w:after="0" w:line="264"/>
             </w:pPr>
             <w:r>
               <w:rPr>
@@ -5246,6 +5706,68 @@
                 <w:szCs w:val="24"/>
               </w:rPr>
               <w:t xml:space="preserve">Kementerian Kesihatan Malaysia</w:t>
+            </w:r>
+          </w:p>
+        </w:tc>
+        <w:tc>
+          <w:tcPr>
+            <w:tcW w:type="dxa" w:w="1250"/>
+            <w:tcBorders>
+              <w:top w:val="single" w:color="B7C4BF" w:sz="4"/>
+              <w:left w:val="single" w:color="B7C4BF" w:sz="4"/>
+              <w:bottom w:val="single" w:color="B7C4BF" w:sz="4"/>
+              <w:right w:val="single" w:color="B7C4BF" w:sz="4"/>
+            </w:tcBorders>
+            <w:tcMar>
+              <w:top w:type="dxa" w:w="40"/>
+              <w:left w:type="dxa" w:w="100"/>
+              <w:bottom w:type="dxa" w:w="40"/>
+              <w:right w:type="dxa" w:w="100"/>
+            </w:tcMar>
+          </w:tcPr>
+          <w:p>
+            <w:pPr>
+              <w:keepNext w:val="false"/>
+              <w:spacing w:after="0" w:line="264"/>
+            </w:pPr>
+            <w:r>
+              <w:rPr>
+                <w:rFonts w:ascii="Arial" w:cs="Arial" w:eastAsia="Arial" w:hAnsi="Arial"/>
+                <w:sz w:val="24"/>
+                <w:szCs w:val="24"/>
+              </w:rPr>
+              <w:t xml:space="preserve">RN</w:t>
+            </w:r>
+          </w:p>
+        </w:tc>
+        <w:tc>
+          <w:tcPr>
+            <w:tcW w:type="dxa" w:w="3263"/>
+            <w:tcBorders>
+              <w:top w:val="single" w:color="B7C4BF" w:sz="4"/>
+              <w:left w:val="single" w:color="B7C4BF" w:sz="4"/>
+              <w:bottom w:val="single" w:color="B7C4BF" w:sz="4"/>
+              <w:right w:val="single" w:color="B7C4BF" w:sz="4"/>
+            </w:tcBorders>
+            <w:tcMar>
+              <w:top w:type="dxa" w:w="40"/>
+              <w:left w:type="dxa" w:w="100"/>
+              <w:bottom w:type="dxa" w:w="40"/>
+              <w:right w:type="dxa" w:w="100"/>
+            </w:tcMar>
+          </w:tcPr>
+          <w:p>
+            <w:pPr>
+              <w:keepNext w:val="false"/>
+              <w:spacing w:after="0" w:line="264"/>
+            </w:pPr>
+            <w:r>
+              <w:rPr>
+                <w:rFonts w:ascii="Arial" w:cs="Arial" w:eastAsia="Arial" w:hAnsi="Arial"/>
+                <w:sz w:val="24"/>
+                <w:szCs w:val="24"/>
+              </w:rPr>
+              <w:t xml:space="preserve">Registration Number (Nombor Pendaftaran Pesakit)</w:t>
             </w:r>
           </w:p>
         </w:tc>
@@ -5257,23 +5779,24 @@
         </w:trPr>
         <w:tc>
           <w:tcPr>
-            <w:tcW w:type="dxa" w:w="1600"/>
-            <w:tcBorders>
-              <w:top w:val="single" w:color="B7C4BF" w:sz="4"/>
-              <w:left w:val="single" w:color="B7C4BF" w:sz="4"/>
-              <w:bottom w:val="single" w:color="B7C4BF" w:sz="4"/>
-              <w:right w:val="single" w:color="B7C4BF" w:sz="4"/>
-            </w:tcBorders>
-            <w:tcMar>
-              <w:top w:type="dxa" w:w="60"/>
-              <w:left w:type="dxa" w:w="100"/>
-              <w:bottom w:type="dxa" w:w="60"/>
-              <w:right w:type="dxa" w:w="100"/>
-            </w:tcMar>
-          </w:tcPr>
-          <w:p>
-            <w:pPr>
-              <w:spacing w:after="0" w:line="276"/>
+            <w:tcW w:type="dxa" w:w="1250"/>
+            <w:tcBorders>
+              <w:top w:val="single" w:color="B7C4BF" w:sz="4"/>
+              <w:left w:val="single" w:color="B7C4BF" w:sz="4"/>
+              <w:bottom w:val="single" w:color="B7C4BF" w:sz="4"/>
+              <w:right w:val="single" w:color="B7C4BF" w:sz="4"/>
+            </w:tcBorders>
+            <w:tcMar>
+              <w:top w:type="dxa" w:w="40"/>
+              <w:left w:type="dxa" w:w="100"/>
+              <w:bottom w:type="dxa" w:w="40"/>
+              <w:right w:type="dxa" w:w="100"/>
+            </w:tcMar>
+          </w:tcPr>
+          <w:p>
+            <w:pPr>
+              <w:keepNext w:val="false"/>
+              <w:spacing w:after="0" w:line="264"/>
             </w:pPr>
             <w:r>
               <w:rPr>
@@ -5287,23 +5810,24 @@
         </w:tc>
         <w:tc>
           <w:tcPr>
-            <w:tcW w:type="dxa" w:w="7426"/>
-            <w:tcBorders>
-              <w:top w:val="single" w:color="B7C4BF" w:sz="4"/>
-              <w:left w:val="single" w:color="B7C4BF" w:sz="4"/>
-              <w:bottom w:val="single" w:color="B7C4BF" w:sz="4"/>
-              <w:right w:val="single" w:color="B7C4BF" w:sz="4"/>
-            </w:tcBorders>
-            <w:tcMar>
-              <w:top w:type="dxa" w:w="60"/>
-              <w:left w:type="dxa" w:w="100"/>
-              <w:bottom w:type="dxa" w:w="60"/>
-              <w:right w:type="dxa" w:w="100"/>
-            </w:tcMar>
-          </w:tcPr>
-          <w:p>
-            <w:pPr>
-              <w:spacing w:after="0" w:line="276"/>
+            <w:tcW w:type="dxa" w:w="3263"/>
+            <w:tcBorders>
+              <w:top w:val="single" w:color="B7C4BF" w:sz="4"/>
+              <w:left w:val="single" w:color="B7C4BF" w:sz="4"/>
+              <w:bottom w:val="single" w:color="B7C4BF" w:sz="4"/>
+              <w:right w:val="single" w:color="B7C4BF" w:sz="4"/>
+            </w:tcBorders>
+            <w:tcMar>
+              <w:top w:type="dxa" w:w="40"/>
+              <w:left w:type="dxa" w:w="100"/>
+              <w:bottom w:type="dxa" w:w="40"/>
+              <w:right w:type="dxa" w:w="100"/>
+            </w:tcMar>
+          </w:tcPr>
+          <w:p>
+            <w:pPr>
+              <w:keepNext w:val="false"/>
+              <w:spacing w:after="0" w:line="264"/>
             </w:pPr>
             <w:r>
               <w:rPr>
@@ -5315,361 +5839,26 @@
             </w:r>
           </w:p>
         </w:tc>
-      </w:tr>
-      <w:tr>
-        <w:trPr>
-          <w:cantSplit/>
-          <w:tblHeader w:val="off"/>
-        </w:trPr>
-        <w:tc>
-          <w:tcPr>
-            <w:tcW w:type="dxa" w:w="1600"/>
-            <w:tcBorders>
-              <w:top w:val="single" w:color="B7C4BF" w:sz="4"/>
-              <w:left w:val="single" w:color="B7C4BF" w:sz="4"/>
-              <w:bottom w:val="single" w:color="B7C4BF" w:sz="4"/>
-              <w:right w:val="single" w:color="B7C4BF" w:sz="4"/>
-            </w:tcBorders>
-            <w:tcMar>
-              <w:top w:type="dxa" w:w="60"/>
-              <w:left w:type="dxa" w:w="100"/>
-              <w:bottom w:type="dxa" w:w="60"/>
-              <w:right w:type="dxa" w:w="100"/>
-            </w:tcMar>
-          </w:tcPr>
-          <w:p>
-            <w:pPr>
-              <w:spacing w:after="0" w:line="276"/>
-            </w:pPr>
-            <w:r>
-              <w:rPr>
-                <w:rFonts w:ascii="Arial" w:cs="Arial" w:eastAsia="Arial" w:hAnsi="Arial"/>
-                <w:sz w:val="24"/>
-                <w:szCs w:val="24"/>
-              </w:rPr>
-              <w:t xml:space="preserve">NAG</w:t>
-            </w:r>
-          </w:p>
-        </w:tc>
-        <w:tc>
-          <w:tcPr>
-            <w:tcW w:type="dxa" w:w="7426"/>
-            <w:tcBorders>
-              <w:top w:val="single" w:color="B7C4BF" w:sz="4"/>
-              <w:left w:val="single" w:color="B7C4BF" w:sz="4"/>
-              <w:bottom w:val="single" w:color="B7C4BF" w:sz="4"/>
-              <w:right w:val="single" w:color="B7C4BF" w:sz="4"/>
-            </w:tcBorders>
-            <w:tcMar>
-              <w:top w:type="dxa" w:w="60"/>
-              <w:left w:type="dxa" w:w="100"/>
-              <w:bottom w:type="dxa" w:w="60"/>
-              <w:right w:type="dxa" w:w="100"/>
-            </w:tcMar>
-          </w:tcPr>
-          <w:p>
-            <w:pPr>
-              <w:spacing w:after="0" w:line="276"/>
-            </w:pPr>
-            <w:r>
-              <w:rPr>
-                <w:rFonts w:ascii="Arial" w:cs="Arial" w:eastAsia="Arial" w:hAnsi="Arial"/>
-                <w:sz w:val="24"/>
-                <w:szCs w:val="24"/>
-              </w:rPr>
-              <w:t xml:space="preserve">National Antimicrobial Guideline</w:t>
-            </w:r>
-          </w:p>
-        </w:tc>
-      </w:tr>
-      <w:tr>
-        <w:trPr>
-          <w:cantSplit/>
-          <w:tblHeader w:val="off"/>
-        </w:trPr>
-        <w:tc>
-          <w:tcPr>
-            <w:tcW w:type="dxa" w:w="1600"/>
-            <w:tcBorders>
-              <w:top w:val="single" w:color="B7C4BF" w:sz="4"/>
-              <w:left w:val="single" w:color="B7C4BF" w:sz="4"/>
-              <w:bottom w:val="single" w:color="B7C4BF" w:sz="4"/>
-              <w:right w:val="single" w:color="B7C4BF" w:sz="4"/>
-            </w:tcBorders>
-            <w:tcMar>
-              <w:top w:type="dxa" w:w="60"/>
-              <w:left w:type="dxa" w:w="100"/>
-              <w:bottom w:type="dxa" w:w="60"/>
-              <w:right w:type="dxa" w:w="100"/>
-            </w:tcMar>
-          </w:tcPr>
-          <w:p>
-            <w:pPr>
-              <w:spacing w:after="0" w:line="276"/>
-            </w:pPr>
-            <w:r>
-              <w:rPr>
-                <w:rFonts w:ascii="Arial" w:cs="Arial" w:eastAsia="Arial" w:hAnsi="Arial"/>
-                <w:sz w:val="24"/>
-                <w:szCs w:val="24"/>
-              </w:rPr>
-              <w:t xml:space="preserve">PDPA</w:t>
-            </w:r>
-          </w:p>
-        </w:tc>
-        <w:tc>
-          <w:tcPr>
-            <w:tcW w:type="dxa" w:w="7426"/>
-            <w:tcBorders>
-              <w:top w:val="single" w:color="B7C4BF" w:sz="4"/>
-              <w:left w:val="single" w:color="B7C4BF" w:sz="4"/>
-              <w:bottom w:val="single" w:color="B7C4BF" w:sz="4"/>
-              <w:right w:val="single" w:color="B7C4BF" w:sz="4"/>
-            </w:tcBorders>
-            <w:tcMar>
-              <w:top w:type="dxa" w:w="60"/>
-              <w:left w:type="dxa" w:w="100"/>
-              <w:bottom w:type="dxa" w:w="60"/>
-              <w:right w:type="dxa" w:w="100"/>
-            </w:tcMar>
-          </w:tcPr>
-          <w:p>
-            <w:pPr>
-              <w:spacing w:after="0" w:line="276"/>
-            </w:pPr>
-            <w:r>
-              <w:rPr>
-                <w:rFonts w:ascii="Arial" w:cs="Arial" w:eastAsia="Arial" w:hAnsi="Arial"/>
-                <w:sz w:val="24"/>
-                <w:szCs w:val="24"/>
-              </w:rPr>
-              <w:t xml:space="preserve">Personal Data Protection Act (Akta Perlindungan Data Peribadi)</w:t>
-            </w:r>
-          </w:p>
-        </w:tc>
-      </w:tr>
-      <w:tr>
-        <w:trPr>
-          <w:cantSplit/>
-          <w:tblHeader w:val="off"/>
-        </w:trPr>
-        <w:tc>
-          <w:tcPr>
-            <w:tcW w:type="dxa" w:w="1600"/>
-            <w:tcBorders>
-              <w:top w:val="single" w:color="B7C4BF" w:sz="4"/>
-              <w:left w:val="single" w:color="B7C4BF" w:sz="4"/>
-              <w:bottom w:val="single" w:color="B7C4BF" w:sz="4"/>
-              <w:right w:val="single" w:color="B7C4BF" w:sz="4"/>
-            </w:tcBorders>
-            <w:tcMar>
-              <w:top w:type="dxa" w:w="60"/>
-              <w:left w:type="dxa" w:w="100"/>
-              <w:bottom w:type="dxa" w:w="60"/>
-              <w:right w:type="dxa" w:w="100"/>
-            </w:tcMar>
-          </w:tcPr>
-          <w:p>
-            <w:pPr>
-              <w:spacing w:after="0" w:line="276"/>
-            </w:pPr>
-            <w:r>
-              <w:rPr>
-                <w:rFonts w:ascii="Arial" w:cs="Arial" w:eastAsia="Arial" w:hAnsi="Arial"/>
-                <w:sz w:val="24"/>
-                <w:szCs w:val="24"/>
-              </w:rPr>
-              <w:t xml:space="preserve">PhIS</w:t>
-            </w:r>
-          </w:p>
-        </w:tc>
-        <w:tc>
-          <w:tcPr>
-            <w:tcW w:type="dxa" w:w="7426"/>
-            <w:tcBorders>
-              <w:top w:val="single" w:color="B7C4BF" w:sz="4"/>
-              <w:left w:val="single" w:color="B7C4BF" w:sz="4"/>
-              <w:bottom w:val="single" w:color="B7C4BF" w:sz="4"/>
-              <w:right w:val="single" w:color="B7C4BF" w:sz="4"/>
-            </w:tcBorders>
-            <w:tcMar>
-              <w:top w:type="dxa" w:w="60"/>
-              <w:left w:type="dxa" w:w="100"/>
-              <w:bottom w:type="dxa" w:w="60"/>
-              <w:right w:type="dxa" w:w="100"/>
-            </w:tcMar>
-          </w:tcPr>
-          <w:p>
-            <w:pPr>
-              <w:spacing w:after="0" w:line="276"/>
-            </w:pPr>
-            <w:r>
-              <w:rPr>
-                <w:rFonts w:ascii="Arial" w:cs="Arial" w:eastAsia="Arial" w:hAnsi="Arial"/>
-                <w:sz w:val="24"/>
-                <w:szCs w:val="24"/>
-              </w:rPr>
-              <w:t xml:space="preserve">Pharmacy Information System</w:t>
-            </w:r>
-          </w:p>
-        </w:tc>
-      </w:tr>
-      <w:tr>
-        <w:trPr>
-          <w:cantSplit/>
-          <w:tblHeader w:val="off"/>
-        </w:trPr>
-        <w:tc>
-          <w:tcPr>
-            <w:tcW w:type="dxa" w:w="1600"/>
-            <w:tcBorders>
-              <w:top w:val="single" w:color="B7C4BF" w:sz="4"/>
-              <w:left w:val="single" w:color="B7C4BF" w:sz="4"/>
-              <w:bottom w:val="single" w:color="B7C4BF" w:sz="4"/>
-              <w:right w:val="single" w:color="B7C4BF" w:sz="4"/>
-            </w:tcBorders>
-            <w:tcMar>
-              <w:top w:type="dxa" w:w="60"/>
-              <w:left w:type="dxa" w:w="100"/>
-              <w:bottom w:type="dxa" w:w="60"/>
-              <w:right w:type="dxa" w:w="100"/>
-            </w:tcMar>
-          </w:tcPr>
-          <w:p>
-            <w:pPr>
-              <w:spacing w:after="0" w:line="276"/>
-            </w:pPr>
-            <w:r>
-              <w:rPr>
-                <w:rFonts w:ascii="Arial" w:cs="Arial" w:eastAsia="Arial" w:hAnsi="Arial"/>
-                <w:sz w:val="24"/>
-                <w:szCs w:val="24"/>
-              </w:rPr>
-              <w:t xml:space="preserve">PKDJB</w:t>
-            </w:r>
-          </w:p>
-        </w:tc>
-        <w:tc>
-          <w:tcPr>
-            <w:tcW w:type="dxa" w:w="7426"/>
-            <w:tcBorders>
-              <w:top w:val="single" w:color="B7C4BF" w:sz="4"/>
-              <w:left w:val="single" w:color="B7C4BF" w:sz="4"/>
-              <w:bottom w:val="single" w:color="B7C4BF" w:sz="4"/>
-              <w:right w:val="single" w:color="B7C4BF" w:sz="4"/>
-            </w:tcBorders>
-            <w:tcMar>
-              <w:top w:type="dxa" w:w="60"/>
-              <w:left w:type="dxa" w:w="100"/>
-              <w:bottom w:type="dxa" w:w="60"/>
-              <w:right w:type="dxa" w:w="100"/>
-            </w:tcMar>
-          </w:tcPr>
-          <w:p>
-            <w:pPr>
-              <w:spacing w:after="0" w:line="276"/>
-            </w:pPr>
-            <w:r>
-              <w:rPr>
-                <w:rFonts w:ascii="Arial" w:cs="Arial" w:eastAsia="Arial" w:hAnsi="Arial"/>
-                <w:sz w:val="24"/>
-                <w:szCs w:val="24"/>
-              </w:rPr>
-              <w:t xml:space="preserve">Pejabat Kesihatan Daerah Johor Bahru</w:t>
-            </w:r>
-          </w:p>
-        </w:tc>
-      </w:tr>
-      <w:tr>
-        <w:trPr>
-          <w:cantSplit/>
-          <w:tblHeader w:val="off"/>
-        </w:trPr>
-        <w:tc>
-          <w:tcPr>
-            <w:tcW w:type="dxa" w:w="1600"/>
-            <w:tcBorders>
-              <w:top w:val="single" w:color="B7C4BF" w:sz="4"/>
-              <w:left w:val="single" w:color="B7C4BF" w:sz="4"/>
-              <w:bottom w:val="single" w:color="B7C4BF" w:sz="4"/>
-              <w:right w:val="single" w:color="B7C4BF" w:sz="4"/>
-            </w:tcBorders>
-            <w:tcMar>
-              <w:top w:type="dxa" w:w="60"/>
-              <w:left w:type="dxa" w:w="100"/>
-              <w:bottom w:type="dxa" w:w="60"/>
-              <w:right w:type="dxa" w:w="100"/>
-            </w:tcMar>
-          </w:tcPr>
-          <w:p>
-            <w:pPr>
-              <w:spacing w:after="0" w:line="276"/>
-            </w:pPr>
-            <w:r>
-              <w:rPr>
-                <w:rFonts w:ascii="Arial" w:cs="Arial" w:eastAsia="Arial" w:hAnsi="Arial"/>
-                <w:sz w:val="24"/>
-                <w:szCs w:val="24"/>
-              </w:rPr>
-              <w:t xml:space="preserve">RN</w:t>
-            </w:r>
-          </w:p>
-        </w:tc>
-        <w:tc>
-          <w:tcPr>
-            <w:tcW w:type="dxa" w:w="7426"/>
-            <w:tcBorders>
-              <w:top w:val="single" w:color="B7C4BF" w:sz="4"/>
-              <w:left w:val="single" w:color="B7C4BF" w:sz="4"/>
-              <w:bottom w:val="single" w:color="B7C4BF" w:sz="4"/>
-              <w:right w:val="single" w:color="B7C4BF" w:sz="4"/>
-            </w:tcBorders>
-            <w:tcMar>
-              <w:top w:type="dxa" w:w="60"/>
-              <w:left w:type="dxa" w:w="100"/>
-              <w:bottom w:type="dxa" w:w="60"/>
-              <w:right w:type="dxa" w:w="100"/>
-            </w:tcMar>
-          </w:tcPr>
-          <w:p>
-            <w:pPr>
-              <w:spacing w:after="0" w:line="276"/>
-            </w:pPr>
-            <w:r>
-              <w:rPr>
-                <w:rFonts w:ascii="Arial" w:cs="Arial" w:eastAsia="Arial" w:hAnsi="Arial"/>
-                <w:sz w:val="24"/>
-                <w:szCs w:val="24"/>
-              </w:rPr>
-              <w:t xml:space="preserve">Registration Number (Nombor Pendaftaran Pesakit)</w:t>
-            </w:r>
-          </w:p>
-        </w:tc>
-      </w:tr>
-      <w:tr>
-        <w:trPr>
-          <w:cantSplit/>
-          <w:tblHeader w:val="off"/>
-        </w:trPr>
-        <w:tc>
-          <w:tcPr>
-            <w:tcW w:type="dxa" w:w="1600"/>
-            <w:tcBorders>
-              <w:top w:val="single" w:color="B7C4BF" w:sz="4"/>
-              <w:left w:val="single" w:color="B7C4BF" w:sz="4"/>
-              <w:bottom w:val="single" w:color="B7C4BF" w:sz="4"/>
-              <w:right w:val="single" w:color="B7C4BF" w:sz="4"/>
-            </w:tcBorders>
-            <w:tcMar>
-              <w:top w:type="dxa" w:w="60"/>
-              <w:left w:type="dxa" w:w="100"/>
-              <w:bottom w:type="dxa" w:w="60"/>
-              <w:right w:type="dxa" w:w="100"/>
-            </w:tcMar>
-          </w:tcPr>
-          <w:p>
-            <w:pPr>
-              <w:spacing w:after="0" w:line="276"/>
+        <w:tc>
+          <w:tcPr>
+            <w:tcW w:type="dxa" w:w="1250"/>
+            <w:tcBorders>
+              <w:top w:val="single" w:color="B7C4BF" w:sz="4"/>
+              <w:left w:val="single" w:color="B7C4BF" w:sz="4"/>
+              <w:bottom w:val="single" w:color="B7C4BF" w:sz="4"/>
+              <w:right w:val="single" w:color="B7C4BF" w:sz="4"/>
+            </w:tcBorders>
+            <w:tcMar>
+              <w:top w:type="dxa" w:w="40"/>
+              <w:left w:type="dxa" w:w="100"/>
+              <w:bottom w:type="dxa" w:w="40"/>
+              <w:right w:type="dxa" w:w="100"/>
+            </w:tcMar>
+          </w:tcPr>
+          <w:p>
+            <w:pPr>
+              <w:keepNext w:val="false"/>
+              <w:spacing w:after="0" w:line="264"/>
             </w:pPr>
             <w:r>
               <w:rPr>
@@ -5683,23 +5872,24 @@
         </w:tc>
         <w:tc>
           <w:tcPr>
-            <w:tcW w:type="dxa" w:w="7426"/>
-            <w:tcBorders>
-              <w:top w:val="single" w:color="B7C4BF" w:sz="4"/>
-              <w:left w:val="single" w:color="B7C4BF" w:sz="4"/>
-              <w:bottom w:val="single" w:color="B7C4BF" w:sz="4"/>
-              <w:right w:val="single" w:color="B7C4BF" w:sz="4"/>
-            </w:tcBorders>
-            <w:tcMar>
-              <w:top w:type="dxa" w:w="60"/>
-              <w:left w:type="dxa" w:w="100"/>
-              <w:bottom w:type="dxa" w:w="60"/>
-              <w:right w:type="dxa" w:w="100"/>
-            </w:tcMar>
-          </w:tcPr>
-          <w:p>
-            <w:pPr>
-              <w:spacing w:after="0" w:line="276"/>
+            <w:tcW w:type="dxa" w:w="3263"/>
+            <w:tcBorders>
+              <w:top w:val="single" w:color="B7C4BF" w:sz="4"/>
+              <w:left w:val="single" w:color="B7C4BF" w:sz="4"/>
+              <w:bottom w:val="single" w:color="B7C4BF" w:sz="4"/>
+              <w:right w:val="single" w:color="B7C4BF" w:sz="4"/>
+            </w:tcBorders>
+            <w:tcMar>
+              <w:top w:type="dxa" w:w="40"/>
+              <w:left w:type="dxa" w:w="100"/>
+              <w:bottom w:type="dxa" w:w="40"/>
+              <w:right w:type="dxa" w:w="100"/>
+            </w:tcMar>
+          </w:tcPr>
+          <w:p>
+            <w:pPr>
+              <w:keepNext w:val="false"/>
+              <w:spacing w:after="0" w:line="264"/>
             </w:pPr>
             <w:r>
               <w:rPr>
@@ -5743,7 +5933,7 @@
     </w:p>
     <w:p>
       <w:pPr>
-        <w:spacing w:after="160" w:line="360"/>
+        <w:spacing w:after="100" w:line="360"/>
         <w:ind w:left="360"/>
       </w:pPr>
       <w:r>
@@ -5755,7 +5945,7 @@
           <w:sz w:val="24"/>
           <w:szCs w:val="24"/>
         </w:rPr>
-        <w:t xml:space="preserve">[ISI] Sertakan tangkap layar papan pemuka Pegawai Perubatan (borang permohonan dan baki kuota), papan pemuka FMS, papan pemuka Unit Farmasi, borang antibiotik dengan semakan NAG 2024, penyemak G6PD, kalkulator dos pediatrik dan paparan log audit.</w:t>
+        <w:t xml:space="preserve">[ISI] Sertakan tangkap layar papan pemuka Pegawai Perubatan (borang permohonan dan baki kuota), papan pemuka FMS, papan pemuka Unit Farmasi, borang antibiotik dengan semakan NAG 2024 dan cadangan dos antibiotik, penyemak G6PD, kalkulator dos pediatrik dan paparan log audit.</w:t>
       </w:r>
     </w:p>
     <w:p>
@@ -5768,7 +5958,7 @@
     </w:p>
     <w:p>
       <w:pPr>
-        <w:spacing w:after="160" w:line="360"/>
+        <w:spacing w:after="100" w:line="360"/>
         <w:ind w:left="360"/>
       </w:pPr>
       <w:r>
@@ -5793,7 +5983,7 @@
     </w:p>
     <w:p>
       <w:pPr>
-        <w:spacing w:after="160" w:line="360"/>
+        <w:spacing w:after="100" w:line="360"/>
         <w:ind w:left="360"/>
       </w:pPr>
       <w:r>
@@ -5818,7 +6008,7 @@
     </w:p>
     <w:p>
       <w:pPr>
-        <w:spacing w:after="160" w:line="360"/>
+        <w:spacing w:after="100" w:line="360"/>
         <w:ind w:left="360"/>
       </w:pPr>
       <w:r>
@@ -6324,7 +6514,7 @@
     <w:pPr>
       <w:keepNext/>
       <w:keepLines/>
-      <w:spacing w:after="120" w:before="240" w:line="300"/>
+      <w:spacing w:after="80" w:before="200" w:line="300"/>
       <w:outlineLvl w:val="0"/>
     </w:pPr>
     <w:rPr>
@@ -6344,7 +6534,7 @@
     <w:pPr>
       <w:keepNext/>
       <w:keepLines/>
-      <w:spacing w:after="100" w:before="200" w:line="300"/>
+      <w:spacing w:after="60" w:before="160" w:line="300"/>
       <w:outlineLvl w:val="1"/>
     </w:pPr>
     <w:rPr>
@@ -6364,7 +6554,7 @@
     <w:pPr>
       <w:keepNext/>
       <w:keepLines/>
-      <w:spacing w:after="80" w:before="160" w:line="300"/>
+      <w:spacing w:after="40" w:before="120" w:line="300"/>
       <w:outlineLvl w:val="2"/>
     </w:pPr>
     <w:rPr>

</xml_diff>